<commit_message>
Update file link and enhance documentation for Docker setup and SQL Server connection
</commit_message>
<xml_diff>
--- a/docs/Инструкция.docx
+++ b/docs/Инструкция.docx
@@ -6405,6 +6405,46 @@
           <w:sz w:val="28"/>
           <w:szCs w:val="28"/>
         </w:rPr>
+        <w:t>Удалить все образы из системы:</w:t>
+      </w:r>
+    </w:p>
+    <w:p>
+      <w:pPr>
+        <w:jc w:val="both"/>
+        <w:rPr>
+          <w:rFonts w:ascii="Times New Roman" w:hAnsi="Times New Roman" w:cs="Times New Roman"/>
+          <w:sz w:val="28"/>
+          <w:szCs w:val="28"/>
+        </w:rPr>
+      </w:pPr>
+      <w:r>
+        <w:rPr>
+          <w:rFonts w:ascii="Times New Roman" w:hAnsi="Times New Roman" w:cs="Times New Roman"/>
+          <w:sz w:val="28"/>
+          <w:szCs w:val="28"/>
+        </w:rPr>
+        <w:t>sudo docker rmi -f $(sudo docker images -aq)</w:t>
+      </w:r>
+    </w:p>
+    <w:p>
+      <w:pPr>
+        <w:jc w:val="both"/>
+        <w:rPr>
+          <w:rFonts w:ascii="Times New Roman" w:hAnsi="Times New Roman" w:cs="Times New Roman"/>
+          <w:b/>
+          <w:bCs/>
+          <w:sz w:val="28"/>
+          <w:szCs w:val="28"/>
+        </w:rPr>
+      </w:pPr>
+      <w:r>
+        <w:rPr>
+          <w:rFonts w:ascii="Times New Roman" w:hAnsi="Times New Roman" w:cs="Times New Roman"/>
+          <w:b/>
+          <w:bCs/>
+          <w:sz w:val="28"/>
+          <w:szCs w:val="28"/>
+        </w:rPr>
         <w:t>3. Удаление файлов и папок в Linux</w:t>
       </w:r>
     </w:p>
@@ -8281,23 +8321,7 @@
           <w:sz w:val="28"/>
           <w:szCs w:val="28"/>
         </w:rPr>
-        <w:t>Сравни</w:t>
-      </w:r>
-      <w:r>
-        <w:rPr>
-          <w:rFonts w:ascii="Times New Roman" w:hAnsi="Times New Roman" w:cs="Times New Roman"/>
-          <w:sz w:val="28"/>
-          <w:szCs w:val="28"/>
-        </w:rPr>
-        <w:t>ть</w:t>
-      </w:r>
-      <w:r>
-        <w:rPr>
-          <w:rFonts w:ascii="Times New Roman" w:hAnsi="Times New Roman" w:cs="Times New Roman"/>
-          <w:sz w:val="28"/>
-          <w:szCs w:val="28"/>
-        </w:rPr>
-        <w:t> UtilizerID из второго запроса с Идентификатор и IMObjID из первого.</w:t>
+        <w:t>Сравнить UtilizerID из второго запроса с Идентификатор и IMObjID из первого.</w:t>
       </w:r>
     </w:p>
     <w:p>
@@ -10690,6 +10714,891 @@
           <w:szCs w:val="28"/>
         </w:rPr>
       </w:pPr>
+    </w:p>
+    <w:p>
+      <w:pPr>
+        <w:rPr>
+          <w:rFonts w:ascii="Times New Roman" w:hAnsi="Times New Roman" w:cs="Times New Roman"/>
+          <w:sz w:val="28"/>
+          <w:szCs w:val="28"/>
+        </w:rPr>
+      </w:pPr>
+      <w:r>
+        <w:rPr>
+          <w:rFonts w:ascii="Times New Roman" w:hAnsi="Times New Roman" w:cs="Times New Roman"/>
+          <w:sz w:val="28"/>
+          <w:szCs w:val="28"/>
+        </w:rPr>
+        <w:br w:type="page"/>
+      </w:r>
+    </w:p>
+    <w:p>
+      <w:pPr>
+        <w:jc w:val="center"/>
+        <w:rPr>
+          <w:rFonts w:ascii="Times New Roman" w:hAnsi="Times New Roman" w:cs="Times New Roman"/>
+          <w:b/>
+          <w:bCs/>
+          <w:sz w:val="28"/>
+          <w:szCs w:val="28"/>
+        </w:rPr>
+      </w:pPr>
+      <w:r>
+        <w:rPr>
+          <w:rFonts w:ascii="Times New Roman" w:hAnsi="Times New Roman" w:cs="Times New Roman"/>
+          <w:b/>
+          <w:bCs/>
+          <w:sz w:val="28"/>
+          <w:szCs w:val="28"/>
+        </w:rPr>
+        <w:lastRenderedPageBreak/>
+        <w:t>Решение проблемы с подключением</w:t>
+      </w:r>
+    </w:p>
+    <w:p>
+      <w:pPr>
+        <w:jc w:val="both"/>
+        <w:rPr>
+          <w:rFonts w:ascii="Times New Roman" w:hAnsi="Times New Roman" w:cs="Times New Roman"/>
+          <w:sz w:val="28"/>
+          <w:szCs w:val="28"/>
+        </w:rPr>
+      </w:pPr>
+      <w:r>
+        <w:rPr>
+          <w:rFonts w:ascii="Times New Roman" w:hAnsi="Times New Roman" w:cs="Times New Roman"/>
+          <w:sz w:val="28"/>
+          <w:szCs w:val="28"/>
+        </w:rPr>
+        <w:t xml:space="preserve">По умолчанию MS SQL слушает стандартный TCP-порт 1433. Но когда администраторы создают именованный экземпляр, MS SQL выделяет ему динамический порт. И клиент должен </w:t>
+      </w:r>
+      <w:r>
+        <w:rPr>
+          <w:rFonts w:ascii="Times New Roman" w:hAnsi="Times New Roman" w:cs="Times New Roman"/>
+          <w:sz w:val="28"/>
+          <w:szCs w:val="28"/>
+        </w:rPr>
+        <w:t>по UDP</w:t>
+      </w:r>
+      <w:r>
+        <w:rPr>
+          <w:rFonts w:ascii="Times New Roman" w:hAnsi="Times New Roman" w:cs="Times New Roman"/>
+          <w:sz w:val="28"/>
+          <w:szCs w:val="28"/>
+        </w:rPr>
+        <w:t>-порту 1434 определить порт его. А драйверы Microsoft ODBC для Linux криво работают с UDP 1434. Поэтому Linux-контейнер просто не получает ответа и падает по таймауту.</w:t>
+      </w:r>
+    </w:p>
+    <w:p>
+      <w:pPr>
+        <w:jc w:val="both"/>
+        <w:rPr>
+          <w:rFonts w:ascii="Times New Roman" w:hAnsi="Times New Roman" w:cs="Times New Roman"/>
+          <w:sz w:val="28"/>
+          <w:szCs w:val="28"/>
+        </w:rPr>
+      </w:pPr>
+      <w:r>
+        <w:rPr>
+          <w:rFonts w:ascii="Times New Roman" w:hAnsi="Times New Roman" w:cs="Times New Roman"/>
+          <w:sz w:val="28"/>
+          <w:szCs w:val="28"/>
+        </w:rPr>
+        <w:t>А чтобы это решить, нужен точный TCP-порт для именованного экземпляра и тогда скорее всего все нормально подключится. А без порта вероятно и мой бэк на Java тоже не сможет.</w:t>
+      </w:r>
+    </w:p>
+    <w:p>
+      <w:pPr>
+        <w:jc w:val="both"/>
+        <w:rPr>
+          <w:rFonts w:ascii="Times New Roman" w:hAnsi="Times New Roman" w:cs="Times New Roman"/>
+          <w:sz w:val="28"/>
+          <w:szCs w:val="28"/>
+        </w:rPr>
+      </w:pPr>
+      <w:hyperlink r:id="rId14" w:history="1">
+        <w:r>
+          <w:rPr>
+            <w:rStyle w:val="ac"/>
+            <w:rFonts w:ascii="Times New Roman" w:hAnsi="Times New Roman" w:cs="Times New Roman"/>
+            <w:sz w:val="28"/>
+            <w:szCs w:val="28"/>
+          </w:rPr>
+          <w:t>https://dba.stackexchange.com/questions/147185/how-to-connect-to-sql-server-using-sqlcmd-on-linux</w:t>
+        </w:r>
+      </w:hyperlink>
+    </w:p>
+    <w:p>
+      <w:pPr>
+        <w:jc w:val="both"/>
+        <w:rPr>
+          <w:rFonts w:ascii="Times New Roman" w:hAnsi="Times New Roman" w:cs="Times New Roman"/>
+          <w:sz w:val="28"/>
+          <w:szCs w:val="28"/>
+        </w:rPr>
+      </w:pPr>
+      <w:r>
+        <w:rPr>
+          <w:rFonts w:ascii="Times New Roman" w:hAnsi="Times New Roman" w:cs="Times New Roman"/>
+          <w:sz w:val="28"/>
+          <w:szCs w:val="28"/>
+        </w:rPr>
+        <w:t>Вместе с портом меняется синтаксис команды</w:t>
+      </w:r>
+      <w:r>
+        <w:rPr>
+          <w:rFonts w:ascii="Times New Roman" w:hAnsi="Times New Roman" w:cs="Times New Roman"/>
+          <w:sz w:val="28"/>
+          <w:szCs w:val="28"/>
+        </w:rPr>
+        <w:t xml:space="preserve"> </w:t>
+      </w:r>
+      <w:r>
+        <w:rPr>
+          <w:rFonts w:ascii="Times New Roman" w:hAnsi="Times New Roman" w:cs="Times New Roman"/>
+          <w:sz w:val="28"/>
+          <w:szCs w:val="28"/>
+        </w:rPr>
+        <w:t>sqlcmd</w:t>
+      </w:r>
+      <w:r>
+        <w:rPr>
+          <w:rFonts w:ascii="Times New Roman" w:hAnsi="Times New Roman" w:cs="Times New Roman"/>
+          <w:sz w:val="28"/>
+          <w:szCs w:val="28"/>
+        </w:rPr>
+        <w:t>:</w:t>
+      </w:r>
+    </w:p>
+    <w:p>
+      <w:pPr>
+        <w:jc w:val="both"/>
+        <w:rPr>
+          <w:rFonts w:ascii="Times New Roman" w:hAnsi="Times New Roman" w:cs="Times New Roman"/>
+          <w:sz w:val="28"/>
+          <w:szCs w:val="28"/>
+        </w:rPr>
+      </w:pPr>
+      <w:r>
+        <w:rPr>
+          <w:rFonts w:ascii="Times New Roman" w:hAnsi="Times New Roman" w:cs="Times New Roman"/>
+          <w:sz w:val="28"/>
+          <w:szCs w:val="28"/>
+        </w:rPr>
+        <w:t>sudo docker run -it --rm mcr.microsoft.com/mssql-tools /opt/mssql-tools/bin/sqlcmd -S IP_АДРЕС,ПОРТ -U ЛОГИН -P ПАРОЛЬ -d InfraManager -C</w:t>
+      </w:r>
+    </w:p>
+    <w:p>
+      <w:pPr>
+        <w:jc w:val="both"/>
+        <w:rPr>
+          <w:rFonts w:ascii="Times New Roman" w:hAnsi="Times New Roman" w:cs="Times New Roman"/>
+          <w:sz w:val="28"/>
+          <w:szCs w:val="28"/>
+        </w:rPr>
+      </w:pPr>
+      <w:r>
+        <w:rPr>
+          <w:rFonts w:ascii="Times New Roman" w:hAnsi="Times New Roman" w:cs="Times New Roman"/>
+          <w:noProof/>
+          <w:sz w:val="28"/>
+          <w:szCs w:val="28"/>
+        </w:rPr>
+        <w:drawing>
+          <wp:inline distT="0" distB="0" distL="0" distR="0" wp14:anchorId="1C8D9F45" wp14:editId="3B0E0E42">
+            <wp:extent cx="6645910" cy="1226820"/>
+            <wp:effectExtent l="0" t="0" r="2540" b="0"/>
+            <wp:docPr id="1026469574" name="Рисунок 1"/>
+            <wp:cNvGraphicFramePr>
+              <a:graphicFrameLocks xmlns:a="http://schemas.openxmlformats.org/drawingml/2006/main" noChangeAspect="1"/>
+            </wp:cNvGraphicFramePr>
+            <a:graphic xmlns:a="http://schemas.openxmlformats.org/drawingml/2006/main">
+              <a:graphicData uri="http://schemas.openxmlformats.org/drawingml/2006/picture">
+                <pic:pic xmlns:pic="http://schemas.openxmlformats.org/drawingml/2006/picture">
+                  <pic:nvPicPr>
+                    <pic:cNvPr id="1026469574" name=""/>
+                    <pic:cNvPicPr/>
+                  </pic:nvPicPr>
+                  <pic:blipFill>
+                    <a:blip r:embed="rId15"/>
+                    <a:stretch>
+                      <a:fillRect/>
+                    </a:stretch>
+                  </pic:blipFill>
+                  <pic:spPr>
+                    <a:xfrm>
+                      <a:off x="0" y="0"/>
+                      <a:ext cx="6645910" cy="1226820"/>
+                    </a:xfrm>
+                    <a:prstGeom prst="rect">
+                      <a:avLst/>
+                    </a:prstGeom>
+                  </pic:spPr>
+                </pic:pic>
+              </a:graphicData>
+            </a:graphic>
+          </wp:inline>
+        </w:drawing>
+      </w:r>
+    </w:p>
+    <w:p>
+      <w:pPr>
+        <w:jc w:val="both"/>
+        <w:rPr>
+          <w:rFonts w:ascii="Times New Roman" w:hAnsi="Times New Roman" w:cs="Times New Roman"/>
+          <w:sz w:val="28"/>
+          <w:szCs w:val="28"/>
+        </w:rPr>
+      </w:pPr>
+      <w:r>
+        <w:rPr>
+          <w:rFonts w:ascii="Times New Roman" w:hAnsi="Times New Roman" w:cs="Times New Roman"/>
+          <w:sz w:val="28"/>
+          <w:szCs w:val="28"/>
+        </w:rPr>
+        <w:t xml:space="preserve">Строка подключения для </w:t>
+      </w:r>
+      <w:r>
+        <w:rPr>
+          <w:rFonts w:ascii="Times New Roman" w:hAnsi="Times New Roman" w:cs="Times New Roman"/>
+          <w:sz w:val="28"/>
+          <w:szCs w:val="28"/>
+          <w:lang w:val="en-US"/>
+        </w:rPr>
+        <w:t>Java</w:t>
+      </w:r>
+      <w:r>
+        <w:rPr>
+          <w:rFonts w:ascii="Times New Roman" w:hAnsi="Times New Roman" w:cs="Times New Roman"/>
+          <w:sz w:val="28"/>
+          <w:szCs w:val="28"/>
+        </w:rPr>
+        <w:t>:</w:t>
+      </w:r>
+    </w:p>
+    <w:p>
+      <w:pPr>
+        <w:jc w:val="both"/>
+        <w:rPr>
+          <w:rFonts w:ascii="Times New Roman" w:hAnsi="Times New Roman" w:cs="Times New Roman"/>
+          <w:sz w:val="28"/>
+          <w:szCs w:val="28"/>
+        </w:rPr>
+      </w:pPr>
+      <w:r>
+        <w:rPr>
+          <w:rFonts w:ascii="Times New Roman" w:hAnsi="Times New Roman" w:cs="Times New Roman"/>
+          <w:sz w:val="28"/>
+          <w:szCs w:val="28"/>
+        </w:rPr>
+        <w:t>Вариант А</w:t>
+      </w:r>
+      <w:r>
+        <w:rPr>
+          <w:rFonts w:ascii="Times New Roman" w:hAnsi="Times New Roman" w:cs="Times New Roman"/>
+          <w:sz w:val="28"/>
+          <w:szCs w:val="28"/>
+        </w:rPr>
+        <w:t xml:space="preserve"> (узнал точный порт):</w:t>
+      </w:r>
+    </w:p>
+    <w:p>
+      <w:pPr>
+        <w:jc w:val="both"/>
+        <w:rPr>
+          <w:rFonts w:ascii="Times New Roman" w:hAnsi="Times New Roman" w:cs="Times New Roman"/>
+          <w:sz w:val="28"/>
+          <w:szCs w:val="28"/>
+        </w:rPr>
+      </w:pPr>
+      <w:r>
+        <w:rPr>
+          <w:rFonts w:ascii="Times New Roman" w:hAnsi="Times New Roman" w:cs="Times New Roman"/>
+          <w:sz w:val="28"/>
+          <w:szCs w:val="28"/>
+        </w:rPr>
+        <w:t>SECONDARY_DB_URL=jdbc:sqlserver://</w:t>
+      </w:r>
+      <w:r>
+        <w:rPr>
+          <w:rFonts w:ascii="Times New Roman" w:hAnsi="Times New Roman" w:cs="Times New Roman"/>
+          <w:sz w:val="28"/>
+          <w:szCs w:val="28"/>
+        </w:rPr>
+        <w:t>ХОСТ</w:t>
+      </w:r>
+      <w:r>
+        <w:rPr>
+          <w:rFonts w:ascii="Times New Roman" w:hAnsi="Times New Roman" w:cs="Times New Roman"/>
+          <w:sz w:val="28"/>
+          <w:szCs w:val="28"/>
+        </w:rPr>
+        <w:t>:ПОРТ;databaseName=InfraManager;trustServerCertificate=true;</w:t>
+      </w:r>
+    </w:p>
+    <w:p>
+      <w:pPr>
+        <w:jc w:val="both"/>
+        <w:rPr>
+          <w:rFonts w:ascii="Times New Roman" w:hAnsi="Times New Roman" w:cs="Times New Roman"/>
+          <w:sz w:val="28"/>
+          <w:szCs w:val="28"/>
+        </w:rPr>
+      </w:pPr>
+      <w:r>
+        <w:rPr>
+          <w:rFonts w:ascii="Times New Roman" w:hAnsi="Times New Roman" w:cs="Times New Roman"/>
+          <w:sz w:val="28"/>
+          <w:szCs w:val="28"/>
+        </w:rPr>
+        <w:t>Вариант Б (Если порт динамический):</w:t>
+      </w:r>
+    </w:p>
+    <w:p>
+      <w:pPr>
+        <w:jc w:val="both"/>
+        <w:rPr>
+          <w:rFonts w:ascii="Times New Roman" w:hAnsi="Times New Roman" w:cs="Times New Roman"/>
+          <w:sz w:val="28"/>
+          <w:szCs w:val="28"/>
+        </w:rPr>
+      </w:pPr>
+      <w:r>
+        <w:rPr>
+          <w:rFonts w:ascii="Times New Roman" w:hAnsi="Times New Roman" w:cs="Times New Roman"/>
+          <w:sz w:val="28"/>
+          <w:szCs w:val="28"/>
+        </w:rPr>
+        <w:t>SECONDARY_DB_URL=jdbc:sqlserver://</w:t>
+      </w:r>
+      <w:r>
+        <w:rPr>
+          <w:rFonts w:ascii="Times New Roman" w:hAnsi="Times New Roman" w:cs="Times New Roman"/>
+          <w:sz w:val="28"/>
+          <w:szCs w:val="28"/>
+        </w:rPr>
+        <w:t>ХОСТ</w:t>
+      </w:r>
+      <w:r>
+        <w:rPr>
+          <w:rFonts w:ascii="Times New Roman" w:hAnsi="Times New Roman" w:cs="Times New Roman"/>
+          <w:sz w:val="28"/>
+          <w:szCs w:val="28"/>
+        </w:rPr>
+        <w:t>;instanceName=</w:t>
+      </w:r>
+      <w:r>
+        <w:rPr>
+          <w:rFonts w:ascii="Times New Roman" w:hAnsi="Times New Roman" w:cs="Times New Roman"/>
+          <w:sz w:val="28"/>
+          <w:szCs w:val="28"/>
+        </w:rPr>
+        <w:t>ЭКЗЕМПЛЯР</w:t>
+      </w:r>
+      <w:r>
+        <w:rPr>
+          <w:rFonts w:ascii="Times New Roman" w:hAnsi="Times New Roman" w:cs="Times New Roman"/>
+          <w:sz w:val="28"/>
+          <w:szCs w:val="28"/>
+        </w:rPr>
+        <w:t>;databaseName=InfraManager;trustServerCertificate=true;</w:t>
+      </w:r>
+    </w:p>
+    <w:p>
+      <w:pPr>
+        <w:rPr>
+          <w:rFonts w:ascii="Times New Roman" w:hAnsi="Times New Roman" w:cs="Times New Roman"/>
+          <w:sz w:val="28"/>
+          <w:szCs w:val="28"/>
+        </w:rPr>
+      </w:pPr>
+      <w:r>
+        <w:rPr>
+          <w:rFonts w:ascii="Times New Roman" w:hAnsi="Times New Roman" w:cs="Times New Roman"/>
+          <w:sz w:val="28"/>
+          <w:szCs w:val="28"/>
+        </w:rPr>
+        <w:br w:type="page"/>
+      </w:r>
+    </w:p>
+    <w:p>
+      <w:pPr>
+        <w:jc w:val="center"/>
+        <w:rPr>
+          <w:rFonts w:ascii="Times New Roman" w:hAnsi="Times New Roman" w:cs="Times New Roman"/>
+          <w:b/>
+          <w:bCs/>
+          <w:sz w:val="28"/>
+          <w:szCs w:val="28"/>
+        </w:rPr>
+      </w:pPr>
+      <w:r>
+        <w:rPr>
+          <w:rFonts w:ascii="Times New Roman" w:hAnsi="Times New Roman" w:cs="Times New Roman"/>
+          <w:b/>
+          <w:bCs/>
+          <w:sz w:val="28"/>
+          <w:szCs w:val="28"/>
+        </w:rPr>
+        <w:lastRenderedPageBreak/>
+        <w:t xml:space="preserve">Запуск </w:t>
+      </w:r>
+      <w:r>
+        <w:rPr>
+          <w:rFonts w:ascii="Times New Roman" w:hAnsi="Times New Roman" w:cs="Times New Roman"/>
+          <w:b/>
+          <w:bCs/>
+          <w:sz w:val="28"/>
+          <w:szCs w:val="28"/>
+        </w:rPr>
+        <w:t>демоверсии</w:t>
+      </w:r>
+    </w:p>
+    <w:p>
+      <w:pPr>
+        <w:jc w:val="both"/>
+        <w:rPr>
+          <w:rFonts w:ascii="Times New Roman" w:hAnsi="Times New Roman" w:cs="Times New Roman"/>
+          <w:sz w:val="28"/>
+          <w:szCs w:val="28"/>
+        </w:rPr>
+      </w:pPr>
+      <w:r>
+        <w:rPr>
+          <w:rFonts w:ascii="Times New Roman" w:hAnsi="Times New Roman" w:cs="Times New Roman"/>
+          <w:sz w:val="28"/>
+          <w:szCs w:val="28"/>
+        </w:rPr>
+        <w:t> В этом режиме разворачивается дополнительный контейнер с MS SQL Server, эмулирующий работу "ИнфраМенеджера" и заполненный тестовыми данными (списанными ПК, сотрудниками, отделами и комплектующими).</w:t>
+      </w:r>
+    </w:p>
+    <w:p>
+      <w:pPr>
+        <w:jc w:val="both"/>
+        <w:rPr>
+          <w:rFonts w:ascii="Times New Roman" w:hAnsi="Times New Roman" w:cs="Times New Roman"/>
+          <w:b/>
+          <w:bCs/>
+          <w:sz w:val="28"/>
+          <w:szCs w:val="28"/>
+        </w:rPr>
+      </w:pPr>
+      <w:r>
+        <w:rPr>
+          <w:rFonts w:ascii="Times New Roman" w:hAnsi="Times New Roman" w:cs="Times New Roman"/>
+          <w:b/>
+          <w:bCs/>
+          <w:sz w:val="28"/>
+          <w:szCs w:val="28"/>
+        </w:rPr>
+        <w:t>Шаги для запуска:</w:t>
+      </w:r>
+    </w:p>
+    <w:p>
+      <w:pPr>
+        <w:jc w:val="both"/>
+        <w:rPr>
+          <w:rFonts w:ascii="Times New Roman" w:hAnsi="Times New Roman" w:cs="Times New Roman"/>
+          <w:b/>
+          <w:bCs/>
+          <w:sz w:val="28"/>
+          <w:szCs w:val="28"/>
+        </w:rPr>
+      </w:pPr>
+      <w:r>
+        <w:rPr>
+          <w:rFonts w:ascii="Times New Roman" w:hAnsi="Times New Roman" w:cs="Times New Roman"/>
+          <w:b/>
+          <w:bCs/>
+          <w:sz w:val="28"/>
+          <w:szCs w:val="28"/>
+        </w:rPr>
+        <w:t>1. Подготов</w:t>
+      </w:r>
+      <w:r>
+        <w:rPr>
+          <w:rFonts w:ascii="Times New Roman" w:hAnsi="Times New Roman" w:cs="Times New Roman"/>
+          <w:b/>
+          <w:bCs/>
+          <w:sz w:val="28"/>
+          <w:szCs w:val="28"/>
+        </w:rPr>
+        <w:t>ить</w:t>
+      </w:r>
+      <w:r>
+        <w:rPr>
+          <w:rFonts w:ascii="Times New Roman" w:hAnsi="Times New Roman" w:cs="Times New Roman"/>
+          <w:b/>
+          <w:bCs/>
+          <w:sz w:val="28"/>
+          <w:szCs w:val="28"/>
+        </w:rPr>
+        <w:t xml:space="preserve"> CSV-файлы:</w:t>
+      </w:r>
+    </w:p>
+    <w:p>
+      <w:pPr>
+        <w:jc w:val="both"/>
+        <w:rPr>
+          <w:rFonts w:ascii="Times New Roman" w:hAnsi="Times New Roman" w:cs="Times New Roman"/>
+          <w:sz w:val="28"/>
+          <w:szCs w:val="28"/>
+        </w:rPr>
+      </w:pPr>
+      <w:r>
+        <w:rPr>
+          <w:rFonts w:ascii="Times New Roman" w:hAnsi="Times New Roman" w:cs="Times New Roman"/>
+          <w:sz w:val="28"/>
+          <w:szCs w:val="28"/>
+        </w:rPr>
+        <w:t>Положит</w:t>
+      </w:r>
+      <w:r>
+        <w:rPr>
+          <w:rFonts w:ascii="Times New Roman" w:hAnsi="Times New Roman" w:cs="Times New Roman"/>
+          <w:sz w:val="28"/>
+          <w:szCs w:val="28"/>
+        </w:rPr>
+        <w:t>ь</w:t>
+      </w:r>
+      <w:r>
+        <w:rPr>
+          <w:rFonts w:ascii="Times New Roman" w:hAnsi="Times New Roman" w:cs="Times New Roman"/>
+          <w:sz w:val="28"/>
+          <w:szCs w:val="28"/>
+        </w:rPr>
+        <w:t xml:space="preserve"> файлы эталонных комплектующих в папку ./data/input.</w:t>
+      </w:r>
+    </w:p>
+    <w:p>
+      <w:pPr>
+        <w:jc w:val="both"/>
+        <w:rPr>
+          <w:rFonts w:ascii="Times New Roman" w:hAnsi="Times New Roman" w:cs="Times New Roman"/>
+          <w:b/>
+          <w:bCs/>
+          <w:sz w:val="28"/>
+          <w:szCs w:val="28"/>
+        </w:rPr>
+      </w:pPr>
+      <w:r>
+        <w:rPr>
+          <w:rFonts w:ascii="Times New Roman" w:hAnsi="Times New Roman" w:cs="Times New Roman"/>
+          <w:b/>
+          <w:bCs/>
+          <w:sz w:val="28"/>
+          <w:szCs w:val="28"/>
+        </w:rPr>
+        <w:t>2. Запустит</w:t>
+      </w:r>
+      <w:r>
+        <w:rPr>
+          <w:rFonts w:ascii="Times New Roman" w:hAnsi="Times New Roman" w:cs="Times New Roman"/>
+          <w:b/>
+          <w:bCs/>
+          <w:sz w:val="28"/>
+          <w:szCs w:val="28"/>
+        </w:rPr>
+        <w:t>ь</w:t>
+      </w:r>
+      <w:r>
+        <w:rPr>
+          <w:rFonts w:ascii="Times New Roman" w:hAnsi="Times New Roman" w:cs="Times New Roman"/>
+          <w:b/>
+          <w:bCs/>
+          <w:sz w:val="28"/>
+          <w:szCs w:val="28"/>
+        </w:rPr>
+        <w:t xml:space="preserve"> базы данных и генератор демо-данных:</w:t>
+      </w:r>
+    </w:p>
+    <w:p>
+      <w:pPr>
+        <w:jc w:val="both"/>
+        <w:rPr>
+          <w:rFonts w:ascii="Times New Roman" w:hAnsi="Times New Roman" w:cs="Times New Roman"/>
+          <w:sz w:val="28"/>
+          <w:szCs w:val="28"/>
+        </w:rPr>
+      </w:pPr>
+      <w:r>
+        <w:rPr>
+          <w:rFonts w:ascii="Times New Roman" w:hAnsi="Times New Roman" w:cs="Times New Roman"/>
+          <w:sz w:val="28"/>
+          <w:szCs w:val="28"/>
+        </w:rPr>
+        <w:t>docker compose -f docker-compose.demo.yml up -d db infra-db infra-init</w:t>
+      </w:r>
+    </w:p>
+    <w:p>
+      <w:pPr>
+        <w:jc w:val="both"/>
+        <w:rPr>
+          <w:rFonts w:ascii="Times New Roman" w:hAnsi="Times New Roman" w:cs="Times New Roman"/>
+          <w:sz w:val="28"/>
+          <w:szCs w:val="28"/>
+        </w:rPr>
+      </w:pPr>
+      <w:r>
+        <w:rPr>
+          <w:rFonts w:ascii="Times New Roman" w:hAnsi="Times New Roman" w:cs="Times New Roman"/>
+          <w:sz w:val="28"/>
+          <w:szCs w:val="28"/>
+        </w:rPr>
+        <w:t>(Фейковый MS SQL поднимется, после чего служебный контейнер infra-init автоматически создаст в нем таблицы и зальет 30 тестовых компьютеров со статусами и деталями).</w:t>
+      </w:r>
+    </w:p>
+    <w:p>
+      <w:pPr>
+        <w:jc w:val="both"/>
+        <w:rPr>
+          <w:rFonts w:ascii="Times New Roman" w:hAnsi="Times New Roman" w:cs="Times New Roman"/>
+          <w:b/>
+          <w:bCs/>
+          <w:sz w:val="28"/>
+          <w:szCs w:val="28"/>
+        </w:rPr>
+      </w:pPr>
+      <w:r>
+        <w:rPr>
+          <w:rFonts w:ascii="Times New Roman" w:hAnsi="Times New Roman" w:cs="Times New Roman"/>
+          <w:b/>
+          <w:bCs/>
+          <w:sz w:val="28"/>
+          <w:szCs w:val="28"/>
+        </w:rPr>
+        <w:t>3. Обучит</w:t>
+      </w:r>
+      <w:r>
+        <w:rPr>
+          <w:rFonts w:ascii="Times New Roman" w:hAnsi="Times New Roman" w:cs="Times New Roman"/>
+          <w:b/>
+          <w:bCs/>
+          <w:sz w:val="28"/>
+          <w:szCs w:val="28"/>
+        </w:rPr>
+        <w:t>ь</w:t>
+      </w:r>
+      <w:r>
+        <w:rPr>
+          <w:rFonts w:ascii="Times New Roman" w:hAnsi="Times New Roman" w:cs="Times New Roman"/>
+          <w:b/>
+          <w:bCs/>
+          <w:sz w:val="28"/>
+          <w:szCs w:val="28"/>
+        </w:rPr>
+        <w:t xml:space="preserve"> систему (</w:t>
+      </w:r>
+      <w:r>
+        <w:rPr>
+          <w:rFonts w:ascii="Times New Roman" w:hAnsi="Times New Roman" w:cs="Times New Roman"/>
+          <w:b/>
+          <w:bCs/>
+          <w:sz w:val="28"/>
+          <w:szCs w:val="28"/>
+        </w:rPr>
+        <w:t>и</w:t>
+      </w:r>
+      <w:r>
+        <w:rPr>
+          <w:rFonts w:ascii="Times New Roman" w:hAnsi="Times New Roman" w:cs="Times New Roman"/>
+          <w:b/>
+          <w:bCs/>
+          <w:sz w:val="28"/>
+          <w:szCs w:val="28"/>
+        </w:rPr>
+        <w:t>мпорт эталонных деталей):</w:t>
+      </w:r>
+    </w:p>
+    <w:p>
+      <w:pPr>
+        <w:jc w:val="both"/>
+        <w:rPr>
+          <w:rFonts w:ascii="Times New Roman" w:hAnsi="Times New Roman" w:cs="Times New Roman"/>
+          <w:sz w:val="28"/>
+          <w:szCs w:val="28"/>
+        </w:rPr>
+      </w:pPr>
+      <w:r>
+        <w:rPr>
+          <w:rFonts w:ascii="Times New Roman" w:hAnsi="Times New Roman" w:cs="Times New Roman"/>
+          <w:sz w:val="28"/>
+          <w:szCs w:val="28"/>
+        </w:rPr>
+        <w:t>Запустит</w:t>
+      </w:r>
+      <w:r>
+        <w:rPr>
+          <w:rFonts w:ascii="Times New Roman" w:hAnsi="Times New Roman" w:cs="Times New Roman"/>
+          <w:sz w:val="28"/>
+          <w:szCs w:val="28"/>
+        </w:rPr>
+        <w:t>ь скрипт-импортер</w:t>
+      </w:r>
+      <w:r>
+        <w:rPr>
+          <w:rFonts w:ascii="Times New Roman" w:hAnsi="Times New Roman" w:cs="Times New Roman"/>
+          <w:sz w:val="28"/>
+          <w:szCs w:val="28"/>
+        </w:rPr>
+        <w:t>:</w:t>
+      </w:r>
+    </w:p>
+    <w:p>
+      <w:pPr>
+        <w:jc w:val="both"/>
+        <w:rPr>
+          <w:rFonts w:ascii="Times New Roman" w:hAnsi="Times New Roman" w:cs="Times New Roman"/>
+          <w:sz w:val="28"/>
+          <w:szCs w:val="28"/>
+        </w:rPr>
+      </w:pPr>
+      <w:r>
+        <w:rPr>
+          <w:rFonts w:ascii="Times New Roman" w:hAnsi="Times New Roman" w:cs="Times New Roman"/>
+          <w:sz w:val="28"/>
+          <w:szCs w:val="28"/>
+        </w:rPr>
+        <w:t>docker compose -f docker-compose.demo.yml run --rm importer python main.py --all --dir /app/data/input</w:t>
+      </w:r>
+    </w:p>
+    <w:p>
+      <w:pPr>
+        <w:jc w:val="both"/>
+        <w:rPr>
+          <w:rFonts w:ascii="Times New Roman" w:hAnsi="Times New Roman" w:cs="Times New Roman"/>
+          <w:b/>
+          <w:bCs/>
+          <w:sz w:val="28"/>
+          <w:szCs w:val="28"/>
+        </w:rPr>
+      </w:pPr>
+      <w:r>
+        <w:rPr>
+          <w:rFonts w:ascii="Times New Roman" w:hAnsi="Times New Roman" w:cs="Times New Roman"/>
+          <w:b/>
+          <w:bCs/>
+          <w:sz w:val="28"/>
+          <w:szCs w:val="28"/>
+        </w:rPr>
+        <w:t>4. Запустит</w:t>
+      </w:r>
+      <w:r>
+        <w:rPr>
+          <w:rFonts w:ascii="Times New Roman" w:hAnsi="Times New Roman" w:cs="Times New Roman"/>
+          <w:b/>
+          <w:bCs/>
+          <w:sz w:val="28"/>
+          <w:szCs w:val="28"/>
+        </w:rPr>
+        <w:t>ь</w:t>
+      </w:r>
+      <w:r>
+        <w:rPr>
+          <w:rFonts w:ascii="Times New Roman" w:hAnsi="Times New Roman" w:cs="Times New Roman"/>
+          <w:b/>
+          <w:bCs/>
+          <w:sz w:val="28"/>
+          <w:szCs w:val="28"/>
+        </w:rPr>
+        <w:t xml:space="preserve"> </w:t>
+      </w:r>
+      <w:r>
+        <w:rPr>
+          <w:rFonts w:ascii="Times New Roman" w:hAnsi="Times New Roman" w:cs="Times New Roman"/>
+          <w:b/>
+          <w:bCs/>
+          <w:sz w:val="28"/>
+          <w:szCs w:val="28"/>
+        </w:rPr>
+        <w:t>б</w:t>
+      </w:r>
+      <w:r>
+        <w:rPr>
+          <w:rFonts w:ascii="Times New Roman" w:hAnsi="Times New Roman" w:cs="Times New Roman"/>
+          <w:b/>
+          <w:bCs/>
+          <w:sz w:val="28"/>
+          <w:szCs w:val="28"/>
+        </w:rPr>
+        <w:t xml:space="preserve">экенд, </w:t>
+      </w:r>
+      <w:r>
+        <w:rPr>
+          <w:rFonts w:ascii="Times New Roman" w:hAnsi="Times New Roman" w:cs="Times New Roman"/>
+          <w:b/>
+          <w:bCs/>
+          <w:sz w:val="28"/>
+          <w:szCs w:val="28"/>
+        </w:rPr>
+        <w:t>ф</w:t>
+      </w:r>
+      <w:r>
+        <w:rPr>
+          <w:rFonts w:ascii="Times New Roman" w:hAnsi="Times New Roman" w:cs="Times New Roman"/>
+          <w:b/>
+          <w:bCs/>
+          <w:sz w:val="28"/>
+          <w:szCs w:val="28"/>
+        </w:rPr>
+        <w:t xml:space="preserve">ронтенд и </w:t>
+      </w:r>
+      <w:r>
+        <w:rPr>
+          <w:rFonts w:ascii="Times New Roman" w:hAnsi="Times New Roman" w:cs="Times New Roman"/>
+          <w:b/>
+          <w:bCs/>
+          <w:sz w:val="28"/>
+          <w:szCs w:val="28"/>
+        </w:rPr>
+        <w:t>п</w:t>
+      </w:r>
+      <w:r>
+        <w:rPr>
+          <w:rFonts w:ascii="Times New Roman" w:hAnsi="Times New Roman" w:cs="Times New Roman"/>
+          <w:b/>
+          <w:bCs/>
+          <w:sz w:val="28"/>
+          <w:szCs w:val="28"/>
+        </w:rPr>
+        <w:t>рокси:</w:t>
+      </w:r>
+    </w:p>
+    <w:p>
+      <w:pPr>
+        <w:jc w:val="both"/>
+        <w:rPr>
+          <w:rFonts w:ascii="Times New Roman" w:hAnsi="Times New Roman" w:cs="Times New Roman"/>
+          <w:sz w:val="28"/>
+          <w:szCs w:val="28"/>
+        </w:rPr>
+      </w:pPr>
+      <w:r>
+        <w:rPr>
+          <w:rFonts w:ascii="Times New Roman" w:hAnsi="Times New Roman" w:cs="Times New Roman"/>
+          <w:sz w:val="28"/>
+          <w:szCs w:val="28"/>
+        </w:rPr>
+        <w:t>docker compose -f docker-compose.demo.yml up -d</w:t>
+      </w:r>
+    </w:p>
+    <w:p>
+      <w:pPr>
+        <w:jc w:val="both"/>
+        <w:rPr>
+          <w:rFonts w:ascii="Times New Roman" w:hAnsi="Times New Roman" w:cs="Times New Roman"/>
+          <w:sz w:val="28"/>
+          <w:szCs w:val="28"/>
+        </w:rPr>
+      </w:pPr>
+      <w:r>
+        <w:rPr>
+          <w:rFonts w:ascii="Times New Roman" w:hAnsi="Times New Roman" w:cs="Times New Roman"/>
+          <w:sz w:val="28"/>
+          <w:szCs w:val="28"/>
+        </w:rPr>
+        <w:t>Всё! Система доступна через браузер по адресу http://localhost</w:t>
+      </w:r>
     </w:p>
     <w:sectPr>
       <w:pgSz w:w="11906" w:h="16838"/>

</xml_diff>

<commit_message>
Update file link and enhance documentation for SQL Server connection issues
</commit_message>
<xml_diff>
--- a/docs/Инструкция.docx
+++ b/docs/Инструкция.docx
@@ -71,7 +71,16 @@
           <w:sz w:val="28"/>
           <w:szCs w:val="28"/>
         </w:rPr>
-        <w:t xml:space="preserve"> в </w:t>
+        <w:t xml:space="preserve"> </w:t>
+      </w:r>
+      <w:proofErr w:type="gramStart"/>
+      <w:r>
+        <w:rPr>
+          <w:rFonts w:ascii="Times New Roman" w:hAnsi="Times New Roman" w:cs="Times New Roman"/>
+          <w:sz w:val="28"/>
+          <w:szCs w:val="28"/>
+        </w:rPr>
+        <w:t xml:space="preserve">в </w:t>
       </w:r>
       <w:r>
         <w:rPr>
@@ -80,7 +89,17 @@
           <w:szCs w:val="28"/>
           <w:lang w:val="en-US"/>
         </w:rPr>
-        <w:t xml:space="preserve">.env </w:t>
+        <w:t>.env</w:t>
+      </w:r>
+      <w:proofErr w:type="gramEnd"/>
+      <w:r>
+        <w:rPr>
+          <w:rFonts w:ascii="Times New Roman" w:hAnsi="Times New Roman" w:cs="Times New Roman"/>
+          <w:sz w:val="28"/>
+          <w:szCs w:val="28"/>
+          <w:lang w:val="en-US"/>
+        </w:rPr>
+        <w:t xml:space="preserve"> </w:t>
       </w:r>
       <w:r>
         <w:rPr>
@@ -100,6 +119,7 @@
           <w:szCs w:val="28"/>
         </w:rPr>
       </w:pPr>
+      <w:proofErr w:type="gramStart"/>
       <w:r>
         <w:rPr>
           <w:rFonts w:ascii="Times New Roman" w:hAnsi="Times New Roman" w:cs="Times New Roman"/>
@@ -116,6 +136,7 @@
         </w:rPr>
         <w:t>trustServerCertificate=true</w:t>
       </w:r>
+      <w:proofErr w:type="gramEnd"/>
       <w:r>
         <w:rPr>
           <w:rFonts w:ascii="Times New Roman" w:hAnsi="Times New Roman" w:cs="Times New Roman"/>
@@ -1146,7 +1167,16 @@
           <w:sz w:val="28"/>
           <w:szCs w:val="28"/>
         </w:rPr>
-        <w:t>donor-backend:latest</w:t>
+        <w:t>donor-</w:t>
+      </w:r>
+      <w:proofErr w:type="gramStart"/>
+      <w:r>
+        <w:rPr>
+          <w:rFonts w:ascii="Times New Roman" w:hAnsi="Times New Roman" w:cs="Times New Roman"/>
+          <w:sz w:val="28"/>
+          <w:szCs w:val="28"/>
+        </w:rPr>
+        <w:t>backend:latest</w:t>
       </w:r>
       <w:proofErr w:type="spellEnd"/>
       <w:r>
@@ -1158,6 +1188,7 @@
         <w:t xml:space="preserve"> ./</w:t>
       </w:r>
       <w:proofErr w:type="spellStart"/>
+      <w:proofErr w:type="gramEnd"/>
       <w:r>
         <w:rPr>
           <w:rFonts w:ascii="Times New Roman" w:hAnsi="Times New Roman" w:cs="Times New Roman"/>
@@ -1220,7 +1251,16 @@
           <w:sz w:val="28"/>
           <w:szCs w:val="28"/>
         </w:rPr>
-        <w:t>donor-frontend:latest</w:t>
+        <w:t>donor-</w:t>
+      </w:r>
+      <w:proofErr w:type="gramStart"/>
+      <w:r>
+        <w:rPr>
+          <w:rFonts w:ascii="Times New Roman" w:hAnsi="Times New Roman" w:cs="Times New Roman"/>
+          <w:sz w:val="28"/>
+          <w:szCs w:val="28"/>
+        </w:rPr>
+        <w:t>frontend:latest</w:t>
       </w:r>
       <w:proofErr w:type="spellEnd"/>
       <w:r>
@@ -1232,6 +1272,7 @@
         <w:t xml:space="preserve"> ./</w:t>
       </w:r>
       <w:proofErr w:type="spellStart"/>
+      <w:proofErr w:type="gramEnd"/>
       <w:r>
         <w:rPr>
           <w:rFonts w:ascii="Times New Roman" w:hAnsi="Times New Roman" w:cs="Times New Roman"/>
@@ -1294,7 +1335,16 @@
           <w:sz w:val="28"/>
           <w:szCs w:val="28"/>
         </w:rPr>
-        <w:t>donor-importer:latest</w:t>
+        <w:t>donor-</w:t>
+      </w:r>
+      <w:proofErr w:type="gramStart"/>
+      <w:r>
+        <w:rPr>
+          <w:rFonts w:ascii="Times New Roman" w:hAnsi="Times New Roman" w:cs="Times New Roman"/>
+          <w:sz w:val="28"/>
+          <w:szCs w:val="28"/>
+        </w:rPr>
+        <w:t>importer:latest</w:t>
       </w:r>
       <w:proofErr w:type="spellEnd"/>
       <w:r>
@@ -1306,6 +1356,7 @@
         <w:t xml:space="preserve"> ./</w:t>
       </w:r>
       <w:proofErr w:type="spellStart"/>
+      <w:proofErr w:type="gramEnd"/>
       <w:r>
         <w:rPr>
           <w:rFonts w:ascii="Times New Roman" w:hAnsi="Times New Roman" w:cs="Times New Roman"/>
@@ -1435,6 +1486,7 @@
         <w:t xml:space="preserve"> </w:t>
       </w:r>
       <w:proofErr w:type="spellStart"/>
+      <w:proofErr w:type="gramStart"/>
       <w:r>
         <w:rPr>
           <w:rFonts w:ascii="Times New Roman" w:hAnsi="Times New Roman" w:cs="Times New Roman"/>
@@ -1444,6 +1496,7 @@
         <w:t>nginx:alpine</w:t>
       </w:r>
       <w:proofErr w:type="spellEnd"/>
+      <w:proofErr w:type="gramEnd"/>
     </w:p>
     <w:p>
       <w:pPr>
@@ -1601,9 +1654,19 @@
           <w:sz w:val="28"/>
           <w:szCs w:val="28"/>
         </w:rPr>
-        <w:t>donor-backend:latest</w:t>
-      </w:r>
-      <w:proofErr w:type="spellEnd"/>
+        <w:t>donor-</w:t>
+      </w:r>
+      <w:proofErr w:type="gramStart"/>
+      <w:r>
+        <w:rPr>
+          <w:rFonts w:ascii="Times New Roman" w:hAnsi="Times New Roman" w:cs="Times New Roman"/>
+          <w:sz w:val="28"/>
+          <w:szCs w:val="28"/>
+        </w:rPr>
+        <w:t>backend:latest</w:t>
+      </w:r>
+      <w:proofErr w:type="spellEnd"/>
+      <w:proofErr w:type="gramEnd"/>
       <w:r>
         <w:rPr>
           <w:rFonts w:ascii="Times New Roman" w:hAnsi="Times New Roman" w:cs="Times New Roman"/>
@@ -1619,9 +1682,19 @@
           <w:sz w:val="28"/>
           <w:szCs w:val="28"/>
         </w:rPr>
-        <w:t>donor-frontend:latest</w:t>
-      </w:r>
-      <w:proofErr w:type="spellEnd"/>
+        <w:t>donor-</w:t>
+      </w:r>
+      <w:proofErr w:type="gramStart"/>
+      <w:r>
+        <w:rPr>
+          <w:rFonts w:ascii="Times New Roman" w:hAnsi="Times New Roman" w:cs="Times New Roman"/>
+          <w:sz w:val="28"/>
+          <w:szCs w:val="28"/>
+        </w:rPr>
+        <w:t>frontend:latest</w:t>
+      </w:r>
+      <w:proofErr w:type="spellEnd"/>
+      <w:proofErr w:type="gramEnd"/>
       <w:r>
         <w:rPr>
           <w:rFonts w:ascii="Times New Roman" w:hAnsi="Times New Roman" w:cs="Times New Roman"/>
@@ -1637,9 +1710,19 @@
           <w:sz w:val="28"/>
           <w:szCs w:val="28"/>
         </w:rPr>
-        <w:t>donor-importer:latest</w:t>
-      </w:r>
-      <w:proofErr w:type="spellEnd"/>
+        <w:t>donor-</w:t>
+      </w:r>
+      <w:proofErr w:type="gramStart"/>
+      <w:r>
+        <w:rPr>
+          <w:rFonts w:ascii="Times New Roman" w:hAnsi="Times New Roman" w:cs="Times New Roman"/>
+          <w:sz w:val="28"/>
+          <w:szCs w:val="28"/>
+        </w:rPr>
+        <w:t>importer:latest</w:t>
+      </w:r>
+      <w:proofErr w:type="spellEnd"/>
+      <w:proofErr w:type="gramEnd"/>
       <w:r>
         <w:rPr>
           <w:rFonts w:ascii="Times New Roman" w:hAnsi="Times New Roman" w:cs="Times New Roman"/>
@@ -1649,6 +1732,7 @@
         <w:t xml:space="preserve"> postgres:15-alpine </w:t>
       </w:r>
       <w:proofErr w:type="spellStart"/>
+      <w:proofErr w:type="gramStart"/>
       <w:r>
         <w:rPr>
           <w:rFonts w:ascii="Times New Roman" w:hAnsi="Times New Roman" w:cs="Times New Roman"/>
@@ -1658,6 +1742,7 @@
         <w:t>nginx:alpine</w:t>
       </w:r>
       <w:proofErr w:type="spellEnd"/>
+      <w:proofErr w:type="gramEnd"/>
       <w:r>
         <w:rPr>
           <w:rFonts w:ascii="Times New Roman" w:hAnsi="Times New Roman" w:cs="Times New Roman"/>
@@ -1911,6 +1996,7 @@
           <w:szCs w:val="28"/>
         </w:rPr>
       </w:pPr>
+      <w:proofErr w:type="gramStart"/>
       <w:r>
         <w:rPr>
           <w:rFonts w:ascii="Times New Roman" w:hAnsi="Times New Roman" w:cs="Times New Roman"/>
@@ -1926,7 +2012,16 @@
           <w:sz w:val="28"/>
           <w:szCs w:val="28"/>
         </w:rPr>
-        <w:t>env.example</w:t>
+        <w:t>env</w:t>
+      </w:r>
+      <w:proofErr w:type="gramEnd"/>
+      <w:r>
+        <w:rPr>
+          <w:rFonts w:ascii="Times New Roman" w:hAnsi="Times New Roman" w:cs="Times New Roman"/>
+          <w:sz w:val="28"/>
+          <w:szCs w:val="28"/>
+        </w:rPr>
+        <w:t>.example</w:t>
       </w:r>
       <w:proofErr w:type="spellEnd"/>
       <w:r>
@@ -5865,6 +5960,88 @@
           <w:sz w:val="28"/>
           <w:szCs w:val="28"/>
         </w:rPr>
+        <w:t>: echo "</w:t>
+      </w:r>
+      <w:proofErr w:type="spellStart"/>
+      <w:r>
+        <w:rPr>
+          <w:rFonts w:ascii="Times New Roman" w:hAnsi="Times New Roman" w:cs="Times New Roman"/>
+          <w:sz w:val="28"/>
+          <w:szCs w:val="28"/>
+        </w:rPr>
+        <w:t>Disabled</w:t>
+      </w:r>
+      <w:proofErr w:type="spellEnd"/>
+      <w:r>
+        <w:rPr>
+          <w:rFonts w:ascii="Times New Roman" w:hAnsi="Times New Roman" w:cs="Times New Roman"/>
+          <w:sz w:val="28"/>
+          <w:szCs w:val="28"/>
+        </w:rPr>
+        <w:t>".</w:t>
+      </w:r>
+    </w:p>
+    <w:p>
+      <w:pPr>
+        <w:jc w:val="both"/>
+        <w:rPr>
+          <w:rFonts w:ascii="Times New Roman" w:hAnsi="Times New Roman" w:cs="Times New Roman"/>
+          <w:sz w:val="28"/>
+          <w:szCs w:val="28"/>
+        </w:rPr>
+      </w:pPr>
+      <w:proofErr w:type="spellStart"/>
+      <w:r>
+        <w:rPr>
+          <w:rFonts w:ascii="Times New Roman" w:hAnsi="Times New Roman" w:cs="Times New Roman"/>
+          <w:sz w:val="28"/>
+          <w:szCs w:val="28"/>
+        </w:rPr>
+        <w:t>importer</w:t>
+      </w:r>
+      <w:proofErr w:type="spellEnd"/>
+      <w:r>
+        <w:rPr>
+          <w:rFonts w:ascii="Times New Roman" w:hAnsi="Times New Roman" w:cs="Times New Roman"/>
+          <w:sz w:val="28"/>
+          <w:szCs w:val="28"/>
+        </w:rPr>
+        <w:t>:</w:t>
+      </w:r>
+    </w:p>
+    <w:p>
+      <w:pPr>
+        <w:jc w:val="both"/>
+        <w:rPr>
+          <w:rFonts w:ascii="Times New Roman" w:hAnsi="Times New Roman" w:cs="Times New Roman"/>
+          <w:sz w:val="28"/>
+          <w:szCs w:val="28"/>
+        </w:rPr>
+      </w:pPr>
+      <w:r>
+        <w:rPr>
+          <w:rFonts w:ascii="Times New Roman" w:hAnsi="Times New Roman" w:cs="Times New Roman"/>
+          <w:sz w:val="28"/>
+          <w:szCs w:val="28"/>
+        </w:rPr>
+        <w:t xml:space="preserve">    </w:t>
+      </w:r>
+      <w:proofErr w:type="spellStart"/>
+      <w:r>
+        <w:rPr>
+          <w:rFonts w:ascii="Times New Roman" w:hAnsi="Times New Roman" w:cs="Times New Roman"/>
+          <w:sz w:val="28"/>
+          <w:szCs w:val="28"/>
+        </w:rPr>
+        <w:t>image</w:t>
+      </w:r>
+      <w:proofErr w:type="spellEnd"/>
+      <w:r>
+        <w:rPr>
+          <w:rFonts w:ascii="Times New Roman" w:hAnsi="Times New Roman" w:cs="Times New Roman"/>
+          <w:sz w:val="28"/>
+          <w:szCs w:val="28"/>
+        </w:rPr>
         <w:t xml:space="preserve">: </w:t>
       </w:r>
       <w:proofErr w:type="spellStart"/>
@@ -5874,109 +6051,19 @@
           <w:sz w:val="28"/>
           <w:szCs w:val="28"/>
         </w:rPr>
-        <w:t>echo</w:t>
-      </w:r>
-      <w:proofErr w:type="spellEnd"/>
-      <w:r>
-        <w:rPr>
-          <w:rFonts w:ascii="Times New Roman" w:hAnsi="Times New Roman" w:cs="Times New Roman"/>
-          <w:sz w:val="28"/>
-          <w:szCs w:val="28"/>
-        </w:rPr>
-        <w:t xml:space="preserve"> "</w:t>
-      </w:r>
-      <w:proofErr w:type="spellStart"/>
-      <w:r>
-        <w:rPr>
-          <w:rFonts w:ascii="Times New Roman" w:hAnsi="Times New Roman" w:cs="Times New Roman"/>
-          <w:sz w:val="28"/>
-          <w:szCs w:val="28"/>
-        </w:rPr>
-        <w:t>Disabled</w:t>
-      </w:r>
-      <w:proofErr w:type="spellEnd"/>
-      <w:r>
-        <w:rPr>
-          <w:rFonts w:ascii="Times New Roman" w:hAnsi="Times New Roman" w:cs="Times New Roman"/>
-          <w:sz w:val="28"/>
-          <w:szCs w:val="28"/>
-        </w:rPr>
-        <w:t>".</w:t>
-      </w:r>
-    </w:p>
-    <w:p>
-      <w:pPr>
-        <w:jc w:val="both"/>
-        <w:rPr>
-          <w:rFonts w:ascii="Times New Roman" w:hAnsi="Times New Roman" w:cs="Times New Roman"/>
-          <w:sz w:val="28"/>
-          <w:szCs w:val="28"/>
-        </w:rPr>
-      </w:pPr>
-      <w:proofErr w:type="spellStart"/>
-      <w:r>
-        <w:rPr>
-          <w:rFonts w:ascii="Times New Roman" w:hAnsi="Times New Roman" w:cs="Times New Roman"/>
-          <w:sz w:val="28"/>
-          <w:szCs w:val="28"/>
-        </w:rPr>
-        <w:t>importer</w:t>
-      </w:r>
-      <w:proofErr w:type="spellEnd"/>
-      <w:r>
-        <w:rPr>
-          <w:rFonts w:ascii="Times New Roman" w:hAnsi="Times New Roman" w:cs="Times New Roman"/>
-          <w:sz w:val="28"/>
-          <w:szCs w:val="28"/>
-        </w:rPr>
-        <w:t>:</w:t>
-      </w:r>
-    </w:p>
-    <w:p>
-      <w:pPr>
-        <w:jc w:val="both"/>
-        <w:rPr>
-          <w:rFonts w:ascii="Times New Roman" w:hAnsi="Times New Roman" w:cs="Times New Roman"/>
-          <w:sz w:val="28"/>
-          <w:szCs w:val="28"/>
-        </w:rPr>
-      </w:pPr>
-      <w:r>
-        <w:rPr>
-          <w:rFonts w:ascii="Times New Roman" w:hAnsi="Times New Roman" w:cs="Times New Roman"/>
-          <w:sz w:val="28"/>
-          <w:szCs w:val="28"/>
-        </w:rPr>
-        <w:t xml:space="preserve">    </w:t>
-      </w:r>
-      <w:proofErr w:type="spellStart"/>
-      <w:r>
-        <w:rPr>
-          <w:rFonts w:ascii="Times New Roman" w:hAnsi="Times New Roman" w:cs="Times New Roman"/>
-          <w:sz w:val="28"/>
-          <w:szCs w:val="28"/>
-        </w:rPr>
-        <w:t>image</w:t>
-      </w:r>
-      <w:proofErr w:type="spellEnd"/>
-      <w:r>
-        <w:rPr>
-          <w:rFonts w:ascii="Times New Roman" w:hAnsi="Times New Roman" w:cs="Times New Roman"/>
-          <w:sz w:val="28"/>
-          <w:szCs w:val="28"/>
-        </w:rPr>
-        <w:t xml:space="preserve">: </w:t>
-      </w:r>
-      <w:proofErr w:type="spellStart"/>
-      <w:r>
-        <w:rPr>
-          <w:rFonts w:ascii="Times New Roman" w:hAnsi="Times New Roman" w:cs="Times New Roman"/>
-          <w:sz w:val="28"/>
-          <w:szCs w:val="28"/>
-        </w:rPr>
-        <w:t>donor-importer:latest</w:t>
-      </w:r>
-      <w:proofErr w:type="spellEnd"/>
+        <w:t>donor-</w:t>
+      </w:r>
+      <w:proofErr w:type="gramStart"/>
+      <w:r>
+        <w:rPr>
+          <w:rFonts w:ascii="Times New Roman" w:hAnsi="Times New Roman" w:cs="Times New Roman"/>
+          <w:sz w:val="28"/>
+          <w:szCs w:val="28"/>
+        </w:rPr>
+        <w:t>importer:latest</w:t>
+      </w:r>
+      <w:proofErr w:type="spellEnd"/>
+      <w:proofErr w:type="gramEnd"/>
     </w:p>
     <w:p>
       <w:pPr>
@@ -6838,6 +6925,7 @@
         </w:rPr>
       </w:pPr>
       <w:proofErr w:type="spellStart"/>
+      <w:proofErr w:type="gramStart"/>
       <w:r>
         <w:rPr>
           <w:rFonts w:ascii="Times New Roman" w:hAnsi="Times New Roman" w:cs="Times New Roman"/>
@@ -6862,7 +6950,25 @@
           <w:sz w:val="28"/>
           <w:szCs w:val="28"/>
         </w:rPr>
-        <w:t>env.example</w:t>
+        <w:t>env</w:t>
+      </w:r>
+      <w:proofErr w:type="gramEnd"/>
+      <w:r>
+        <w:rPr>
+          <w:rFonts w:ascii="Times New Roman" w:hAnsi="Times New Roman" w:cs="Times New Roman"/>
+          <w:sz w:val="28"/>
+          <w:szCs w:val="28"/>
+        </w:rPr>
+        <w:t>.</w:t>
+      </w:r>
+      <w:proofErr w:type="gramStart"/>
+      <w:r>
+        <w:rPr>
+          <w:rFonts w:ascii="Times New Roman" w:hAnsi="Times New Roman" w:cs="Times New Roman"/>
+          <w:sz w:val="28"/>
+          <w:szCs w:val="28"/>
+        </w:rPr>
+        <w:t>example</w:t>
       </w:r>
       <w:proofErr w:type="spellEnd"/>
       <w:r>
@@ -6883,17 +6989,19 @@
         <w:t>env</w:t>
       </w:r>
       <w:proofErr w:type="spellEnd"/>
-    </w:p>
-    <w:p>
-      <w:pPr>
-        <w:jc w:val="both"/>
-        <w:rPr>
-          <w:rFonts w:ascii="Times New Roman" w:hAnsi="Times New Roman" w:cs="Times New Roman"/>
-          <w:sz w:val="28"/>
-          <w:szCs w:val="28"/>
-        </w:rPr>
-      </w:pPr>
-      <w:proofErr w:type="spellStart"/>
+      <w:proofErr w:type="gramEnd"/>
+    </w:p>
+    <w:p>
+      <w:pPr>
+        <w:jc w:val="both"/>
+        <w:rPr>
+          <w:rFonts w:ascii="Times New Roman" w:hAnsi="Times New Roman" w:cs="Times New Roman"/>
+          <w:sz w:val="28"/>
+          <w:szCs w:val="28"/>
+        </w:rPr>
+      </w:pPr>
+      <w:proofErr w:type="spellStart"/>
+      <w:proofErr w:type="gramStart"/>
       <w:r>
         <w:rPr>
           <w:rFonts w:ascii="Times New Roman" w:hAnsi="Times New Roman" w:cs="Times New Roman"/>
@@ -6921,6 +7029,7 @@
         <w:t>env</w:t>
       </w:r>
       <w:proofErr w:type="spellEnd"/>
+      <w:proofErr w:type="gramEnd"/>
     </w:p>
     <w:p>
       <w:pPr>
@@ -12070,9 +12179,19 @@
           <w:sz w:val="28"/>
           <w:szCs w:val="28"/>
         </w:rPr>
-        <w:t>donor-backend:latest</w:t>
-      </w:r>
-      <w:proofErr w:type="spellEnd"/>
+        <w:t>donor-</w:t>
+      </w:r>
+      <w:proofErr w:type="gramStart"/>
+      <w:r>
+        <w:rPr>
+          <w:rFonts w:ascii="Times New Roman" w:hAnsi="Times New Roman" w:cs="Times New Roman"/>
+          <w:sz w:val="28"/>
+          <w:szCs w:val="28"/>
+        </w:rPr>
+        <w:t>backend:latest</w:t>
+      </w:r>
+      <w:proofErr w:type="spellEnd"/>
+      <w:proofErr w:type="gramEnd"/>
       <w:r>
         <w:rPr>
           <w:rFonts w:ascii="Times New Roman" w:hAnsi="Times New Roman" w:cs="Times New Roman"/>
@@ -12835,6 +12954,7 @@
         <w:t xml:space="preserve">2&gt; SELECT TOP 5 [Идентификатор], [Название] FROM </w:t>
       </w:r>
       <w:proofErr w:type="spellStart"/>
+      <w:proofErr w:type="gramStart"/>
       <w:r>
         <w:rPr>
           <w:rFonts w:ascii="Times New Roman" w:hAnsi="Times New Roman" w:cs="Times New Roman"/>
@@ -12850,7 +12970,16 @@
           <w:sz w:val="28"/>
           <w:szCs w:val="28"/>
         </w:rPr>
-        <w:t>.[Оконечное оборудование];</w:t>
+        <w:t>.[</w:t>
+      </w:r>
+      <w:proofErr w:type="gramEnd"/>
+      <w:r>
+        <w:rPr>
+          <w:rFonts w:ascii="Times New Roman" w:hAnsi="Times New Roman" w:cs="Times New Roman"/>
+          <w:sz w:val="28"/>
+          <w:szCs w:val="28"/>
+        </w:rPr>
+        <w:t>Оконечное оборудование];</w:t>
       </w:r>
     </w:p>
     <w:p>
@@ -13194,6 +13323,7 @@
         <w:t xml:space="preserve"> FROM </w:t>
       </w:r>
       <w:proofErr w:type="spellStart"/>
+      <w:proofErr w:type="gramStart"/>
       <w:r>
         <w:rPr>
           <w:rFonts w:ascii="Times New Roman" w:hAnsi="Times New Roman" w:cs="Times New Roman"/>
@@ -13203,6 +13333,7 @@
         <w:t>sys.databases</w:t>
       </w:r>
       <w:proofErr w:type="spellEnd"/>
+      <w:proofErr w:type="gramEnd"/>
       <w:r>
         <w:rPr>
           <w:rFonts w:ascii="Times New Roman" w:hAnsi="Times New Roman" w:cs="Times New Roman"/>
@@ -13227,7 +13358,25 @@
           <w:sz w:val="28"/>
           <w:szCs w:val="28"/>
         </w:rPr>
-        <w:t xml:space="preserve"> = DB_NAME();</w:t>
+        <w:t xml:space="preserve"> = DB_</w:t>
+      </w:r>
+      <w:proofErr w:type="gramStart"/>
+      <w:r>
+        <w:rPr>
+          <w:rFonts w:ascii="Times New Roman" w:hAnsi="Times New Roman" w:cs="Times New Roman"/>
+          <w:sz w:val="28"/>
+          <w:szCs w:val="28"/>
+        </w:rPr>
+        <w:t>NAME(</w:t>
+      </w:r>
+      <w:proofErr w:type="gramEnd"/>
+      <w:r>
+        <w:rPr>
+          <w:rFonts w:ascii="Times New Roman" w:hAnsi="Times New Roman" w:cs="Times New Roman"/>
+          <w:sz w:val="28"/>
+          <w:szCs w:val="28"/>
+        </w:rPr>
+        <w:t>);</w:t>
       </w:r>
     </w:p>
     <w:p>
@@ -13539,6 +13688,7 @@
         <w:t xml:space="preserve"> '</w:t>
       </w:r>
       <w:proofErr w:type="spellStart"/>
+      <w:proofErr w:type="gramStart"/>
       <w:r>
         <w:rPr>
           <w:rFonts w:ascii="Times New Roman" w:hAnsi="Times New Roman" w:cs="Times New Roman"/>
@@ -13548,6 +13698,7 @@
         <w:t>dbo.ИмяТаблицы</w:t>
       </w:r>
       <w:proofErr w:type="spellEnd"/>
+      <w:proofErr w:type="gramEnd"/>
       <w:r>
         <w:rPr>
           <w:rFonts w:ascii="Times New Roman" w:hAnsi="Times New Roman" w:cs="Times New Roman"/>
@@ -13611,6 +13762,7 @@
         <w:t xml:space="preserve"> '</w:t>
       </w:r>
       <w:proofErr w:type="spellStart"/>
+      <w:proofErr w:type="gramStart"/>
       <w:r>
         <w:rPr>
           <w:rFonts w:ascii="Times New Roman" w:hAnsi="Times New Roman" w:cs="Times New Roman"/>
@@ -13620,6 +13772,7 @@
         <w:t>dbo.Asset</w:t>
       </w:r>
       <w:proofErr w:type="spellEnd"/>
+      <w:proofErr w:type="gramEnd"/>
       <w:r>
         <w:rPr>
           <w:rFonts w:ascii="Times New Roman" w:hAnsi="Times New Roman" w:cs="Times New Roman"/>
@@ -13929,9 +14082,19 @@
           <w:sz w:val="28"/>
           <w:szCs w:val="28"/>
         </w:rPr>
-        <w:t>Ключ пользователя: Правда ли, что a.[</w:t>
-      </w:r>
-      <w:proofErr w:type="spellStart"/>
+        <w:t>Ключ пользователя: Правда ли, что </w:t>
+      </w:r>
+      <w:proofErr w:type="gramStart"/>
+      <w:r>
+        <w:rPr>
+          <w:rFonts w:ascii="Times New Roman" w:hAnsi="Times New Roman" w:cs="Times New Roman"/>
+          <w:sz w:val="28"/>
+          <w:szCs w:val="28"/>
+        </w:rPr>
+        <w:t>a.[</w:t>
+      </w:r>
+      <w:proofErr w:type="spellStart"/>
+      <w:proofErr w:type="gramEnd"/>
       <w:r>
         <w:rPr>
           <w:rFonts w:ascii="Times New Roman" w:hAnsi="Times New Roman" w:cs="Times New Roman"/>
@@ -13947,9 +14110,19 @@
           <w:sz w:val="28"/>
           <w:szCs w:val="28"/>
         </w:rPr>
-        <w:t>] ссылается на u.[</w:t>
-      </w:r>
-      <w:proofErr w:type="spellStart"/>
+        <w:t>] ссылается на </w:t>
+      </w:r>
+      <w:proofErr w:type="gramStart"/>
+      <w:r>
+        <w:rPr>
+          <w:rFonts w:ascii="Times New Roman" w:hAnsi="Times New Roman" w:cs="Times New Roman"/>
+          <w:sz w:val="28"/>
+          <w:szCs w:val="28"/>
+        </w:rPr>
+        <w:t>u.[</w:t>
+      </w:r>
+      <w:proofErr w:type="spellStart"/>
+      <w:proofErr w:type="gramEnd"/>
       <w:r>
         <w:rPr>
           <w:rFonts w:ascii="Times New Roman" w:hAnsi="Times New Roman" w:cs="Times New Roman"/>
@@ -13965,7 +14138,25 @@
           <w:sz w:val="28"/>
           <w:szCs w:val="28"/>
         </w:rPr>
-        <w:t>], а не на u.[Идентификатор]?</w:t>
+        <w:t>], а не на </w:t>
+      </w:r>
+      <w:proofErr w:type="gramStart"/>
+      <w:r>
+        <w:rPr>
+          <w:rFonts w:ascii="Times New Roman" w:hAnsi="Times New Roman" w:cs="Times New Roman"/>
+          <w:sz w:val="28"/>
+          <w:szCs w:val="28"/>
+        </w:rPr>
+        <w:t>u.[</w:t>
+      </w:r>
+      <w:proofErr w:type="gramEnd"/>
+      <w:r>
+        <w:rPr>
+          <w:rFonts w:ascii="Times New Roman" w:hAnsi="Times New Roman" w:cs="Times New Roman"/>
+          <w:sz w:val="28"/>
+          <w:szCs w:val="28"/>
+        </w:rPr>
+        <w:t>Идентификатор]?</w:t>
       </w:r>
     </w:p>
     <w:p>
@@ -14021,6 +14212,7 @@
         <w:t xml:space="preserve">], [Фамилия] FROM </w:t>
       </w:r>
       <w:proofErr w:type="spellStart"/>
+      <w:proofErr w:type="gramStart"/>
       <w:r>
         <w:rPr>
           <w:rFonts w:ascii="Times New Roman" w:hAnsi="Times New Roman" w:cs="Times New Roman"/>
@@ -14036,7 +14228,16 @@
           <w:sz w:val="28"/>
           <w:szCs w:val="28"/>
         </w:rPr>
-        <w:t>.[Пользователи] WHERE [</w:t>
+        <w:t>.[</w:t>
+      </w:r>
+      <w:proofErr w:type="gramEnd"/>
+      <w:r>
+        <w:rPr>
+          <w:rFonts w:ascii="Times New Roman" w:hAnsi="Times New Roman" w:cs="Times New Roman"/>
+          <w:sz w:val="28"/>
+          <w:szCs w:val="28"/>
+        </w:rPr>
+        <w:t>Пользователи] WHERE [</w:t>
       </w:r>
       <w:proofErr w:type="spellStart"/>
       <w:r>
@@ -14131,6 +14332,7 @@
         <w:t xml:space="preserve">] FROM </w:t>
       </w:r>
       <w:proofErr w:type="spellStart"/>
+      <w:proofErr w:type="gramStart"/>
       <w:r>
         <w:rPr>
           <w:rFonts w:ascii="Times New Roman" w:hAnsi="Times New Roman" w:cs="Times New Roman"/>
@@ -14146,7 +14348,16 @@
           <w:sz w:val="28"/>
           <w:szCs w:val="28"/>
         </w:rPr>
-        <w:t>.[Asset] WHERE[</w:t>
+        <w:t>.[</w:t>
+      </w:r>
+      <w:proofErr w:type="gramEnd"/>
+      <w:r>
+        <w:rPr>
+          <w:rFonts w:ascii="Times New Roman" w:hAnsi="Times New Roman" w:cs="Times New Roman"/>
+          <w:sz w:val="28"/>
+          <w:szCs w:val="28"/>
+        </w:rPr>
+        <w:t>Asset] WHERE[</w:t>
       </w:r>
       <w:proofErr w:type="spellStart"/>
       <w:r>
@@ -14361,9 +14572,28 @@
           <w:sz w:val="28"/>
           <w:szCs w:val="28"/>
         </w:rPr>
-        <w:t xml:space="preserve">], COUNT(*) FROM </w:t>
-      </w:r>
-      <w:proofErr w:type="spellStart"/>
+        <w:t xml:space="preserve">], </w:t>
+      </w:r>
+      <w:proofErr w:type="gramStart"/>
+      <w:r>
+        <w:rPr>
+          <w:rFonts w:ascii="Times New Roman" w:hAnsi="Times New Roman" w:cs="Times New Roman"/>
+          <w:sz w:val="28"/>
+          <w:szCs w:val="28"/>
+        </w:rPr>
+        <w:t>COUNT(</w:t>
+      </w:r>
+      <w:proofErr w:type="gramEnd"/>
+      <w:r>
+        <w:rPr>
+          <w:rFonts w:ascii="Times New Roman" w:hAnsi="Times New Roman" w:cs="Times New Roman"/>
+          <w:sz w:val="28"/>
+          <w:szCs w:val="28"/>
+        </w:rPr>
+        <w:t xml:space="preserve">*) FROM </w:t>
+      </w:r>
+      <w:proofErr w:type="spellStart"/>
+      <w:proofErr w:type="gramStart"/>
       <w:r>
         <w:rPr>
           <w:rFonts w:ascii="Times New Roman" w:hAnsi="Times New Roman" w:cs="Times New Roman"/>
@@ -14379,7 +14609,16 @@
           <w:sz w:val="28"/>
           <w:szCs w:val="28"/>
         </w:rPr>
-        <w:t>.[Asset] GROUP BY[</w:t>
+        <w:t>.[</w:t>
+      </w:r>
+      <w:proofErr w:type="gramEnd"/>
+      <w:r>
+        <w:rPr>
+          <w:rFonts w:ascii="Times New Roman" w:hAnsi="Times New Roman" w:cs="Times New Roman"/>
+          <w:sz w:val="28"/>
+          <w:szCs w:val="28"/>
+        </w:rPr>
+        <w:t>Asset] GROUP BY[</w:t>
       </w:r>
       <w:proofErr w:type="spellStart"/>
       <w:r>
@@ -14630,6 +14869,7 @@
         <w:t xml:space="preserve">SELECT TOP 10 [ID], [Name] FROM </w:t>
       </w:r>
       <w:proofErr w:type="spellStart"/>
+      <w:proofErr w:type="gramStart"/>
       <w:r>
         <w:rPr>
           <w:rFonts w:ascii="Times New Roman" w:hAnsi="Times New Roman" w:cs="Times New Roman"/>
@@ -14648,6 +14888,7 @@
         <w:t>.[</w:t>
       </w:r>
       <w:proofErr w:type="spellStart"/>
+      <w:proofErr w:type="gramEnd"/>
       <w:r>
         <w:rPr>
           <w:rFonts w:ascii="Times New Roman" w:hAnsi="Times New Roman" w:cs="Times New Roman"/>
@@ -14757,9 +14998,28 @@
           <w:sz w:val="28"/>
           <w:szCs w:val="28"/>
         </w:rPr>
-        <w:t xml:space="preserve">SELECT COUNT(*) FROM </w:t>
-      </w:r>
-      <w:proofErr w:type="spellStart"/>
+        <w:t xml:space="preserve">SELECT </w:t>
+      </w:r>
+      <w:proofErr w:type="gramStart"/>
+      <w:r>
+        <w:rPr>
+          <w:rFonts w:ascii="Times New Roman" w:hAnsi="Times New Roman" w:cs="Times New Roman"/>
+          <w:sz w:val="28"/>
+          <w:szCs w:val="28"/>
+        </w:rPr>
+        <w:t>COUNT(</w:t>
+      </w:r>
+      <w:proofErr w:type="gramEnd"/>
+      <w:r>
+        <w:rPr>
+          <w:rFonts w:ascii="Times New Roman" w:hAnsi="Times New Roman" w:cs="Times New Roman"/>
+          <w:sz w:val="28"/>
+          <w:szCs w:val="28"/>
+        </w:rPr>
+        <w:t xml:space="preserve">*) FROM </w:t>
+      </w:r>
+      <w:proofErr w:type="spellStart"/>
+      <w:proofErr w:type="gramStart"/>
       <w:r>
         <w:rPr>
           <w:rFonts w:ascii="Times New Roman" w:hAnsi="Times New Roman" w:cs="Times New Roman"/>
@@ -14775,7 +15035,16 @@
           <w:sz w:val="28"/>
           <w:szCs w:val="28"/>
         </w:rPr>
-        <w:t>.[Оконечное оборудование] WHERE [ИД комнаты] IS NULL AND [ИД рабочего места] IS NULL;</w:t>
+        <w:t>.[</w:t>
+      </w:r>
+      <w:proofErr w:type="gramEnd"/>
+      <w:r>
+        <w:rPr>
+          <w:rFonts w:ascii="Times New Roman" w:hAnsi="Times New Roman" w:cs="Times New Roman"/>
+          <w:sz w:val="28"/>
+          <w:szCs w:val="28"/>
+        </w:rPr>
+        <w:t>Оконечное оборудование] WHERE [ИД комнаты] IS NULL AND [ИД рабочего места] IS NULL;</w:t>
       </w:r>
     </w:p>
     <w:p>
@@ -14947,6 +15216,7 @@
         <w:t>рать </w:t>
       </w:r>
       <w:proofErr w:type="spellStart"/>
+      <w:proofErr w:type="gramStart"/>
       <w:r>
         <w:rPr>
           <w:rFonts w:ascii="Times New Roman" w:hAnsi="Times New Roman" w:cs="Times New Roman"/>
@@ -14962,9 +15232,19 @@
           <w:sz w:val="28"/>
           <w:szCs w:val="28"/>
         </w:rPr>
-        <w:t>.[Name] или </w:t>
-      </w:r>
-      <w:proofErr w:type="spellStart"/>
+        <w:t>.[</w:t>
+      </w:r>
+      <w:proofErr w:type="gramEnd"/>
+      <w:r>
+        <w:rPr>
+          <w:rFonts w:ascii="Times New Roman" w:hAnsi="Times New Roman" w:cs="Times New Roman"/>
+          <w:sz w:val="28"/>
+          <w:szCs w:val="28"/>
+        </w:rPr>
+        <w:t>Name] или </w:t>
+      </w:r>
+      <w:proofErr w:type="spellStart"/>
+      <w:proofErr w:type="gramStart"/>
       <w:r>
         <w:rPr>
           <w:rFonts w:ascii="Times New Roman" w:hAnsi="Times New Roman" w:cs="Times New Roman"/>
@@ -14980,7 +15260,16 @@
           <w:sz w:val="28"/>
           <w:szCs w:val="28"/>
         </w:rPr>
-        <w:t>.[Name] (из типа). Посмотр</w:t>
+        <w:t>.[</w:t>
+      </w:r>
+      <w:proofErr w:type="gramEnd"/>
+      <w:r>
+        <w:rPr>
+          <w:rFonts w:ascii="Times New Roman" w:hAnsi="Times New Roman" w:cs="Times New Roman"/>
+          <w:sz w:val="28"/>
+          <w:szCs w:val="28"/>
+        </w:rPr>
+        <w:t>Name] (из типа). Посмотр</w:t>
       </w:r>
       <w:r>
         <w:rPr>
@@ -15017,6 +15306,7 @@
         <w:t xml:space="preserve">SELECT TOP 10 </w:t>
       </w:r>
       <w:proofErr w:type="spellStart"/>
+      <w:proofErr w:type="gramStart"/>
       <w:r>
         <w:rPr>
           <w:rFonts w:ascii="Times New Roman" w:hAnsi="Times New Roman" w:cs="Times New Roman"/>
@@ -15032,7 +15322,16 @@
           <w:sz w:val="28"/>
           <w:szCs w:val="28"/>
         </w:rPr>
-        <w:t xml:space="preserve">.[Name] AS </w:t>
+        <w:t>.[</w:t>
+      </w:r>
+      <w:proofErr w:type="gramEnd"/>
+      <w:r>
+        <w:rPr>
+          <w:rFonts w:ascii="Times New Roman" w:hAnsi="Times New Roman" w:cs="Times New Roman"/>
+          <w:sz w:val="28"/>
+          <w:szCs w:val="28"/>
+        </w:rPr>
+        <w:t xml:space="preserve">Name] AS </w:t>
       </w:r>
       <w:proofErr w:type="spellStart"/>
       <w:r>
@@ -15053,6 +15352,7 @@
         <w:t xml:space="preserve">, </w:t>
       </w:r>
       <w:proofErr w:type="spellStart"/>
+      <w:proofErr w:type="gramStart"/>
       <w:r>
         <w:rPr>
           <w:rFonts w:ascii="Times New Roman" w:hAnsi="Times New Roman" w:cs="Times New Roman"/>
@@ -15068,7 +15368,16 @@
           <w:sz w:val="28"/>
           <w:szCs w:val="28"/>
         </w:rPr>
-        <w:t xml:space="preserve">.[Name] AS </w:t>
+        <w:t>.[</w:t>
+      </w:r>
+      <w:proofErr w:type="gramEnd"/>
+      <w:r>
+        <w:rPr>
+          <w:rFonts w:ascii="Times New Roman" w:hAnsi="Times New Roman" w:cs="Times New Roman"/>
+          <w:sz w:val="28"/>
+          <w:szCs w:val="28"/>
+        </w:rPr>
+        <w:t xml:space="preserve">Name] AS </w:t>
       </w:r>
       <w:proofErr w:type="spellStart"/>
       <w:r>
@@ -15089,6 +15398,7 @@
         <w:t xml:space="preserve">, </w:t>
       </w:r>
       <w:proofErr w:type="spellStart"/>
+      <w:proofErr w:type="gramStart"/>
       <w:r>
         <w:rPr>
           <w:rFonts w:ascii="Times New Roman" w:hAnsi="Times New Roman" w:cs="Times New Roman"/>
@@ -15107,6 +15417,7 @@
         <w:t>.[</w:t>
       </w:r>
       <w:proofErr w:type="spellStart"/>
+      <w:proofErr w:type="gramEnd"/>
       <w:r>
         <w:rPr>
           <w:rFonts w:ascii="Times New Roman" w:hAnsi="Times New Roman" w:cs="Times New Roman"/>
@@ -15143,6 +15454,7 @@
         <w:t xml:space="preserve">FROM </w:t>
       </w:r>
       <w:proofErr w:type="spellStart"/>
+      <w:proofErr w:type="gramStart"/>
       <w:r>
         <w:rPr>
           <w:rFonts w:ascii="Times New Roman" w:hAnsi="Times New Roman" w:cs="Times New Roman"/>
@@ -15161,6 +15473,7 @@
         <w:t>.[</w:t>
       </w:r>
       <w:proofErr w:type="spellStart"/>
+      <w:proofErr w:type="gramEnd"/>
       <w:r>
         <w:rPr>
           <w:rFonts w:ascii="Times New Roman" w:hAnsi="Times New Roman" w:cs="Times New Roman"/>
@@ -15215,6 +15528,7 @@
         <w:t xml:space="preserve">JOIN </w:t>
       </w:r>
       <w:proofErr w:type="spellStart"/>
+      <w:proofErr w:type="gramStart"/>
       <w:r>
         <w:rPr>
           <w:rFonts w:ascii="Times New Roman" w:hAnsi="Times New Roman" w:cs="Times New Roman"/>
@@ -15233,6 +15547,7 @@
         <w:t>.[</w:t>
       </w:r>
       <w:proofErr w:type="spellStart"/>
+      <w:proofErr w:type="gramEnd"/>
       <w:r>
         <w:rPr>
           <w:rFonts w:ascii="Times New Roman" w:hAnsi="Times New Roman" w:cs="Times New Roman"/>
@@ -15269,6 +15584,7 @@
         <w:t xml:space="preserve"> ON </w:t>
       </w:r>
       <w:proofErr w:type="spellStart"/>
+      <w:proofErr w:type="gramStart"/>
       <w:r>
         <w:rPr>
           <w:rFonts w:ascii="Times New Roman" w:hAnsi="Times New Roman" w:cs="Times New Roman"/>
@@ -15287,6 +15603,7 @@
         <w:t>.[</w:t>
       </w:r>
       <w:proofErr w:type="spellStart"/>
+      <w:proofErr w:type="gramEnd"/>
       <w:r>
         <w:rPr>
           <w:rFonts w:ascii="Times New Roman" w:hAnsi="Times New Roman" w:cs="Times New Roman"/>
@@ -15305,6 +15622,7 @@
         <w:t xml:space="preserve">] = </w:t>
       </w:r>
       <w:proofErr w:type="spellStart"/>
+      <w:proofErr w:type="gramStart"/>
       <w:r>
         <w:rPr>
           <w:rFonts w:ascii="Times New Roman" w:hAnsi="Times New Roman" w:cs="Times New Roman"/>
@@ -15323,6 +15641,7 @@
         <w:t>.[</w:t>
       </w:r>
       <w:proofErr w:type="spellStart"/>
+      <w:proofErr w:type="gramEnd"/>
       <w:r>
         <w:rPr>
           <w:rFonts w:ascii="Times New Roman" w:hAnsi="Times New Roman" w:cs="Times New Roman"/>
@@ -15395,6 +15714,7 @@
         <w:t>Где реально лежит производитель детали? В </w:t>
       </w:r>
       <w:proofErr w:type="spellStart"/>
+      <w:proofErr w:type="gramStart"/>
       <w:r>
         <w:rPr>
           <w:rFonts w:ascii="Times New Roman" w:hAnsi="Times New Roman" w:cs="Times New Roman"/>
@@ -15413,6 +15733,7 @@
         <w:t>.[</w:t>
       </w:r>
       <w:proofErr w:type="spellStart"/>
+      <w:proofErr w:type="gramEnd"/>
       <w:r>
         <w:rPr>
           <w:rFonts w:ascii="Times New Roman" w:hAnsi="Times New Roman" w:cs="Times New Roman"/>
@@ -15539,6 +15860,7 @@
         <w:t xml:space="preserve">SELECT [ID], [Name] FROM </w:t>
       </w:r>
       <w:proofErr w:type="spellStart"/>
+      <w:proofErr w:type="gramStart"/>
       <w:r>
         <w:rPr>
           <w:rFonts w:ascii="Times New Roman" w:hAnsi="Times New Roman" w:cs="Times New Roman"/>
@@ -15559,6 +15881,7 @@
         <w:t>.[</w:t>
       </w:r>
       <w:proofErr w:type="spellStart"/>
+      <w:proofErr w:type="gramEnd"/>
       <w:r>
         <w:rPr>
           <w:rFonts w:ascii="Times New Roman" w:hAnsi="Times New Roman" w:cs="Times New Roman"/>
@@ -15693,6 +16016,7 @@
         </w:rPr>
       </w:pPr>
       <w:proofErr w:type="spellStart"/>
+      <w:proofErr w:type="gramStart"/>
       <w:r>
         <w:rPr>
           <w:rFonts w:ascii="Times New Roman" w:hAnsi="Times New Roman" w:cs="Times New Roman"/>
@@ -15712,7 +16036,18 @@
           <w:sz w:val="28"/>
           <w:szCs w:val="28"/>
         </w:rPr>
-        <w:t>.[Оконечное оборудование]</w:t>
+        <w:t>.[</w:t>
+      </w:r>
+      <w:proofErr w:type="gramEnd"/>
+      <w:r>
+        <w:rPr>
+          <w:rFonts w:ascii="Times New Roman" w:hAnsi="Times New Roman" w:cs="Times New Roman"/>
+          <w:b/>
+          <w:bCs/>
+          <w:sz w:val="28"/>
+          <w:szCs w:val="28"/>
+        </w:rPr>
+        <w:t>Оконечное оборудование]</w:t>
       </w:r>
       <w:r>
         <w:rPr>
@@ -15927,6 +16262,7 @@
         </w:rPr>
       </w:pPr>
       <w:proofErr w:type="spellStart"/>
+      <w:proofErr w:type="gramStart"/>
       <w:r>
         <w:rPr>
           <w:rFonts w:ascii="Times New Roman" w:hAnsi="Times New Roman" w:cs="Times New Roman"/>
@@ -15946,7 +16282,18 @@
           <w:sz w:val="28"/>
           <w:szCs w:val="28"/>
         </w:rPr>
-        <w:t>.[Asset]</w:t>
+        <w:t>.[</w:t>
+      </w:r>
+      <w:proofErr w:type="gramEnd"/>
+      <w:r>
+        <w:rPr>
+          <w:rFonts w:ascii="Times New Roman" w:hAnsi="Times New Roman" w:cs="Times New Roman"/>
+          <w:b/>
+          <w:bCs/>
+          <w:sz w:val="28"/>
+          <w:szCs w:val="28"/>
+        </w:rPr>
+        <w:t>Asset]</w:t>
       </w:r>
       <w:r>
         <w:rPr>
@@ -16246,6 +16593,7 @@
         </w:rPr>
       </w:pPr>
       <w:proofErr w:type="spellStart"/>
+      <w:proofErr w:type="gramStart"/>
       <w:r>
         <w:rPr>
           <w:rFonts w:ascii="Times New Roman" w:hAnsi="Times New Roman" w:cs="Times New Roman"/>
@@ -16268,6 +16616,7 @@
         <w:t>.[</w:t>
       </w:r>
       <w:proofErr w:type="spellStart"/>
+      <w:proofErr w:type="gramEnd"/>
       <w:r>
         <w:rPr>
           <w:rFonts w:ascii="Times New Roman" w:hAnsi="Times New Roman" w:cs="Times New Roman"/>
@@ -16378,6 +16727,7 @@
         </w:rPr>
       </w:pPr>
       <w:proofErr w:type="spellStart"/>
+      <w:proofErr w:type="gramStart"/>
       <w:r>
         <w:rPr>
           <w:rFonts w:ascii="Times New Roman" w:hAnsi="Times New Roman" w:cs="Times New Roman"/>
@@ -16397,7 +16747,18 @@
           <w:sz w:val="28"/>
           <w:szCs w:val="28"/>
         </w:rPr>
-        <w:t>.[Типы оконечного оборудования]</w:t>
+        <w:t>.[</w:t>
+      </w:r>
+      <w:proofErr w:type="gramEnd"/>
+      <w:r>
+        <w:rPr>
+          <w:rFonts w:ascii="Times New Roman" w:hAnsi="Times New Roman" w:cs="Times New Roman"/>
+          <w:b/>
+          <w:bCs/>
+          <w:sz w:val="28"/>
+          <w:szCs w:val="28"/>
+        </w:rPr>
+        <w:t>Типы оконечного оборудования]</w:t>
       </w:r>
       <w:r>
         <w:rPr>
@@ -16528,6 +16889,7 @@
         </w:rPr>
       </w:pPr>
       <w:proofErr w:type="spellStart"/>
+      <w:proofErr w:type="gramStart"/>
       <w:r>
         <w:rPr>
           <w:rFonts w:ascii="Times New Roman" w:hAnsi="Times New Roman" w:cs="Times New Roman"/>
@@ -16550,6 +16912,7 @@
         <w:t>.[</w:t>
       </w:r>
       <w:proofErr w:type="spellStart"/>
+      <w:proofErr w:type="gramEnd"/>
       <w:r>
         <w:rPr>
           <w:rFonts w:ascii="Times New Roman" w:hAnsi="Times New Roman" w:cs="Times New Roman"/>
@@ -16654,6 +17017,7 @@
         </w:rPr>
       </w:pPr>
       <w:proofErr w:type="spellStart"/>
+      <w:proofErr w:type="gramStart"/>
       <w:r>
         <w:rPr>
           <w:rFonts w:ascii="Times New Roman" w:hAnsi="Times New Roman" w:cs="Times New Roman"/>
@@ -16673,7 +17037,18 @@
           <w:sz w:val="28"/>
           <w:szCs w:val="28"/>
         </w:rPr>
-        <w:t>.[Производители]</w:t>
+        <w:t>.[</w:t>
+      </w:r>
+      <w:proofErr w:type="gramEnd"/>
+      <w:r>
+        <w:rPr>
+          <w:rFonts w:ascii="Times New Roman" w:hAnsi="Times New Roman" w:cs="Times New Roman"/>
+          <w:b/>
+          <w:bCs/>
+          <w:sz w:val="28"/>
+          <w:szCs w:val="28"/>
+        </w:rPr>
+        <w:t>Производители]</w:t>
       </w:r>
     </w:p>
     <w:p>
@@ -16756,6 +17131,7 @@
         </w:rPr>
       </w:pPr>
       <w:proofErr w:type="spellStart"/>
+      <w:proofErr w:type="gramStart"/>
       <w:r>
         <w:rPr>
           <w:rFonts w:ascii="Times New Roman" w:hAnsi="Times New Roman" w:cs="Times New Roman"/>
@@ -16775,7 +17151,18 @@
           <w:sz w:val="28"/>
           <w:szCs w:val="28"/>
         </w:rPr>
-        <w:t>.[Пользователи]</w:t>
+        <w:t>.[</w:t>
+      </w:r>
+      <w:proofErr w:type="gramEnd"/>
+      <w:r>
+        <w:rPr>
+          <w:rFonts w:ascii="Times New Roman" w:hAnsi="Times New Roman" w:cs="Times New Roman"/>
+          <w:b/>
+          <w:bCs/>
+          <w:sz w:val="28"/>
+          <w:szCs w:val="28"/>
+        </w:rPr>
+        <w:t>Пользователи]</w:t>
       </w:r>
     </w:p>
     <w:p>
@@ -16932,6 +17319,7 @@
         </w:rPr>
       </w:pPr>
       <w:proofErr w:type="spellStart"/>
+      <w:proofErr w:type="gramStart"/>
       <w:r>
         <w:rPr>
           <w:rFonts w:ascii="Times New Roman" w:hAnsi="Times New Roman" w:cs="Times New Roman"/>
@@ -16951,7 +17339,18 @@
           <w:sz w:val="28"/>
           <w:szCs w:val="28"/>
         </w:rPr>
-        <w:t>.[Подразделение]</w:t>
+        <w:t>.[</w:t>
+      </w:r>
+      <w:proofErr w:type="gramEnd"/>
+      <w:r>
+        <w:rPr>
+          <w:rFonts w:ascii="Times New Roman" w:hAnsi="Times New Roman" w:cs="Times New Roman"/>
+          <w:b/>
+          <w:bCs/>
+          <w:sz w:val="28"/>
+          <w:szCs w:val="28"/>
+        </w:rPr>
+        <w:t>Подразделение]</w:t>
       </w:r>
     </w:p>
     <w:p>
@@ -17012,6 +17411,7 @@
         </w:rPr>
       </w:pPr>
       <w:proofErr w:type="spellStart"/>
+      <w:proofErr w:type="gramStart"/>
       <w:r>
         <w:rPr>
           <w:rFonts w:ascii="Times New Roman" w:hAnsi="Times New Roman" w:cs="Times New Roman"/>
@@ -17031,7 +17431,18 @@
           <w:sz w:val="28"/>
           <w:szCs w:val="28"/>
         </w:rPr>
-        <w:t>.[Рабочее место]</w:t>
+        <w:t>.[</w:t>
+      </w:r>
+      <w:proofErr w:type="gramEnd"/>
+      <w:r>
+        <w:rPr>
+          <w:rFonts w:ascii="Times New Roman" w:hAnsi="Times New Roman" w:cs="Times New Roman"/>
+          <w:b/>
+          <w:bCs/>
+          <w:sz w:val="28"/>
+          <w:szCs w:val="28"/>
+        </w:rPr>
+        <w:t>Рабочее место]</w:t>
       </w:r>
     </w:p>
     <w:p>
@@ -17115,6 +17526,7 @@
         </w:rPr>
       </w:pPr>
       <w:proofErr w:type="spellStart"/>
+      <w:proofErr w:type="gramStart"/>
       <w:r>
         <w:rPr>
           <w:rFonts w:ascii="Times New Roman" w:hAnsi="Times New Roman" w:cs="Times New Roman"/>
@@ -17134,7 +17546,18 @@
           <w:sz w:val="28"/>
           <w:szCs w:val="28"/>
         </w:rPr>
-        <w:t>.[Комната]</w:t>
+        <w:t>.[</w:t>
+      </w:r>
+      <w:proofErr w:type="gramEnd"/>
+      <w:r>
+        <w:rPr>
+          <w:rFonts w:ascii="Times New Roman" w:hAnsi="Times New Roman" w:cs="Times New Roman"/>
+          <w:b/>
+          <w:bCs/>
+          <w:sz w:val="28"/>
+          <w:szCs w:val="28"/>
+        </w:rPr>
+        <w:t>Комната]</w:t>
       </w:r>
     </w:p>
     <w:p>
@@ -17217,6 +17640,7 @@
         </w:rPr>
       </w:pPr>
       <w:proofErr w:type="spellStart"/>
+      <w:proofErr w:type="gramStart"/>
       <w:r>
         <w:rPr>
           <w:rFonts w:ascii="Times New Roman" w:hAnsi="Times New Roman" w:cs="Times New Roman"/>
@@ -17236,7 +17660,18 @@
           <w:sz w:val="28"/>
           <w:szCs w:val="28"/>
         </w:rPr>
-        <w:t>.[Этаж]</w:t>
+        <w:t>.[</w:t>
+      </w:r>
+      <w:proofErr w:type="gramEnd"/>
+      <w:r>
+        <w:rPr>
+          <w:rFonts w:ascii="Times New Roman" w:hAnsi="Times New Roman" w:cs="Times New Roman"/>
+          <w:b/>
+          <w:bCs/>
+          <w:sz w:val="28"/>
+          <w:szCs w:val="28"/>
+        </w:rPr>
+        <w:t>Этаж]</w:t>
       </w:r>
     </w:p>
     <w:p>
@@ -17319,6 +17754,7 @@
         </w:rPr>
       </w:pPr>
       <w:proofErr w:type="spellStart"/>
+      <w:proofErr w:type="gramStart"/>
       <w:r>
         <w:rPr>
           <w:rFonts w:ascii="Times New Roman" w:hAnsi="Times New Roman" w:cs="Times New Roman"/>
@@ -17338,7 +17774,18 @@
           <w:sz w:val="28"/>
           <w:szCs w:val="28"/>
         </w:rPr>
-        <w:t>.[Здание]</w:t>
+        <w:t>.[</w:t>
+      </w:r>
+      <w:proofErr w:type="gramEnd"/>
+      <w:r>
+        <w:rPr>
+          <w:rFonts w:ascii="Times New Roman" w:hAnsi="Times New Roman" w:cs="Times New Roman"/>
+          <w:b/>
+          <w:bCs/>
+          <w:sz w:val="28"/>
+          <w:szCs w:val="28"/>
+        </w:rPr>
+        <w:t>Здание]</w:t>
       </w:r>
     </w:p>
     <w:p>
@@ -17421,6 +17868,7 @@
         </w:rPr>
       </w:pPr>
       <w:proofErr w:type="spellStart"/>
+      <w:proofErr w:type="gramStart"/>
       <w:r>
         <w:rPr>
           <w:rFonts w:ascii="Times New Roman" w:hAnsi="Times New Roman" w:cs="Times New Roman"/>
@@ -17443,6 +17891,7 @@
         <w:t>.[</w:t>
       </w:r>
       <w:proofErr w:type="spellStart"/>
+      <w:proofErr w:type="gramEnd"/>
       <w:r>
         <w:rPr>
           <w:rFonts w:ascii="Times New Roman" w:hAnsi="Times New Roman" w:cs="Times New Roman"/>
@@ -17685,6 +18134,7 @@
         </w:rPr>
       </w:pPr>
       <w:proofErr w:type="spellStart"/>
+      <w:proofErr w:type="gramStart"/>
       <w:r>
         <w:rPr>
           <w:rFonts w:ascii="Times New Roman" w:hAnsi="Times New Roman" w:cs="Times New Roman"/>
@@ -17707,6 +18157,7 @@
         <w:t>.[</w:t>
       </w:r>
       <w:proofErr w:type="spellStart"/>
+      <w:proofErr w:type="gramEnd"/>
       <w:r>
         <w:rPr>
           <w:rFonts w:ascii="Times New Roman" w:hAnsi="Times New Roman" w:cs="Times New Roman"/>
@@ -18211,7 +18662,25 @@
           <w:sz w:val="28"/>
           <w:szCs w:val="28"/>
         </w:rPr>
-        <w:t xml:space="preserve"> -S IP_АДРЕС,ПОРТ -U ЛОГИН -P ПАРОЛЬ -d </w:t>
+        <w:t xml:space="preserve"> -S IP_</w:t>
+      </w:r>
+      <w:proofErr w:type="gramStart"/>
+      <w:r>
+        <w:rPr>
+          <w:rFonts w:ascii="Times New Roman" w:hAnsi="Times New Roman" w:cs="Times New Roman"/>
+          <w:sz w:val="28"/>
+          <w:szCs w:val="28"/>
+        </w:rPr>
+        <w:t>АДРЕС,ПОРТ</w:t>
+      </w:r>
+      <w:proofErr w:type="gramEnd"/>
+      <w:r>
+        <w:rPr>
+          <w:rFonts w:ascii="Times New Roman" w:hAnsi="Times New Roman" w:cs="Times New Roman"/>
+          <w:sz w:val="28"/>
+          <w:szCs w:val="28"/>
+        </w:rPr>
+        <w:t xml:space="preserve"> -U ЛОГИН -P ПАРОЛЬ -d </w:t>
       </w:r>
       <w:proofErr w:type="spellStart"/>
       <w:r>
@@ -18361,7 +18830,16 @@
           <w:sz w:val="28"/>
           <w:szCs w:val="28"/>
         </w:rPr>
-        <w:t>SECONDARY_DB_URL=jdbc:sqlserver://</w:t>
+        <w:t>SECONDARY_DB_URL=</w:t>
+      </w:r>
+      <w:proofErr w:type="gramStart"/>
+      <w:r>
+        <w:rPr>
+          <w:rFonts w:ascii="Times New Roman" w:hAnsi="Times New Roman" w:cs="Times New Roman"/>
+          <w:sz w:val="28"/>
+          <w:szCs w:val="28"/>
+        </w:rPr>
+        <w:t>jdbc:sqlserver://</w:t>
       </w:r>
       <w:r>
         <w:rPr>
@@ -18377,7 +18855,16 @@
           <w:sz w:val="28"/>
           <w:szCs w:val="28"/>
         </w:rPr>
-        <w:t>:ПОРТ;databaseName=InfraManager;trustServerCertificate=true;</w:t>
+        <w:t>:ПОРТ;databaseName=InfraManager;trustServerCertificate=true</w:t>
+      </w:r>
+      <w:proofErr w:type="gramEnd"/>
+      <w:r>
+        <w:rPr>
+          <w:rFonts w:ascii="Times New Roman" w:hAnsi="Times New Roman" w:cs="Times New Roman"/>
+          <w:sz w:val="28"/>
+          <w:szCs w:val="28"/>
+        </w:rPr>
+        <w:t>;</w:t>
       </w:r>
     </w:p>
     <w:p>
@@ -18413,7 +18900,16 @@
           <w:sz w:val="28"/>
           <w:szCs w:val="28"/>
         </w:rPr>
-        <w:t>SECONDARY_DB_URL=jdbc:sqlserver://</w:t>
+        <w:t>SECONDARY_DB_URL=</w:t>
+      </w:r>
+      <w:proofErr w:type="gramStart"/>
+      <w:r>
+        <w:rPr>
+          <w:rFonts w:ascii="Times New Roman" w:hAnsi="Times New Roman" w:cs="Times New Roman"/>
+          <w:sz w:val="28"/>
+          <w:szCs w:val="28"/>
+        </w:rPr>
+        <w:t>jdbc:sqlserver://</w:t>
       </w:r>
       <w:r>
         <w:rPr>
@@ -18445,7 +18941,16 @@
           <w:sz w:val="28"/>
           <w:szCs w:val="28"/>
         </w:rPr>
-        <w:t>;databaseName=InfraManager;trustServerCertificate=true;</w:t>
+        <w:t>;databaseName=InfraManager;trustServerCertificate=true</w:t>
+      </w:r>
+      <w:proofErr w:type="gramEnd"/>
+      <w:r>
+        <w:rPr>
+          <w:rFonts w:ascii="Times New Roman" w:hAnsi="Times New Roman" w:cs="Times New Roman"/>
+          <w:sz w:val="28"/>
+          <w:szCs w:val="28"/>
+        </w:rPr>
+        <w:t>;</w:t>
       </w:r>
     </w:p>
     <w:p>
@@ -18915,7 +19420,25 @@
           <w:sz w:val="28"/>
           <w:szCs w:val="28"/>
         </w:rPr>
-        <w:t xml:space="preserve"> файлы эталонных комплектующих в папку ./</w:t>
+        <w:t xml:space="preserve"> файлы эталонных комплектующих в </w:t>
+      </w:r>
+      <w:proofErr w:type="gramStart"/>
+      <w:r>
+        <w:rPr>
+          <w:rFonts w:ascii="Times New Roman" w:hAnsi="Times New Roman" w:cs="Times New Roman"/>
+          <w:sz w:val="28"/>
+          <w:szCs w:val="28"/>
+        </w:rPr>
+        <w:t>папку .</w:t>
+      </w:r>
+      <w:proofErr w:type="gramEnd"/>
+      <w:r>
+        <w:rPr>
+          <w:rFonts w:ascii="Times New Roman" w:hAnsi="Times New Roman" w:cs="Times New Roman"/>
+          <w:sz w:val="28"/>
+          <w:szCs w:val="28"/>
+        </w:rPr>
+        <w:t>/</w:t>
       </w:r>
       <w:proofErr w:type="spellStart"/>
       <w:r>
@@ -19673,7 +20196,1806 @@
           <w:sz w:val="28"/>
           <w:szCs w:val="28"/>
         </w:rPr>
-        <w:t>Всё! Система доступна через браузер по адресу http://localhost</w:t>
+        <w:t xml:space="preserve">Всё! Система доступна через браузер по адресу </w:t>
+      </w:r>
+      <w:hyperlink r:id="rId16" w:history="1">
+        <w:r>
+          <w:rPr>
+            <w:rStyle w:val="ac"/>
+            <w:rFonts w:ascii="Times New Roman" w:hAnsi="Times New Roman" w:cs="Times New Roman"/>
+            <w:sz w:val="28"/>
+            <w:szCs w:val="28"/>
+          </w:rPr>
+          <w:t>http://localhost</w:t>
+        </w:r>
+      </w:hyperlink>
+    </w:p>
+    <w:p>
+      <w:pPr>
+        <w:rPr>
+          <w:rFonts w:ascii="Times New Roman" w:hAnsi="Times New Roman" w:cs="Times New Roman"/>
+          <w:sz w:val="28"/>
+          <w:szCs w:val="28"/>
+        </w:rPr>
+      </w:pPr>
+      <w:r>
+        <w:rPr>
+          <w:rFonts w:ascii="Times New Roman" w:hAnsi="Times New Roman" w:cs="Times New Roman"/>
+          <w:sz w:val="28"/>
+          <w:szCs w:val="28"/>
+        </w:rPr>
+        <w:br w:type="page"/>
+      </w:r>
+    </w:p>
+    <w:p>
+      <w:pPr>
+        <w:jc w:val="center"/>
+        <w:rPr>
+          <w:rFonts w:ascii="Times New Roman" w:hAnsi="Times New Roman" w:cs="Times New Roman"/>
+          <w:b/>
+          <w:bCs/>
+          <w:sz w:val="28"/>
+          <w:szCs w:val="28"/>
+        </w:rPr>
+      </w:pPr>
+      <w:r>
+        <w:rPr>
+          <w:rFonts w:ascii="Times New Roman" w:hAnsi="Times New Roman" w:cs="Times New Roman"/>
+          <w:b/>
+          <w:bCs/>
+          <w:sz w:val="28"/>
+          <w:szCs w:val="28"/>
+        </w:rPr>
+        <w:lastRenderedPageBreak/>
+        <w:t>Решение проблемы с подключением</w:t>
+      </w:r>
+      <w:r>
+        <w:rPr>
+          <w:rFonts w:ascii="Times New Roman" w:hAnsi="Times New Roman" w:cs="Times New Roman"/>
+          <w:b/>
+          <w:bCs/>
+          <w:sz w:val="28"/>
+          <w:szCs w:val="28"/>
+        </w:rPr>
+        <w:t xml:space="preserve"> 2</w:t>
+      </w:r>
+    </w:p>
+    <w:p>
+      <w:pPr>
+        <w:jc w:val="both"/>
+        <w:rPr>
+          <w:rFonts w:ascii="Times New Roman" w:hAnsi="Times New Roman" w:cs="Times New Roman"/>
+          <w:sz w:val="28"/>
+          <w:szCs w:val="28"/>
+        </w:rPr>
+      </w:pPr>
+      <w:r>
+        <w:rPr>
+          <w:rFonts w:ascii="Times New Roman" w:hAnsi="Times New Roman" w:cs="Times New Roman"/>
+          <w:sz w:val="28"/>
+          <w:szCs w:val="28"/>
+        </w:rPr>
+        <w:t>К</w:t>
+      </w:r>
+      <w:r>
+        <w:rPr>
+          <w:rFonts w:ascii="Times New Roman" w:hAnsi="Times New Roman" w:cs="Times New Roman"/>
+          <w:sz w:val="28"/>
+          <w:szCs w:val="28"/>
+        </w:rPr>
+        <w:t>ороткий ответ</w:t>
+      </w:r>
+      <w:proofErr w:type="gramStart"/>
+      <w:r>
+        <w:rPr>
+          <w:rFonts w:ascii="Times New Roman" w:hAnsi="Times New Roman" w:cs="Times New Roman"/>
+          <w:sz w:val="28"/>
+          <w:szCs w:val="28"/>
+        </w:rPr>
+        <w:t>: </w:t>
+      </w:r>
+      <w:r>
+        <w:rPr>
+          <w:rFonts w:ascii="Times New Roman" w:hAnsi="Times New Roman" w:cs="Times New Roman"/>
+          <w:b/>
+          <w:bCs/>
+          <w:sz w:val="28"/>
+          <w:szCs w:val="28"/>
+        </w:rPr>
+        <w:t>Нет</w:t>
+      </w:r>
+      <w:proofErr w:type="gramEnd"/>
+      <w:r>
+        <w:rPr>
+          <w:rFonts w:ascii="Times New Roman" w:hAnsi="Times New Roman" w:cs="Times New Roman"/>
+          <w:b/>
+          <w:bCs/>
+          <w:sz w:val="28"/>
+          <w:szCs w:val="28"/>
+        </w:rPr>
+        <w:t>, чисто теоретически и практически эти библиотеки вам никак не помогут.</w:t>
+      </w:r>
+    </w:p>
+    <w:p>
+      <w:pPr>
+        <w:jc w:val="both"/>
+        <w:rPr>
+          <w:rFonts w:ascii="Times New Roman" w:hAnsi="Times New Roman" w:cs="Times New Roman"/>
+          <w:sz w:val="28"/>
+          <w:szCs w:val="28"/>
+        </w:rPr>
+      </w:pPr>
+      <w:r>
+        <w:rPr>
+          <w:rFonts w:ascii="Times New Roman" w:hAnsi="Times New Roman" w:cs="Times New Roman"/>
+          <w:sz w:val="28"/>
+          <w:szCs w:val="28"/>
+        </w:rPr>
+        <w:t>Инструкция, которую вам дали админы, предназначена для </w:t>
+      </w:r>
+      <w:r>
+        <w:rPr>
+          <w:rFonts w:ascii="Times New Roman" w:hAnsi="Times New Roman" w:cs="Times New Roman"/>
+          <w:b/>
+          <w:bCs/>
+          <w:sz w:val="28"/>
+          <w:szCs w:val="28"/>
+        </w:rPr>
+        <w:t>Python, PHP или C++</w:t>
+      </w:r>
+      <w:r>
+        <w:rPr>
+          <w:rFonts w:ascii="Times New Roman" w:hAnsi="Times New Roman" w:cs="Times New Roman"/>
+          <w:sz w:val="28"/>
+          <w:szCs w:val="28"/>
+        </w:rPr>
+        <w:t>. Эти языки используют ODBC-драйверы на уровне операционной системы для общения с базами данных.</w:t>
+      </w:r>
+    </w:p>
+    <w:p>
+      <w:pPr>
+        <w:jc w:val="both"/>
+        <w:rPr>
+          <w:rFonts w:ascii="Times New Roman" w:hAnsi="Times New Roman" w:cs="Times New Roman"/>
+          <w:sz w:val="28"/>
+          <w:szCs w:val="28"/>
+        </w:rPr>
+      </w:pPr>
+      <w:r>
+        <w:rPr>
+          <w:rFonts w:ascii="Times New Roman" w:hAnsi="Times New Roman" w:cs="Times New Roman"/>
+          <w:sz w:val="28"/>
+          <w:szCs w:val="28"/>
+        </w:rPr>
+        <w:t>Ваш бэкенд написан на </w:t>
+      </w:r>
+      <w:r>
+        <w:rPr>
+          <w:rFonts w:ascii="Times New Roman" w:hAnsi="Times New Roman" w:cs="Times New Roman"/>
+          <w:b/>
+          <w:bCs/>
+          <w:sz w:val="28"/>
+          <w:szCs w:val="28"/>
+        </w:rPr>
+        <w:t>Java (Spring Boot)</w:t>
+      </w:r>
+      <w:r>
+        <w:rPr>
+          <w:rFonts w:ascii="Times New Roman" w:hAnsi="Times New Roman" w:cs="Times New Roman"/>
+          <w:sz w:val="28"/>
+          <w:szCs w:val="28"/>
+        </w:rPr>
+        <w:t>. Java использует технологию </w:t>
+      </w:r>
+      <w:r>
+        <w:rPr>
+          <w:rFonts w:ascii="Times New Roman" w:hAnsi="Times New Roman" w:cs="Times New Roman"/>
+          <w:b/>
+          <w:bCs/>
+          <w:sz w:val="28"/>
+          <w:szCs w:val="28"/>
+        </w:rPr>
+        <w:t>JDBC</w:t>
+      </w:r>
+      <w:r>
+        <w:rPr>
+          <w:rFonts w:ascii="Times New Roman" w:hAnsi="Times New Roman" w:cs="Times New Roman"/>
+          <w:sz w:val="28"/>
+          <w:szCs w:val="28"/>
+        </w:rPr>
+        <w:t>. В вашем pom.xml уже есть зависимость </w:t>
+      </w:r>
+      <w:proofErr w:type="spellStart"/>
+      <w:r>
+        <w:rPr>
+          <w:rFonts w:ascii="Times New Roman" w:hAnsi="Times New Roman" w:cs="Times New Roman"/>
+          <w:sz w:val="28"/>
+          <w:szCs w:val="28"/>
+        </w:rPr>
+        <w:t>mssql-jdbc</w:t>
+      </w:r>
+      <w:proofErr w:type="spellEnd"/>
+      <w:r>
+        <w:rPr>
+          <w:rFonts w:ascii="Times New Roman" w:hAnsi="Times New Roman" w:cs="Times New Roman"/>
+          <w:sz w:val="28"/>
+          <w:szCs w:val="28"/>
+        </w:rPr>
+        <w:t>. Это так называемый </w:t>
+      </w:r>
+      <w:r>
+        <w:rPr>
+          <w:rFonts w:ascii="Times New Roman" w:hAnsi="Times New Roman" w:cs="Times New Roman"/>
+          <w:i/>
+          <w:iCs/>
+          <w:sz w:val="28"/>
+          <w:szCs w:val="28"/>
+        </w:rPr>
+        <w:t>Type 4 JDBC Driver</w:t>
+      </w:r>
+      <w:r>
+        <w:rPr>
+          <w:rFonts w:ascii="Times New Roman" w:hAnsi="Times New Roman" w:cs="Times New Roman"/>
+          <w:sz w:val="28"/>
+          <w:szCs w:val="28"/>
+        </w:rPr>
+        <w:t xml:space="preserve"> — он написан на чистой Java и общается с SQL Server напрямую по сети (по протоколу TDS), минуя любые системные ODBC-драйверы (включая те, что в инструкции). Поэтому ставить msodbcsql17 внутрь </w:t>
+      </w:r>
+      <w:proofErr w:type="spellStart"/>
+      <w:r>
+        <w:rPr>
+          <w:rFonts w:ascii="Times New Roman" w:hAnsi="Times New Roman" w:cs="Times New Roman"/>
+          <w:sz w:val="28"/>
+          <w:szCs w:val="28"/>
+        </w:rPr>
+        <w:t>Docker</w:t>
+      </w:r>
+      <w:proofErr w:type="spellEnd"/>
+      <w:r>
+        <w:rPr>
+          <w:rFonts w:ascii="Times New Roman" w:hAnsi="Times New Roman" w:cs="Times New Roman"/>
+          <w:sz w:val="28"/>
+          <w:szCs w:val="28"/>
+        </w:rPr>
+        <w:t>-контейнера с Java абсолютно бессмысленно.</w:t>
+      </w:r>
+    </w:p>
+    <w:p>
+      <w:pPr>
+        <w:jc w:val="both"/>
+        <w:rPr>
+          <w:rFonts w:ascii="Times New Roman" w:hAnsi="Times New Roman" w:cs="Times New Roman"/>
+          <w:sz w:val="28"/>
+          <w:szCs w:val="28"/>
+        </w:rPr>
+      </w:pPr>
+      <w:r>
+        <w:rPr>
+          <w:rFonts w:ascii="Times New Roman" w:hAnsi="Times New Roman" w:cs="Times New Roman"/>
+          <w:sz w:val="28"/>
+          <w:szCs w:val="28"/>
+        </w:rPr>
+        <w:pict w14:anchorId="00AE3DDA">
+          <v:rect id="_x0000_i1031" style="width:730.6pt;height:1.5pt" o:hrpct="0" o:hralign="center" o:hrstd="t" o:hr="t" fillcolor="#a0a0a0" stroked="f"/>
+        </w:pict>
+      </w:r>
+    </w:p>
+    <w:p>
+      <w:pPr>
+        <w:jc w:val="both"/>
+        <w:rPr>
+          <w:rFonts w:ascii="Times New Roman" w:hAnsi="Times New Roman" w:cs="Times New Roman"/>
+          <w:b/>
+          <w:bCs/>
+          <w:sz w:val="28"/>
+          <w:szCs w:val="28"/>
+        </w:rPr>
+      </w:pPr>
+      <w:r>
+        <w:rPr>
+          <w:rFonts w:ascii="Times New Roman" w:hAnsi="Times New Roman" w:cs="Times New Roman"/>
+          <w:b/>
+          <w:bCs/>
+          <w:sz w:val="28"/>
+          <w:szCs w:val="28"/>
+        </w:rPr>
+        <w:t xml:space="preserve">В чем реальная проблема с "именованным экземпляром" из-под </w:t>
+      </w:r>
+      <w:proofErr w:type="spellStart"/>
+      <w:r>
+        <w:rPr>
+          <w:rFonts w:ascii="Times New Roman" w:hAnsi="Times New Roman" w:cs="Times New Roman"/>
+          <w:b/>
+          <w:bCs/>
+          <w:sz w:val="28"/>
+          <w:szCs w:val="28"/>
+        </w:rPr>
+        <w:t>Docker</w:t>
+      </w:r>
+      <w:proofErr w:type="spellEnd"/>
+      <w:r>
+        <w:rPr>
+          <w:rFonts w:ascii="Times New Roman" w:hAnsi="Times New Roman" w:cs="Times New Roman"/>
+          <w:b/>
+          <w:bCs/>
+          <w:sz w:val="28"/>
+          <w:szCs w:val="28"/>
+        </w:rPr>
+        <w:t>/Linux?</w:t>
+      </w:r>
+    </w:p>
+    <w:p>
+      <w:pPr>
+        <w:jc w:val="both"/>
+        <w:rPr>
+          <w:rFonts w:ascii="Times New Roman" w:hAnsi="Times New Roman" w:cs="Times New Roman"/>
+          <w:sz w:val="28"/>
+          <w:szCs w:val="28"/>
+        </w:rPr>
+      </w:pPr>
+      <w:r>
+        <w:rPr>
+          <w:rFonts w:ascii="Times New Roman" w:hAnsi="Times New Roman" w:cs="Times New Roman"/>
+          <w:sz w:val="28"/>
+          <w:szCs w:val="28"/>
+        </w:rPr>
+        <w:t>Когда вы подключаетесь к MS SQL без порта, указывая </w:t>
+      </w:r>
+      <w:proofErr w:type="spellStart"/>
+      <w:r>
+        <w:rPr>
+          <w:rFonts w:ascii="Times New Roman" w:hAnsi="Times New Roman" w:cs="Times New Roman"/>
+          <w:sz w:val="28"/>
+          <w:szCs w:val="28"/>
+        </w:rPr>
+        <w:t>instanceName</w:t>
+      </w:r>
+      <w:proofErr w:type="spellEnd"/>
+      <w:r>
+        <w:rPr>
+          <w:rFonts w:ascii="Times New Roman" w:hAnsi="Times New Roman" w:cs="Times New Roman"/>
+          <w:sz w:val="28"/>
+          <w:szCs w:val="28"/>
+        </w:rPr>
+        <w:t>=ЭКЗЕМПЛЯР, происходит следующее:</w:t>
+      </w:r>
+    </w:p>
+    <w:p>
+      <w:pPr>
+        <w:numPr>
+          <w:ilvl w:val="0"/>
+          <w:numId w:val="19"/>
+        </w:numPr>
+        <w:jc w:val="both"/>
+        <w:rPr>
+          <w:rFonts w:ascii="Times New Roman" w:hAnsi="Times New Roman" w:cs="Times New Roman"/>
+          <w:sz w:val="28"/>
+          <w:szCs w:val="28"/>
+        </w:rPr>
+      </w:pPr>
+      <w:r>
+        <w:rPr>
+          <w:rFonts w:ascii="Times New Roman" w:hAnsi="Times New Roman" w:cs="Times New Roman"/>
+          <w:sz w:val="28"/>
+          <w:szCs w:val="28"/>
+        </w:rPr>
+        <w:t>Ваш Java-драйвер отправляет широковещательный запрос на </w:t>
+      </w:r>
+      <w:r>
+        <w:rPr>
+          <w:rFonts w:ascii="Times New Roman" w:hAnsi="Times New Roman" w:cs="Times New Roman"/>
+          <w:b/>
+          <w:bCs/>
+          <w:sz w:val="28"/>
+          <w:szCs w:val="28"/>
+        </w:rPr>
+        <w:t>UDP порт 1434</w:t>
+      </w:r>
+      <w:r>
+        <w:rPr>
+          <w:rFonts w:ascii="Times New Roman" w:hAnsi="Times New Roman" w:cs="Times New Roman"/>
+          <w:sz w:val="28"/>
+          <w:szCs w:val="28"/>
+        </w:rPr>
+        <w:t xml:space="preserve"> (к службе SQL Server </w:t>
+      </w:r>
+      <w:proofErr w:type="spellStart"/>
+      <w:r>
+        <w:rPr>
+          <w:rFonts w:ascii="Times New Roman" w:hAnsi="Times New Roman" w:cs="Times New Roman"/>
+          <w:sz w:val="28"/>
+          <w:szCs w:val="28"/>
+        </w:rPr>
+        <w:t>Browser</w:t>
+      </w:r>
+      <w:proofErr w:type="spellEnd"/>
+      <w:r>
+        <w:rPr>
+          <w:rFonts w:ascii="Times New Roman" w:hAnsi="Times New Roman" w:cs="Times New Roman"/>
+          <w:sz w:val="28"/>
+          <w:szCs w:val="28"/>
+        </w:rPr>
+        <w:t>).</w:t>
+      </w:r>
+    </w:p>
+    <w:p>
+      <w:pPr>
+        <w:numPr>
+          <w:ilvl w:val="0"/>
+          <w:numId w:val="19"/>
+        </w:numPr>
+        <w:jc w:val="both"/>
+        <w:rPr>
+          <w:rFonts w:ascii="Times New Roman" w:hAnsi="Times New Roman" w:cs="Times New Roman"/>
+          <w:sz w:val="28"/>
+          <w:szCs w:val="28"/>
+        </w:rPr>
+      </w:pPr>
+      <w:r>
+        <w:rPr>
+          <w:rFonts w:ascii="Times New Roman" w:hAnsi="Times New Roman" w:cs="Times New Roman"/>
+          <w:sz w:val="28"/>
+          <w:szCs w:val="28"/>
+        </w:rPr>
+        <w:t>Эта служба отвечает: "Экземпляр с таким именем сейчас слушает TCP-порт 55123".</w:t>
+      </w:r>
+    </w:p>
+    <w:p>
+      <w:pPr>
+        <w:numPr>
+          <w:ilvl w:val="0"/>
+          <w:numId w:val="19"/>
+        </w:numPr>
+        <w:jc w:val="both"/>
+        <w:rPr>
+          <w:rFonts w:ascii="Times New Roman" w:hAnsi="Times New Roman" w:cs="Times New Roman"/>
+          <w:sz w:val="28"/>
+          <w:szCs w:val="28"/>
+        </w:rPr>
+      </w:pPr>
+      <w:r>
+        <w:rPr>
+          <w:rFonts w:ascii="Times New Roman" w:hAnsi="Times New Roman" w:cs="Times New Roman"/>
+          <w:sz w:val="28"/>
+          <w:szCs w:val="28"/>
+        </w:rPr>
+        <w:t>Java подключается к порту 55123.</w:t>
+      </w:r>
+    </w:p>
+    <w:p>
+      <w:pPr>
+        <w:jc w:val="both"/>
+        <w:rPr>
+          <w:rFonts w:ascii="Times New Roman" w:hAnsi="Times New Roman" w:cs="Times New Roman"/>
+          <w:sz w:val="28"/>
+          <w:szCs w:val="28"/>
+        </w:rPr>
+      </w:pPr>
+      <w:r>
+        <w:rPr>
+          <w:rFonts w:ascii="Times New Roman" w:hAnsi="Times New Roman" w:cs="Times New Roman"/>
+          <w:sz w:val="28"/>
+          <w:szCs w:val="28"/>
+        </w:rPr>
+        <w:t>Из Windows (</w:t>
+      </w:r>
+      <w:proofErr w:type="spellStart"/>
+      <w:r>
+        <w:rPr>
+          <w:rFonts w:ascii="Times New Roman" w:hAnsi="Times New Roman" w:cs="Times New Roman"/>
+          <w:sz w:val="28"/>
+          <w:szCs w:val="28"/>
+        </w:rPr>
+        <w:t>HeidiSQL</w:t>
+      </w:r>
+      <w:proofErr w:type="spellEnd"/>
+      <w:r>
+        <w:rPr>
+          <w:rFonts w:ascii="Times New Roman" w:hAnsi="Times New Roman" w:cs="Times New Roman"/>
+          <w:sz w:val="28"/>
+          <w:szCs w:val="28"/>
+        </w:rPr>
+        <w:t xml:space="preserve">) это работает легко. А вот из-под </w:t>
+      </w:r>
+      <w:proofErr w:type="spellStart"/>
+      <w:r>
+        <w:rPr>
+          <w:rFonts w:ascii="Times New Roman" w:hAnsi="Times New Roman" w:cs="Times New Roman"/>
+          <w:sz w:val="28"/>
+          <w:szCs w:val="28"/>
+        </w:rPr>
+        <w:t>Docker</w:t>
+      </w:r>
+      <w:proofErr w:type="spellEnd"/>
+      <w:r>
+        <w:rPr>
+          <w:rFonts w:ascii="Times New Roman" w:hAnsi="Times New Roman" w:cs="Times New Roman"/>
+          <w:sz w:val="28"/>
+          <w:szCs w:val="28"/>
+        </w:rPr>
+        <w:t xml:space="preserve"> на Linux это часто ломается по двум причинам:</w:t>
+      </w:r>
+    </w:p>
+    <w:p>
+      <w:pPr>
+        <w:numPr>
+          <w:ilvl w:val="0"/>
+          <w:numId w:val="20"/>
+        </w:numPr>
+        <w:jc w:val="both"/>
+        <w:rPr>
+          <w:rFonts w:ascii="Times New Roman" w:hAnsi="Times New Roman" w:cs="Times New Roman"/>
+          <w:sz w:val="28"/>
+          <w:szCs w:val="28"/>
+        </w:rPr>
+      </w:pPr>
+      <w:proofErr w:type="spellStart"/>
+      <w:r>
+        <w:rPr>
+          <w:rFonts w:ascii="Times New Roman" w:hAnsi="Times New Roman" w:cs="Times New Roman"/>
+          <w:b/>
+          <w:bCs/>
+          <w:sz w:val="28"/>
+          <w:szCs w:val="28"/>
+        </w:rPr>
+        <w:t>Docker</w:t>
+      </w:r>
+      <w:proofErr w:type="spellEnd"/>
+      <w:r>
+        <w:rPr>
+          <w:rFonts w:ascii="Times New Roman" w:hAnsi="Times New Roman" w:cs="Times New Roman"/>
+          <w:b/>
+          <w:bCs/>
+          <w:sz w:val="28"/>
+          <w:szCs w:val="28"/>
+        </w:rPr>
+        <w:t>-сети (</w:t>
+      </w:r>
+      <w:proofErr w:type="spellStart"/>
+      <w:r>
+        <w:rPr>
+          <w:rFonts w:ascii="Times New Roman" w:hAnsi="Times New Roman" w:cs="Times New Roman"/>
+          <w:b/>
+          <w:bCs/>
+          <w:sz w:val="28"/>
+          <w:szCs w:val="28"/>
+        </w:rPr>
+        <w:t>bridge</w:t>
+      </w:r>
+      <w:proofErr w:type="spellEnd"/>
+      <w:r>
+        <w:rPr>
+          <w:rFonts w:ascii="Times New Roman" w:hAnsi="Times New Roman" w:cs="Times New Roman"/>
+          <w:b/>
+          <w:bCs/>
+          <w:sz w:val="28"/>
+          <w:szCs w:val="28"/>
+        </w:rPr>
+        <w:t xml:space="preserve">) или файрвол </w:t>
+      </w:r>
+      <w:proofErr w:type="spellStart"/>
+      <w:r>
+        <w:rPr>
+          <w:rFonts w:ascii="Times New Roman" w:hAnsi="Times New Roman" w:cs="Times New Roman"/>
+          <w:b/>
+          <w:bCs/>
+          <w:sz w:val="28"/>
+          <w:szCs w:val="28"/>
+        </w:rPr>
+        <w:t>AstraLinux</w:t>
+      </w:r>
+      <w:proofErr w:type="spellEnd"/>
+      <w:r>
+        <w:rPr>
+          <w:rFonts w:ascii="Times New Roman" w:hAnsi="Times New Roman" w:cs="Times New Roman"/>
+          <w:b/>
+          <w:bCs/>
+          <w:sz w:val="28"/>
+          <w:szCs w:val="28"/>
+        </w:rPr>
+        <w:t xml:space="preserve"> блокируют исходящие UDP-запросы на порт 1434.</w:t>
+      </w:r>
+    </w:p>
+    <w:p>
+      <w:pPr>
+        <w:numPr>
+          <w:ilvl w:val="0"/>
+          <w:numId w:val="20"/>
+        </w:numPr>
+        <w:jc w:val="both"/>
+        <w:rPr>
+          <w:rFonts w:ascii="Times New Roman" w:hAnsi="Times New Roman" w:cs="Times New Roman"/>
+          <w:sz w:val="28"/>
+          <w:szCs w:val="28"/>
+        </w:rPr>
+      </w:pPr>
+      <w:r>
+        <w:rPr>
+          <w:rFonts w:ascii="Times New Roman" w:hAnsi="Times New Roman" w:cs="Times New Roman"/>
+          <w:b/>
+          <w:bCs/>
+          <w:sz w:val="28"/>
+          <w:szCs w:val="28"/>
+        </w:rPr>
+        <w:t>Неверный синтаксис строки.</w:t>
+      </w:r>
+      <w:r>
+        <w:rPr>
+          <w:rFonts w:ascii="Times New Roman" w:hAnsi="Times New Roman" w:cs="Times New Roman"/>
+          <w:sz w:val="28"/>
+          <w:szCs w:val="28"/>
+        </w:rPr>
+        <w:t xml:space="preserve"> В </w:t>
+      </w:r>
+      <w:proofErr w:type="gramStart"/>
+      <w:r>
+        <w:rPr>
+          <w:rFonts w:ascii="Times New Roman" w:hAnsi="Times New Roman" w:cs="Times New Roman"/>
+          <w:sz w:val="28"/>
+          <w:szCs w:val="28"/>
+        </w:rPr>
+        <w:t>вашем .env</w:t>
+      </w:r>
+      <w:proofErr w:type="gramEnd"/>
+      <w:r>
+        <w:rPr>
+          <w:rFonts w:ascii="Times New Roman" w:hAnsi="Times New Roman" w:cs="Times New Roman"/>
+          <w:sz w:val="28"/>
+          <w:szCs w:val="28"/>
+        </w:rPr>
+        <w:t> написано: </w:t>
+      </w:r>
+      <w:proofErr w:type="gramStart"/>
+      <w:r>
+        <w:rPr>
+          <w:rFonts w:ascii="Times New Roman" w:hAnsi="Times New Roman" w:cs="Times New Roman"/>
+          <w:sz w:val="28"/>
+          <w:szCs w:val="28"/>
+        </w:rPr>
+        <w:t>jdbc:sqlserver://host-name:1433;databaseName</w:t>
+      </w:r>
+      <w:proofErr w:type="gramEnd"/>
+      <w:r>
+        <w:rPr>
+          <w:rFonts w:ascii="Times New Roman" w:hAnsi="Times New Roman" w:cs="Times New Roman"/>
+          <w:sz w:val="28"/>
+          <w:szCs w:val="28"/>
+        </w:rPr>
+        <w:t>=.... Если вы вставляете туда </w:t>
+      </w:r>
+      <w:proofErr w:type="spellStart"/>
+      <w:r>
+        <w:rPr>
+          <w:rFonts w:ascii="Times New Roman" w:hAnsi="Times New Roman" w:cs="Times New Roman"/>
+          <w:sz w:val="28"/>
+          <w:szCs w:val="28"/>
+        </w:rPr>
+        <w:t>instanceName</w:t>
+      </w:r>
+      <w:proofErr w:type="spellEnd"/>
+      <w:r>
+        <w:rPr>
+          <w:rFonts w:ascii="Times New Roman" w:hAnsi="Times New Roman" w:cs="Times New Roman"/>
+          <w:sz w:val="28"/>
+          <w:szCs w:val="28"/>
+        </w:rPr>
+        <w:t>, но оставляете :1433, драйвер сходит с ума.</w:t>
+      </w:r>
+    </w:p>
+    <w:p>
+      <w:pPr>
+        <w:jc w:val="both"/>
+        <w:rPr>
+          <w:rFonts w:ascii="Times New Roman" w:hAnsi="Times New Roman" w:cs="Times New Roman"/>
+          <w:b/>
+          <w:bCs/>
+          <w:sz w:val="28"/>
+          <w:szCs w:val="28"/>
+        </w:rPr>
+      </w:pPr>
+      <w:r>
+        <w:rPr>
+          <w:rFonts w:ascii="Times New Roman" w:hAnsi="Times New Roman" w:cs="Times New Roman"/>
+          <w:b/>
+          <w:bCs/>
+          <w:sz w:val="28"/>
+          <w:szCs w:val="28"/>
+        </w:rPr>
+        <w:t>Как решить проблему</w:t>
+      </w:r>
+    </w:p>
+    <w:p>
+      <w:pPr>
+        <w:jc w:val="both"/>
+        <w:rPr>
+          <w:rFonts w:ascii="Times New Roman" w:hAnsi="Times New Roman" w:cs="Times New Roman"/>
+          <w:b/>
+          <w:bCs/>
+          <w:sz w:val="28"/>
+          <w:szCs w:val="28"/>
+        </w:rPr>
+      </w:pPr>
+      <w:r>
+        <w:rPr>
+          <w:rFonts w:ascii="Times New Roman" w:hAnsi="Times New Roman" w:cs="Times New Roman"/>
+          <w:b/>
+          <w:bCs/>
+          <w:sz w:val="28"/>
+          <w:szCs w:val="28"/>
+        </w:rPr>
+        <w:t>Способ 1</w:t>
+      </w:r>
+      <w:r>
+        <w:rPr>
+          <w:rFonts w:ascii="Times New Roman" w:hAnsi="Times New Roman" w:cs="Times New Roman"/>
+          <w:b/>
+          <w:bCs/>
+          <w:sz w:val="28"/>
+          <w:szCs w:val="28"/>
+        </w:rPr>
+        <w:t>: узнать</w:t>
+      </w:r>
+      <w:r>
+        <w:rPr>
+          <w:rFonts w:ascii="Times New Roman" w:hAnsi="Times New Roman" w:cs="Times New Roman"/>
+          <w:b/>
+          <w:bCs/>
+          <w:sz w:val="28"/>
+          <w:szCs w:val="28"/>
+        </w:rPr>
+        <w:t xml:space="preserve"> прямой порт самостоятельно</w:t>
+      </w:r>
+      <w:r>
+        <w:rPr>
+          <w:rFonts w:ascii="Times New Roman" w:hAnsi="Times New Roman" w:cs="Times New Roman"/>
+          <w:b/>
+          <w:bCs/>
+          <w:sz w:val="28"/>
+          <w:szCs w:val="28"/>
+        </w:rPr>
+        <w:t>.</w:t>
+      </w:r>
+    </w:p>
+    <w:p>
+      <w:pPr>
+        <w:jc w:val="both"/>
+        <w:rPr>
+          <w:rFonts w:ascii="Times New Roman" w:hAnsi="Times New Roman" w:cs="Times New Roman"/>
+          <w:sz w:val="28"/>
+          <w:szCs w:val="28"/>
+        </w:rPr>
+      </w:pPr>
+      <w:r>
+        <w:rPr>
+          <w:rFonts w:ascii="Times New Roman" w:hAnsi="Times New Roman" w:cs="Times New Roman"/>
+          <w:sz w:val="28"/>
+          <w:szCs w:val="28"/>
+        </w:rPr>
+        <w:t xml:space="preserve">Раз у вас получается зайти через </w:t>
+      </w:r>
+      <w:proofErr w:type="spellStart"/>
+      <w:r>
+        <w:rPr>
+          <w:rFonts w:ascii="Times New Roman" w:hAnsi="Times New Roman" w:cs="Times New Roman"/>
+          <w:sz w:val="28"/>
+          <w:szCs w:val="28"/>
+        </w:rPr>
+        <w:t>HeidiSQL</w:t>
+      </w:r>
+      <w:proofErr w:type="spellEnd"/>
+      <w:r>
+        <w:rPr>
+          <w:rFonts w:ascii="Times New Roman" w:hAnsi="Times New Roman" w:cs="Times New Roman"/>
+          <w:sz w:val="28"/>
+          <w:szCs w:val="28"/>
+        </w:rPr>
+        <w:t xml:space="preserve"> с Windows, вы можете </w:t>
+      </w:r>
+      <w:r>
+        <w:rPr>
+          <w:rFonts w:ascii="Times New Roman" w:hAnsi="Times New Roman" w:cs="Times New Roman"/>
+          <w:b/>
+          <w:bCs/>
+          <w:sz w:val="28"/>
+          <w:szCs w:val="28"/>
+        </w:rPr>
+        <w:t>сами узнать прямой порт</w:t>
+      </w:r>
+      <w:r>
+        <w:rPr>
+          <w:rFonts w:ascii="Times New Roman" w:hAnsi="Times New Roman" w:cs="Times New Roman"/>
+          <w:sz w:val="28"/>
+          <w:szCs w:val="28"/>
+        </w:rPr>
+        <w:t>, на котором висит этот именованный экземпляр, и не использовать </w:t>
+      </w:r>
+      <w:proofErr w:type="spellStart"/>
+      <w:r>
+        <w:rPr>
+          <w:rFonts w:ascii="Times New Roman" w:hAnsi="Times New Roman" w:cs="Times New Roman"/>
+          <w:sz w:val="28"/>
+          <w:szCs w:val="28"/>
+        </w:rPr>
+        <w:t>instanceName</w:t>
+      </w:r>
+      <w:proofErr w:type="spellEnd"/>
+      <w:r>
+        <w:rPr>
+          <w:rFonts w:ascii="Times New Roman" w:hAnsi="Times New Roman" w:cs="Times New Roman"/>
+          <w:sz w:val="28"/>
+          <w:szCs w:val="28"/>
+        </w:rPr>
+        <w:t> вообще!</w:t>
+      </w:r>
+    </w:p>
+    <w:p>
+      <w:pPr>
+        <w:numPr>
+          <w:ilvl w:val="0"/>
+          <w:numId w:val="21"/>
+        </w:numPr>
+        <w:jc w:val="both"/>
+        <w:rPr>
+          <w:rFonts w:ascii="Times New Roman" w:hAnsi="Times New Roman" w:cs="Times New Roman"/>
+          <w:sz w:val="28"/>
+          <w:szCs w:val="28"/>
+        </w:rPr>
+      </w:pPr>
+      <w:r>
+        <w:rPr>
+          <w:rFonts w:ascii="Times New Roman" w:hAnsi="Times New Roman" w:cs="Times New Roman"/>
+          <w:sz w:val="28"/>
+          <w:szCs w:val="28"/>
+        </w:rPr>
+        <w:t xml:space="preserve">Зайдите в БД через </w:t>
+      </w:r>
+      <w:proofErr w:type="spellStart"/>
+      <w:r>
+        <w:rPr>
+          <w:rFonts w:ascii="Times New Roman" w:hAnsi="Times New Roman" w:cs="Times New Roman"/>
+          <w:sz w:val="28"/>
+          <w:szCs w:val="28"/>
+        </w:rPr>
+        <w:t>HeidiSQL</w:t>
+      </w:r>
+      <w:proofErr w:type="spellEnd"/>
+      <w:r>
+        <w:rPr>
+          <w:rFonts w:ascii="Times New Roman" w:hAnsi="Times New Roman" w:cs="Times New Roman"/>
+          <w:sz w:val="28"/>
+          <w:szCs w:val="28"/>
+        </w:rPr>
+        <w:t>.</w:t>
+      </w:r>
+    </w:p>
+    <w:p>
+      <w:pPr>
+        <w:numPr>
+          <w:ilvl w:val="0"/>
+          <w:numId w:val="21"/>
+        </w:numPr>
+        <w:jc w:val="both"/>
+        <w:rPr>
+          <w:rFonts w:ascii="Times New Roman" w:hAnsi="Times New Roman" w:cs="Times New Roman"/>
+          <w:sz w:val="28"/>
+          <w:szCs w:val="28"/>
+        </w:rPr>
+      </w:pPr>
+      <w:r>
+        <w:rPr>
+          <w:rFonts w:ascii="Times New Roman" w:hAnsi="Times New Roman" w:cs="Times New Roman"/>
+          <w:sz w:val="28"/>
+          <w:szCs w:val="28"/>
+        </w:rPr>
+        <w:lastRenderedPageBreak/>
+        <w:t>Выполните следующий SQL-запрос:</w:t>
+      </w:r>
+    </w:p>
+    <w:p>
+      <w:pPr>
+        <w:jc w:val="both"/>
+        <w:rPr>
+          <w:rFonts w:ascii="Times New Roman" w:hAnsi="Times New Roman" w:cs="Times New Roman"/>
+          <w:sz w:val="28"/>
+          <w:szCs w:val="28"/>
+        </w:rPr>
+      </w:pPr>
+      <w:r>
+        <w:rPr>
+          <w:rFonts w:ascii="Times New Roman" w:hAnsi="Times New Roman" w:cs="Times New Roman"/>
+          <w:sz w:val="28"/>
+          <w:szCs w:val="28"/>
+        </w:rPr>
+        <w:t xml:space="preserve">SELECT </w:t>
+      </w:r>
+      <w:proofErr w:type="spellStart"/>
+      <w:r>
+        <w:rPr>
+          <w:rFonts w:ascii="Times New Roman" w:hAnsi="Times New Roman" w:cs="Times New Roman"/>
+          <w:sz w:val="28"/>
+          <w:szCs w:val="28"/>
+        </w:rPr>
+        <w:t>local_tcp_port</w:t>
+      </w:r>
+      <w:proofErr w:type="spellEnd"/>
+      <w:r>
+        <w:rPr>
+          <w:rFonts w:ascii="Times New Roman" w:hAnsi="Times New Roman" w:cs="Times New Roman"/>
+          <w:sz w:val="28"/>
+          <w:szCs w:val="28"/>
+        </w:rPr>
+        <w:t xml:space="preserve"> </w:t>
+      </w:r>
+    </w:p>
+    <w:p>
+      <w:pPr>
+        <w:jc w:val="both"/>
+        <w:rPr>
+          <w:rFonts w:ascii="Times New Roman" w:hAnsi="Times New Roman" w:cs="Times New Roman"/>
+          <w:sz w:val="28"/>
+          <w:szCs w:val="28"/>
+        </w:rPr>
+      </w:pPr>
+      <w:r>
+        <w:rPr>
+          <w:rFonts w:ascii="Times New Roman" w:hAnsi="Times New Roman" w:cs="Times New Roman"/>
+          <w:sz w:val="28"/>
+          <w:szCs w:val="28"/>
+        </w:rPr>
+        <w:t xml:space="preserve">FROM </w:t>
+      </w:r>
+      <w:proofErr w:type="spellStart"/>
+      <w:r>
+        <w:rPr>
+          <w:rFonts w:ascii="Times New Roman" w:hAnsi="Times New Roman" w:cs="Times New Roman"/>
+          <w:sz w:val="28"/>
+          <w:szCs w:val="28"/>
+        </w:rPr>
+        <w:t>sys.dm_exec_connections</w:t>
+      </w:r>
+      <w:proofErr w:type="spellEnd"/>
+      <w:r>
+        <w:rPr>
+          <w:rFonts w:ascii="Times New Roman" w:hAnsi="Times New Roman" w:cs="Times New Roman"/>
+          <w:sz w:val="28"/>
+          <w:szCs w:val="28"/>
+        </w:rPr>
+        <w:t xml:space="preserve"> </w:t>
+      </w:r>
+    </w:p>
+    <w:p>
+      <w:pPr>
+        <w:jc w:val="both"/>
+        <w:rPr>
+          <w:rFonts w:ascii="Times New Roman" w:hAnsi="Times New Roman" w:cs="Times New Roman"/>
+          <w:sz w:val="28"/>
+          <w:szCs w:val="28"/>
+        </w:rPr>
+      </w:pPr>
+      <w:r>
+        <w:rPr>
+          <w:rFonts w:ascii="Times New Roman" w:hAnsi="Times New Roman" w:cs="Times New Roman"/>
+          <w:sz w:val="28"/>
+          <w:szCs w:val="28"/>
+        </w:rPr>
+        <w:t xml:space="preserve">WHERE </w:t>
+      </w:r>
+      <w:proofErr w:type="spellStart"/>
+      <w:r>
+        <w:rPr>
+          <w:rFonts w:ascii="Times New Roman" w:hAnsi="Times New Roman" w:cs="Times New Roman"/>
+          <w:sz w:val="28"/>
+          <w:szCs w:val="28"/>
+        </w:rPr>
+        <w:t>session_id</w:t>
+      </w:r>
+      <w:proofErr w:type="spellEnd"/>
+      <w:r>
+        <w:rPr>
+          <w:rFonts w:ascii="Times New Roman" w:hAnsi="Times New Roman" w:cs="Times New Roman"/>
+          <w:sz w:val="28"/>
+          <w:szCs w:val="28"/>
+        </w:rPr>
+        <w:t xml:space="preserve"> = @@SPID;</w:t>
+      </w:r>
+    </w:p>
+    <w:p>
+      <w:pPr>
+        <w:numPr>
+          <w:ilvl w:val="0"/>
+          <w:numId w:val="21"/>
+        </w:numPr>
+        <w:jc w:val="both"/>
+        <w:rPr>
+          <w:rFonts w:ascii="Times New Roman" w:hAnsi="Times New Roman" w:cs="Times New Roman"/>
+          <w:sz w:val="28"/>
+          <w:szCs w:val="28"/>
+        </w:rPr>
+      </w:pPr>
+      <w:r>
+        <w:rPr>
+          <w:rFonts w:ascii="Times New Roman" w:hAnsi="Times New Roman" w:cs="Times New Roman"/>
+          <w:sz w:val="28"/>
+          <w:szCs w:val="28"/>
+        </w:rPr>
+        <w:t>Этот запрос вернет число (например, 49231). Это и есть тот самый прямой порт!</w:t>
+      </w:r>
+    </w:p>
+    <w:p>
+      <w:pPr>
+        <w:numPr>
+          <w:ilvl w:val="0"/>
+          <w:numId w:val="21"/>
+        </w:numPr>
+        <w:jc w:val="both"/>
+        <w:rPr>
+          <w:rFonts w:ascii="Times New Roman" w:hAnsi="Times New Roman" w:cs="Times New Roman"/>
+          <w:sz w:val="28"/>
+          <w:szCs w:val="28"/>
+        </w:rPr>
+      </w:pPr>
+      <w:r>
+        <w:rPr>
+          <w:rFonts w:ascii="Times New Roman" w:hAnsi="Times New Roman" w:cs="Times New Roman"/>
+          <w:sz w:val="28"/>
+          <w:szCs w:val="28"/>
+        </w:rPr>
+        <w:t xml:space="preserve">Теперь </w:t>
+      </w:r>
+      <w:proofErr w:type="gramStart"/>
+      <w:r>
+        <w:rPr>
+          <w:rFonts w:ascii="Times New Roman" w:hAnsi="Times New Roman" w:cs="Times New Roman"/>
+          <w:sz w:val="28"/>
+          <w:szCs w:val="28"/>
+        </w:rPr>
+        <w:t>в .</w:t>
+      </w:r>
+      <w:proofErr w:type="spellStart"/>
+      <w:r>
+        <w:rPr>
+          <w:rFonts w:ascii="Times New Roman" w:hAnsi="Times New Roman" w:cs="Times New Roman"/>
+          <w:sz w:val="28"/>
+          <w:szCs w:val="28"/>
+        </w:rPr>
+        <w:t>env</w:t>
+      </w:r>
+      <w:proofErr w:type="spellEnd"/>
+      <w:proofErr w:type="gramEnd"/>
+      <w:r>
+        <w:rPr>
+          <w:rFonts w:ascii="Times New Roman" w:hAnsi="Times New Roman" w:cs="Times New Roman"/>
+          <w:sz w:val="28"/>
+          <w:szCs w:val="28"/>
+        </w:rPr>
+        <w:t xml:space="preserve"> на </w:t>
+      </w:r>
+      <w:proofErr w:type="spellStart"/>
+      <w:r>
+        <w:rPr>
+          <w:rFonts w:ascii="Times New Roman" w:hAnsi="Times New Roman" w:cs="Times New Roman"/>
+          <w:sz w:val="28"/>
+          <w:szCs w:val="28"/>
+        </w:rPr>
+        <w:t>AstraLinux</w:t>
+      </w:r>
+      <w:proofErr w:type="spellEnd"/>
+      <w:r>
+        <w:rPr>
+          <w:rFonts w:ascii="Times New Roman" w:hAnsi="Times New Roman" w:cs="Times New Roman"/>
+          <w:sz w:val="28"/>
+          <w:szCs w:val="28"/>
+        </w:rPr>
+        <w:t xml:space="preserve"> напишите URL без </w:t>
+      </w:r>
+      <w:proofErr w:type="spellStart"/>
+      <w:r>
+        <w:rPr>
+          <w:rFonts w:ascii="Times New Roman" w:hAnsi="Times New Roman" w:cs="Times New Roman"/>
+          <w:sz w:val="28"/>
+          <w:szCs w:val="28"/>
+        </w:rPr>
+        <w:t>instanceName</w:t>
+      </w:r>
+      <w:proofErr w:type="spellEnd"/>
+      <w:r>
+        <w:rPr>
+          <w:rFonts w:ascii="Times New Roman" w:hAnsi="Times New Roman" w:cs="Times New Roman"/>
+          <w:sz w:val="28"/>
+          <w:szCs w:val="28"/>
+        </w:rPr>
+        <w:t>, просто указав этот порт:</w:t>
+      </w:r>
+    </w:p>
+    <w:p>
+      <w:pPr>
+        <w:jc w:val="both"/>
+        <w:rPr>
+          <w:rFonts w:ascii="Times New Roman" w:hAnsi="Times New Roman" w:cs="Times New Roman"/>
+          <w:sz w:val="28"/>
+          <w:szCs w:val="28"/>
+        </w:rPr>
+      </w:pPr>
+      <w:r>
+        <w:rPr>
+          <w:rFonts w:ascii="Times New Roman" w:hAnsi="Times New Roman" w:cs="Times New Roman"/>
+          <w:sz w:val="28"/>
+          <w:szCs w:val="28"/>
+        </w:rPr>
+        <w:t>INFRA_MANAGER_DB_URL=</w:t>
+      </w:r>
+      <w:proofErr w:type="gramStart"/>
+      <w:r>
+        <w:rPr>
+          <w:rFonts w:ascii="Times New Roman" w:hAnsi="Times New Roman" w:cs="Times New Roman"/>
+          <w:sz w:val="28"/>
+          <w:szCs w:val="28"/>
+        </w:rPr>
+        <w:t>jdbc:sqlserver://ХОСТ:49231;databaseName=InfraManager;trustServerCertificate=true</w:t>
+      </w:r>
+      <w:proofErr w:type="gramEnd"/>
+      <w:r>
+        <w:rPr>
+          <w:rFonts w:ascii="Times New Roman" w:hAnsi="Times New Roman" w:cs="Times New Roman"/>
+          <w:sz w:val="28"/>
+          <w:szCs w:val="28"/>
+        </w:rPr>
+        <w:t>;</w:t>
+      </w:r>
+    </w:p>
+    <w:p>
+      <w:pPr>
+        <w:jc w:val="both"/>
+        <w:rPr>
+          <w:rFonts w:ascii="Times New Roman" w:hAnsi="Times New Roman" w:cs="Times New Roman"/>
+          <w:sz w:val="28"/>
+          <w:szCs w:val="28"/>
+        </w:rPr>
+      </w:pPr>
+      <w:r>
+        <w:rPr>
+          <w:rFonts w:ascii="Times New Roman" w:hAnsi="Times New Roman" w:cs="Times New Roman"/>
+          <w:i/>
+          <w:iCs/>
+          <w:sz w:val="28"/>
+          <w:szCs w:val="28"/>
+        </w:rPr>
+        <w:t>(Примечание: динамические порты MS SQL могут меняться после перезагрузки самого сервера БД, но на Enterprise-предприятиях сервера перезагружают крайне редко. Это решит вашу проблему здесь и сейчас).</w:t>
+      </w:r>
+    </w:p>
+    <w:p>
+      <w:pPr>
+        <w:jc w:val="both"/>
+        <w:rPr>
+          <w:rFonts w:ascii="Times New Roman" w:hAnsi="Times New Roman" w:cs="Times New Roman"/>
+          <w:b/>
+          <w:bCs/>
+          <w:sz w:val="28"/>
+          <w:szCs w:val="28"/>
+        </w:rPr>
+      </w:pPr>
+      <w:r>
+        <w:rPr>
+          <w:rFonts w:ascii="Times New Roman" w:hAnsi="Times New Roman" w:cs="Times New Roman"/>
+          <w:b/>
+          <w:bCs/>
+          <w:sz w:val="28"/>
+          <w:szCs w:val="28"/>
+        </w:rPr>
+        <w:t>Способ 2</w:t>
+      </w:r>
+      <w:proofErr w:type="gramStart"/>
+      <w:r>
+        <w:rPr>
+          <w:rFonts w:ascii="Times New Roman" w:hAnsi="Times New Roman" w:cs="Times New Roman"/>
+          <w:b/>
+          <w:bCs/>
+          <w:sz w:val="28"/>
+          <w:szCs w:val="28"/>
+        </w:rPr>
+        <w:t>: Проверить</w:t>
+      </w:r>
+      <w:proofErr w:type="gramEnd"/>
+      <w:r>
+        <w:rPr>
+          <w:rFonts w:ascii="Times New Roman" w:hAnsi="Times New Roman" w:cs="Times New Roman"/>
+          <w:b/>
+          <w:bCs/>
+          <w:sz w:val="28"/>
+          <w:szCs w:val="28"/>
+        </w:rPr>
+        <w:t xml:space="preserve"> правильность строки с </w:t>
+      </w:r>
+      <w:proofErr w:type="spellStart"/>
+      <w:r>
+        <w:rPr>
+          <w:rFonts w:ascii="Times New Roman" w:hAnsi="Times New Roman" w:cs="Times New Roman"/>
+          <w:b/>
+          <w:bCs/>
+          <w:sz w:val="28"/>
+          <w:szCs w:val="28"/>
+        </w:rPr>
+        <w:t>instanceName</w:t>
+      </w:r>
+      <w:proofErr w:type="spellEnd"/>
+    </w:p>
+    <w:p>
+      <w:pPr>
+        <w:jc w:val="both"/>
+        <w:rPr>
+          <w:rFonts w:ascii="Times New Roman" w:hAnsi="Times New Roman" w:cs="Times New Roman"/>
+          <w:sz w:val="28"/>
+          <w:szCs w:val="28"/>
+        </w:rPr>
+      </w:pPr>
+      <w:r>
+        <w:rPr>
+          <w:rFonts w:ascii="Times New Roman" w:hAnsi="Times New Roman" w:cs="Times New Roman"/>
+          <w:sz w:val="28"/>
+          <w:szCs w:val="28"/>
+        </w:rPr>
+        <w:t>Если порт узнать не удалось или он меняется, убедитесь, что ваша строка подключения выглядит </w:t>
+      </w:r>
+      <w:r>
+        <w:rPr>
+          <w:rFonts w:ascii="Times New Roman" w:hAnsi="Times New Roman" w:cs="Times New Roman"/>
+          <w:b/>
+          <w:bCs/>
+          <w:sz w:val="28"/>
+          <w:szCs w:val="28"/>
+        </w:rPr>
+        <w:t>именно так</w:t>
+      </w:r>
+      <w:r>
+        <w:rPr>
+          <w:rFonts w:ascii="Times New Roman" w:hAnsi="Times New Roman" w:cs="Times New Roman"/>
+          <w:sz w:val="28"/>
+          <w:szCs w:val="28"/>
+        </w:rPr>
+        <w:t> (без указания порта вообще, даже без 1433):</w:t>
+      </w:r>
+    </w:p>
+    <w:p>
+      <w:pPr>
+        <w:jc w:val="both"/>
+        <w:rPr>
+          <w:rFonts w:ascii="Times New Roman" w:hAnsi="Times New Roman" w:cs="Times New Roman"/>
+          <w:sz w:val="28"/>
+          <w:szCs w:val="28"/>
+        </w:rPr>
+      </w:pPr>
+      <w:r>
+        <w:rPr>
+          <w:rFonts w:ascii="Times New Roman" w:hAnsi="Times New Roman" w:cs="Times New Roman"/>
+          <w:sz w:val="28"/>
+          <w:szCs w:val="28"/>
+        </w:rPr>
+        <w:t>INFRA_MANAGER_DB_URL=</w:t>
+      </w:r>
+      <w:proofErr w:type="gramStart"/>
+      <w:r>
+        <w:rPr>
+          <w:rFonts w:ascii="Times New Roman" w:hAnsi="Times New Roman" w:cs="Times New Roman"/>
+          <w:sz w:val="28"/>
+          <w:szCs w:val="28"/>
+        </w:rPr>
+        <w:t>jdbc:sqlserver://ХОСТ;instanceName=ЭКЗЕМПЛЯР;databaseName=InfraManager;trustServerCertificate=true</w:t>
+      </w:r>
+      <w:proofErr w:type="gramEnd"/>
+      <w:r>
+        <w:rPr>
+          <w:rFonts w:ascii="Times New Roman" w:hAnsi="Times New Roman" w:cs="Times New Roman"/>
+          <w:sz w:val="28"/>
+          <w:szCs w:val="28"/>
+        </w:rPr>
+        <w:t>;</w:t>
+      </w:r>
+    </w:p>
+    <w:p>
+      <w:pPr>
+        <w:jc w:val="both"/>
+        <w:rPr>
+          <w:rFonts w:ascii="Times New Roman" w:hAnsi="Times New Roman" w:cs="Times New Roman"/>
+          <w:sz w:val="28"/>
+          <w:szCs w:val="28"/>
+        </w:rPr>
+      </w:pPr>
+      <w:r>
+        <w:rPr>
+          <w:rFonts w:ascii="Times New Roman" w:hAnsi="Times New Roman" w:cs="Times New Roman"/>
+          <w:i/>
+          <w:iCs/>
+          <w:sz w:val="28"/>
+          <w:szCs w:val="28"/>
+        </w:rPr>
+        <w:t>Важно: использование \ (</w:t>
+      </w:r>
+      <w:proofErr w:type="spellStart"/>
+      <w:r>
+        <w:rPr>
+          <w:rFonts w:ascii="Times New Roman" w:hAnsi="Times New Roman" w:cs="Times New Roman"/>
+          <w:i/>
+          <w:iCs/>
+          <w:sz w:val="28"/>
+          <w:szCs w:val="28"/>
+        </w:rPr>
+        <w:t>бекслэша</w:t>
+      </w:r>
+      <w:proofErr w:type="spellEnd"/>
+      <w:r>
+        <w:rPr>
+          <w:rFonts w:ascii="Times New Roman" w:hAnsi="Times New Roman" w:cs="Times New Roman"/>
+          <w:i/>
+          <w:iCs/>
+          <w:sz w:val="28"/>
+          <w:szCs w:val="28"/>
+        </w:rPr>
+        <w:t>), например ХОСТ\ЭКЗЕМПЛЯР, в JDBC строке MS SQL не поддерживается, нужно использовать именно параметр </w:t>
+      </w:r>
+      <w:proofErr w:type="spellStart"/>
+      <w:r>
+        <w:rPr>
+          <w:rFonts w:ascii="Times New Roman" w:hAnsi="Times New Roman" w:cs="Times New Roman"/>
+          <w:i/>
+          <w:iCs/>
+          <w:sz w:val="28"/>
+          <w:szCs w:val="28"/>
+        </w:rPr>
+        <w:t>instanceName</w:t>
+      </w:r>
+      <w:proofErr w:type="spellEnd"/>
+      <w:r>
+        <w:rPr>
+          <w:rFonts w:ascii="Times New Roman" w:hAnsi="Times New Roman" w:cs="Times New Roman"/>
+          <w:i/>
+          <w:iCs/>
+          <w:sz w:val="28"/>
+          <w:szCs w:val="28"/>
+        </w:rPr>
+        <w:t>=...</w:t>
+      </w:r>
+    </w:p>
+    <w:p>
+      <w:pPr>
+        <w:jc w:val="both"/>
+        <w:rPr>
+          <w:rFonts w:ascii="Times New Roman" w:hAnsi="Times New Roman" w:cs="Times New Roman"/>
+          <w:b/>
+          <w:bCs/>
+          <w:sz w:val="28"/>
+          <w:szCs w:val="28"/>
+        </w:rPr>
+      </w:pPr>
+      <w:r>
+        <w:rPr>
+          <w:rFonts w:ascii="Times New Roman" w:hAnsi="Times New Roman" w:cs="Times New Roman"/>
+          <w:b/>
+          <w:bCs/>
+          <w:sz w:val="28"/>
+          <w:szCs w:val="28"/>
+        </w:rPr>
+        <w:t xml:space="preserve">Способ 3: Проблема с DNS или маршрутизацией UDP внутри </w:t>
+      </w:r>
+      <w:proofErr w:type="spellStart"/>
+      <w:r>
+        <w:rPr>
+          <w:rFonts w:ascii="Times New Roman" w:hAnsi="Times New Roman" w:cs="Times New Roman"/>
+          <w:b/>
+          <w:bCs/>
+          <w:sz w:val="28"/>
+          <w:szCs w:val="28"/>
+        </w:rPr>
+        <w:t>Docker</w:t>
+      </w:r>
+      <w:proofErr w:type="spellEnd"/>
+    </w:p>
+    <w:p>
+      <w:pPr>
+        <w:jc w:val="both"/>
+        <w:rPr>
+          <w:rFonts w:ascii="Times New Roman" w:hAnsi="Times New Roman" w:cs="Times New Roman"/>
+          <w:sz w:val="28"/>
+          <w:szCs w:val="28"/>
+        </w:rPr>
+      </w:pPr>
+      <w:r>
+        <w:rPr>
+          <w:rFonts w:ascii="Times New Roman" w:hAnsi="Times New Roman" w:cs="Times New Roman"/>
+          <w:sz w:val="28"/>
+          <w:szCs w:val="28"/>
+        </w:rPr>
+        <w:t xml:space="preserve">Если Способ 2 написан верно, но коннекта нет, значит </w:t>
+      </w:r>
+      <w:proofErr w:type="spellStart"/>
+      <w:r>
+        <w:rPr>
+          <w:rFonts w:ascii="Times New Roman" w:hAnsi="Times New Roman" w:cs="Times New Roman"/>
+          <w:sz w:val="28"/>
+          <w:szCs w:val="28"/>
+        </w:rPr>
+        <w:t>Docker</w:t>
+      </w:r>
+      <w:proofErr w:type="spellEnd"/>
+      <w:r>
+        <w:rPr>
+          <w:rFonts w:ascii="Times New Roman" w:hAnsi="Times New Roman" w:cs="Times New Roman"/>
+          <w:sz w:val="28"/>
+          <w:szCs w:val="28"/>
+        </w:rPr>
+        <w:t>-контейнер не может достучаться до UDP 1434.</w:t>
+      </w:r>
+      <w:r>
+        <w:rPr>
+          <w:rFonts w:ascii="Times New Roman" w:hAnsi="Times New Roman" w:cs="Times New Roman"/>
+          <w:sz w:val="28"/>
+          <w:szCs w:val="28"/>
+        </w:rPr>
+        <w:br/>
+        <w:t>Попробуйте временно в </w:t>
+      </w:r>
+      <w:proofErr w:type="spellStart"/>
+      <w:r>
+        <w:rPr>
+          <w:rFonts w:ascii="Times New Roman" w:hAnsi="Times New Roman" w:cs="Times New Roman"/>
+          <w:sz w:val="28"/>
+          <w:szCs w:val="28"/>
+        </w:rPr>
+        <w:t>docker-compose.yml</w:t>
+      </w:r>
+      <w:proofErr w:type="spellEnd"/>
+      <w:r>
+        <w:rPr>
+          <w:rFonts w:ascii="Times New Roman" w:hAnsi="Times New Roman" w:cs="Times New Roman"/>
+          <w:sz w:val="28"/>
+          <w:szCs w:val="28"/>
+        </w:rPr>
+        <w:t> для сервиса </w:t>
+      </w:r>
+      <w:proofErr w:type="spellStart"/>
+      <w:r>
+        <w:rPr>
+          <w:rFonts w:ascii="Times New Roman" w:hAnsi="Times New Roman" w:cs="Times New Roman"/>
+          <w:sz w:val="28"/>
+          <w:szCs w:val="28"/>
+        </w:rPr>
+        <w:t>backend</w:t>
+      </w:r>
+      <w:proofErr w:type="spellEnd"/>
+      <w:r>
+        <w:rPr>
+          <w:rFonts w:ascii="Times New Roman" w:hAnsi="Times New Roman" w:cs="Times New Roman"/>
+          <w:sz w:val="28"/>
+          <w:szCs w:val="28"/>
+        </w:rPr>
+        <w:t> убрать </w:t>
+      </w:r>
+      <w:proofErr w:type="spellStart"/>
+      <w:r>
+        <w:rPr>
+          <w:rFonts w:ascii="Times New Roman" w:hAnsi="Times New Roman" w:cs="Times New Roman"/>
+          <w:sz w:val="28"/>
+          <w:szCs w:val="28"/>
+        </w:rPr>
+        <w:t>networks</w:t>
+      </w:r>
+      <w:proofErr w:type="spellEnd"/>
+      <w:r>
+        <w:rPr>
+          <w:rFonts w:ascii="Times New Roman" w:hAnsi="Times New Roman" w:cs="Times New Roman"/>
+          <w:sz w:val="28"/>
+          <w:szCs w:val="28"/>
+        </w:rPr>
+        <w:t xml:space="preserve">: - </w:t>
+      </w:r>
+      <w:proofErr w:type="spellStart"/>
+      <w:r>
+        <w:rPr>
+          <w:rFonts w:ascii="Times New Roman" w:hAnsi="Times New Roman" w:cs="Times New Roman"/>
+          <w:sz w:val="28"/>
+          <w:szCs w:val="28"/>
+        </w:rPr>
+        <w:t>internal</w:t>
+      </w:r>
+      <w:proofErr w:type="spellEnd"/>
+      <w:r>
+        <w:rPr>
+          <w:rFonts w:ascii="Times New Roman" w:hAnsi="Times New Roman" w:cs="Times New Roman"/>
+          <w:sz w:val="28"/>
+          <w:szCs w:val="28"/>
+        </w:rPr>
+        <w:t> и порты, и добавить </w:t>
+      </w:r>
+      <w:proofErr w:type="spellStart"/>
+      <w:r>
+        <w:rPr>
+          <w:rFonts w:ascii="Times New Roman" w:hAnsi="Times New Roman" w:cs="Times New Roman"/>
+          <w:sz w:val="28"/>
+          <w:szCs w:val="28"/>
+        </w:rPr>
+        <w:t>network_mode</w:t>
+      </w:r>
+      <w:proofErr w:type="spellEnd"/>
+      <w:r>
+        <w:rPr>
+          <w:rFonts w:ascii="Times New Roman" w:hAnsi="Times New Roman" w:cs="Times New Roman"/>
+          <w:sz w:val="28"/>
+          <w:szCs w:val="28"/>
+        </w:rPr>
+        <w:t>: "</w:t>
+      </w:r>
+      <w:proofErr w:type="spellStart"/>
+      <w:r>
+        <w:rPr>
+          <w:rFonts w:ascii="Times New Roman" w:hAnsi="Times New Roman" w:cs="Times New Roman"/>
+          <w:sz w:val="28"/>
+          <w:szCs w:val="28"/>
+        </w:rPr>
+        <w:t>host</w:t>
+      </w:r>
+      <w:proofErr w:type="spellEnd"/>
+      <w:r>
+        <w:rPr>
+          <w:rFonts w:ascii="Times New Roman" w:hAnsi="Times New Roman" w:cs="Times New Roman"/>
+          <w:sz w:val="28"/>
+          <w:szCs w:val="28"/>
+        </w:rPr>
+        <w:t>".</w:t>
+      </w:r>
+    </w:p>
+    <w:p>
+      <w:pPr>
+        <w:jc w:val="both"/>
+        <w:rPr>
+          <w:rFonts w:ascii="Times New Roman" w:hAnsi="Times New Roman" w:cs="Times New Roman"/>
+          <w:sz w:val="28"/>
+          <w:szCs w:val="28"/>
+        </w:rPr>
+      </w:pPr>
+      <w:proofErr w:type="spellStart"/>
+      <w:r>
+        <w:rPr>
+          <w:rFonts w:ascii="Times New Roman" w:hAnsi="Times New Roman" w:cs="Times New Roman"/>
+          <w:sz w:val="28"/>
+          <w:szCs w:val="28"/>
+        </w:rPr>
+        <w:t>backend</w:t>
+      </w:r>
+      <w:proofErr w:type="spellEnd"/>
+      <w:r>
+        <w:rPr>
+          <w:rFonts w:ascii="Times New Roman" w:hAnsi="Times New Roman" w:cs="Times New Roman"/>
+          <w:sz w:val="28"/>
+          <w:szCs w:val="28"/>
+        </w:rPr>
+        <w:t>:</w:t>
+      </w:r>
+    </w:p>
+    <w:p>
+      <w:pPr>
+        <w:jc w:val="both"/>
+        <w:rPr>
+          <w:rFonts w:ascii="Times New Roman" w:hAnsi="Times New Roman" w:cs="Times New Roman"/>
+          <w:sz w:val="28"/>
+          <w:szCs w:val="28"/>
+        </w:rPr>
+      </w:pPr>
+      <w:r>
+        <w:rPr>
+          <w:rFonts w:ascii="Times New Roman" w:hAnsi="Times New Roman" w:cs="Times New Roman"/>
+          <w:sz w:val="28"/>
+          <w:szCs w:val="28"/>
+        </w:rPr>
+        <w:t xml:space="preserve">    </w:t>
+      </w:r>
+      <w:proofErr w:type="spellStart"/>
+      <w:r>
+        <w:rPr>
+          <w:rFonts w:ascii="Times New Roman" w:hAnsi="Times New Roman" w:cs="Times New Roman"/>
+          <w:sz w:val="28"/>
+          <w:szCs w:val="28"/>
+        </w:rPr>
+        <w:t>image</w:t>
+      </w:r>
+      <w:proofErr w:type="spellEnd"/>
+      <w:r>
+        <w:rPr>
+          <w:rFonts w:ascii="Times New Roman" w:hAnsi="Times New Roman" w:cs="Times New Roman"/>
+          <w:sz w:val="28"/>
+          <w:szCs w:val="28"/>
+        </w:rPr>
+        <w:t xml:space="preserve">: </w:t>
+      </w:r>
+      <w:proofErr w:type="spellStart"/>
+      <w:r>
+        <w:rPr>
+          <w:rFonts w:ascii="Times New Roman" w:hAnsi="Times New Roman" w:cs="Times New Roman"/>
+          <w:sz w:val="28"/>
+          <w:szCs w:val="28"/>
+        </w:rPr>
+        <w:t>donor-</w:t>
+      </w:r>
+      <w:proofErr w:type="gramStart"/>
+      <w:r>
+        <w:rPr>
+          <w:rFonts w:ascii="Times New Roman" w:hAnsi="Times New Roman" w:cs="Times New Roman"/>
+          <w:sz w:val="28"/>
+          <w:szCs w:val="28"/>
+        </w:rPr>
+        <w:t>backend:latest</w:t>
+      </w:r>
+      <w:proofErr w:type="spellEnd"/>
+      <w:proofErr w:type="gramEnd"/>
+    </w:p>
+    <w:p>
+      <w:pPr>
+        <w:jc w:val="both"/>
+        <w:rPr>
+          <w:rFonts w:ascii="Times New Roman" w:hAnsi="Times New Roman" w:cs="Times New Roman"/>
+          <w:sz w:val="28"/>
+          <w:szCs w:val="28"/>
+        </w:rPr>
+      </w:pPr>
+      <w:r>
+        <w:rPr>
+          <w:rFonts w:ascii="Times New Roman" w:hAnsi="Times New Roman" w:cs="Times New Roman"/>
+          <w:sz w:val="28"/>
+          <w:szCs w:val="28"/>
+        </w:rPr>
+        <w:t xml:space="preserve">    </w:t>
+      </w:r>
+      <w:proofErr w:type="spellStart"/>
+      <w:r>
+        <w:rPr>
+          <w:rFonts w:ascii="Times New Roman" w:hAnsi="Times New Roman" w:cs="Times New Roman"/>
+          <w:sz w:val="28"/>
+          <w:szCs w:val="28"/>
+        </w:rPr>
+        <w:t>container_name</w:t>
+      </w:r>
+      <w:proofErr w:type="spellEnd"/>
+      <w:r>
+        <w:rPr>
+          <w:rFonts w:ascii="Times New Roman" w:hAnsi="Times New Roman" w:cs="Times New Roman"/>
+          <w:sz w:val="28"/>
+          <w:szCs w:val="28"/>
+        </w:rPr>
+        <w:t xml:space="preserve">: </w:t>
+      </w:r>
+      <w:proofErr w:type="spellStart"/>
+      <w:r>
+        <w:rPr>
+          <w:rFonts w:ascii="Times New Roman" w:hAnsi="Times New Roman" w:cs="Times New Roman"/>
+          <w:sz w:val="28"/>
+          <w:szCs w:val="28"/>
+        </w:rPr>
+        <w:t>hardware_backend</w:t>
+      </w:r>
+      <w:proofErr w:type="spellEnd"/>
+    </w:p>
+    <w:p>
+      <w:pPr>
+        <w:jc w:val="both"/>
+        <w:rPr>
+          <w:rFonts w:ascii="Times New Roman" w:hAnsi="Times New Roman" w:cs="Times New Roman"/>
+          <w:sz w:val="28"/>
+          <w:szCs w:val="28"/>
+        </w:rPr>
+      </w:pPr>
+      <w:r>
+        <w:rPr>
+          <w:rFonts w:ascii="Times New Roman" w:hAnsi="Times New Roman" w:cs="Times New Roman"/>
+          <w:sz w:val="28"/>
+          <w:szCs w:val="28"/>
+        </w:rPr>
+        <w:t xml:space="preserve">    </w:t>
+      </w:r>
+      <w:proofErr w:type="spellStart"/>
+      <w:r>
+        <w:rPr>
+          <w:rFonts w:ascii="Times New Roman" w:hAnsi="Times New Roman" w:cs="Times New Roman"/>
+          <w:sz w:val="28"/>
+          <w:szCs w:val="28"/>
+        </w:rPr>
+        <w:t>network_mode</w:t>
+      </w:r>
+      <w:proofErr w:type="spellEnd"/>
+      <w:r>
+        <w:rPr>
+          <w:rFonts w:ascii="Times New Roman" w:hAnsi="Times New Roman" w:cs="Times New Roman"/>
+          <w:sz w:val="28"/>
+          <w:szCs w:val="28"/>
+        </w:rPr>
+        <w:t>: "</w:t>
+      </w:r>
+      <w:proofErr w:type="spellStart"/>
+      <w:r>
+        <w:rPr>
+          <w:rFonts w:ascii="Times New Roman" w:hAnsi="Times New Roman" w:cs="Times New Roman"/>
+          <w:sz w:val="28"/>
+          <w:szCs w:val="28"/>
+        </w:rPr>
+        <w:t>host</w:t>
+      </w:r>
+      <w:proofErr w:type="spellEnd"/>
+      <w:r>
+        <w:rPr>
+          <w:rFonts w:ascii="Times New Roman" w:hAnsi="Times New Roman" w:cs="Times New Roman"/>
+          <w:sz w:val="28"/>
+          <w:szCs w:val="28"/>
+        </w:rPr>
+        <w:t>" # Контейнер будет использовать сеть самой Астры напрямую</w:t>
+      </w:r>
+    </w:p>
+    <w:p>
+      <w:pPr>
+        <w:jc w:val="both"/>
+        <w:rPr>
+          <w:rFonts w:ascii="Times New Roman" w:hAnsi="Times New Roman" w:cs="Times New Roman"/>
+          <w:sz w:val="28"/>
+          <w:szCs w:val="28"/>
+        </w:rPr>
+      </w:pPr>
+      <w:r>
+        <w:rPr>
+          <w:rFonts w:ascii="Times New Roman" w:hAnsi="Times New Roman" w:cs="Times New Roman"/>
+          <w:sz w:val="28"/>
+          <w:szCs w:val="28"/>
+        </w:rPr>
+        <w:t xml:space="preserve">    # ... остальное</w:t>
+      </w:r>
+    </w:p>
+    <w:p>
+      <w:pPr>
+        <w:jc w:val="both"/>
+        <w:rPr>
+          <w:rFonts w:ascii="Times New Roman" w:hAnsi="Times New Roman" w:cs="Times New Roman"/>
+          <w:sz w:val="28"/>
+          <w:szCs w:val="28"/>
+        </w:rPr>
+      </w:pPr>
+      <w:r>
+        <w:rPr>
+          <w:rFonts w:ascii="Times New Roman" w:hAnsi="Times New Roman" w:cs="Times New Roman"/>
+          <w:sz w:val="28"/>
+          <w:szCs w:val="28"/>
+        </w:rPr>
+        <w:t xml:space="preserve">Если в таком режиме подключение заработает, значит проблема в том, как </w:t>
+      </w:r>
+      <w:proofErr w:type="spellStart"/>
+      <w:r>
+        <w:rPr>
+          <w:rFonts w:ascii="Times New Roman" w:hAnsi="Times New Roman" w:cs="Times New Roman"/>
+          <w:sz w:val="28"/>
+          <w:szCs w:val="28"/>
+        </w:rPr>
+        <w:t>Docker</w:t>
+      </w:r>
+      <w:proofErr w:type="spellEnd"/>
+      <w:r>
+        <w:rPr>
+          <w:rFonts w:ascii="Times New Roman" w:hAnsi="Times New Roman" w:cs="Times New Roman"/>
+          <w:sz w:val="28"/>
+          <w:szCs w:val="28"/>
+        </w:rPr>
+        <w:t xml:space="preserve"> на </w:t>
+      </w:r>
+      <w:proofErr w:type="spellStart"/>
+      <w:r>
+        <w:rPr>
+          <w:rFonts w:ascii="Times New Roman" w:hAnsi="Times New Roman" w:cs="Times New Roman"/>
+          <w:sz w:val="28"/>
+          <w:szCs w:val="28"/>
+        </w:rPr>
+        <w:t>AstraLinux</w:t>
+      </w:r>
+      <w:proofErr w:type="spellEnd"/>
+      <w:r>
+        <w:rPr>
+          <w:rFonts w:ascii="Times New Roman" w:hAnsi="Times New Roman" w:cs="Times New Roman"/>
+          <w:sz w:val="28"/>
+          <w:szCs w:val="28"/>
+        </w:rPr>
+        <w:t xml:space="preserve"> маршрутизирует UDP-пакеты.</w:t>
       </w:r>
     </w:p>
     <w:sectPr>
@@ -20036,6 +22358,119 @@
     </w:lvl>
   </w:abstractNum>
   <w:abstractNum w:abstractNumId="3" w15:restartNumberingAfterBreak="0">
+    <w:nsid w:val="126C69B9"/>
+    <w:multiLevelType w:val="multilevel"/>
+    <w:tmpl w:val="42308C5E"/>
+    <w:lvl w:ilvl="0">
+      <w:start w:val="1"/>
+      <w:numFmt w:val="decimal"/>
+      <w:lvlText w:val="%1."/>
+      <w:lvlJc w:val="left"/>
+      <w:pPr>
+        <w:tabs>
+          <w:tab w:val="num" w:pos="720"/>
+        </w:tabs>
+        <w:ind w:left="720" w:hanging="360"/>
+      </w:pPr>
+    </w:lvl>
+    <w:lvl w:ilvl="1" w:tentative="1">
+      <w:start w:val="1"/>
+      <w:numFmt w:val="decimal"/>
+      <w:lvlText w:val="%2."/>
+      <w:lvlJc w:val="left"/>
+      <w:pPr>
+        <w:tabs>
+          <w:tab w:val="num" w:pos="1440"/>
+        </w:tabs>
+        <w:ind w:left="1440" w:hanging="360"/>
+      </w:pPr>
+    </w:lvl>
+    <w:lvl w:ilvl="2" w:tentative="1">
+      <w:start w:val="1"/>
+      <w:numFmt w:val="decimal"/>
+      <w:lvlText w:val="%3."/>
+      <w:lvlJc w:val="left"/>
+      <w:pPr>
+        <w:tabs>
+          <w:tab w:val="num" w:pos="2160"/>
+        </w:tabs>
+        <w:ind w:left="2160" w:hanging="360"/>
+      </w:pPr>
+    </w:lvl>
+    <w:lvl w:ilvl="3" w:tentative="1">
+      <w:start w:val="1"/>
+      <w:numFmt w:val="decimal"/>
+      <w:lvlText w:val="%4."/>
+      <w:lvlJc w:val="left"/>
+      <w:pPr>
+        <w:tabs>
+          <w:tab w:val="num" w:pos="2880"/>
+        </w:tabs>
+        <w:ind w:left="2880" w:hanging="360"/>
+      </w:pPr>
+    </w:lvl>
+    <w:lvl w:ilvl="4" w:tentative="1">
+      <w:start w:val="1"/>
+      <w:numFmt w:val="decimal"/>
+      <w:lvlText w:val="%5."/>
+      <w:lvlJc w:val="left"/>
+      <w:pPr>
+        <w:tabs>
+          <w:tab w:val="num" w:pos="3600"/>
+        </w:tabs>
+        <w:ind w:left="3600" w:hanging="360"/>
+      </w:pPr>
+    </w:lvl>
+    <w:lvl w:ilvl="5" w:tentative="1">
+      <w:start w:val="1"/>
+      <w:numFmt w:val="decimal"/>
+      <w:lvlText w:val="%6."/>
+      <w:lvlJc w:val="left"/>
+      <w:pPr>
+        <w:tabs>
+          <w:tab w:val="num" w:pos="4320"/>
+        </w:tabs>
+        <w:ind w:left="4320" w:hanging="360"/>
+      </w:pPr>
+    </w:lvl>
+    <w:lvl w:ilvl="6" w:tentative="1">
+      <w:start w:val="1"/>
+      <w:numFmt w:val="decimal"/>
+      <w:lvlText w:val="%7."/>
+      <w:lvlJc w:val="left"/>
+      <w:pPr>
+        <w:tabs>
+          <w:tab w:val="num" w:pos="5040"/>
+        </w:tabs>
+        <w:ind w:left="5040" w:hanging="360"/>
+      </w:pPr>
+    </w:lvl>
+    <w:lvl w:ilvl="7" w:tentative="1">
+      <w:start w:val="1"/>
+      <w:numFmt w:val="decimal"/>
+      <w:lvlText w:val="%8."/>
+      <w:lvlJc w:val="left"/>
+      <w:pPr>
+        <w:tabs>
+          <w:tab w:val="num" w:pos="5760"/>
+        </w:tabs>
+        <w:ind w:left="5760" w:hanging="360"/>
+      </w:pPr>
+    </w:lvl>
+    <w:lvl w:ilvl="8" w:tentative="1">
+      <w:start w:val="1"/>
+      <w:numFmt w:val="decimal"/>
+      <w:lvlText w:val="%9."/>
+      <w:lvlJc w:val="left"/>
+      <w:pPr>
+        <w:tabs>
+          <w:tab w:val="num" w:pos="6480"/>
+        </w:tabs>
+        <w:ind w:left="6480" w:hanging="360"/>
+      </w:pPr>
+    </w:lvl>
+  </w:abstractNum>
+  <w:abstractNum w:abstractNumId="4" w15:restartNumberingAfterBreak="0">
     <w:nsid w:val="1C495B32"/>
     <w:multiLevelType w:val="multilevel"/>
     <w:tmpl w:val="A11EA2CC"/>
@@ -20184,7 +22619,7 @@
       </w:rPr>
     </w:lvl>
   </w:abstractNum>
-  <w:abstractNum w:abstractNumId="4" w15:restartNumberingAfterBreak="0">
+  <w:abstractNum w:abstractNumId="5" w15:restartNumberingAfterBreak="0">
     <w:nsid w:val="1CBF7F43"/>
     <w:multiLevelType w:val="multilevel"/>
     <w:tmpl w:val="FE3CF2C0"/>
@@ -20333,7 +22768,7 @@
       </w:rPr>
     </w:lvl>
   </w:abstractNum>
-  <w:abstractNum w:abstractNumId="5" w15:restartNumberingAfterBreak="0">
+  <w:abstractNum w:abstractNumId="6" w15:restartNumberingAfterBreak="0">
     <w:nsid w:val="20EF2972"/>
     <w:multiLevelType w:val="multilevel"/>
     <w:tmpl w:val="7200E1A6"/>
@@ -20446,7 +22881,7 @@
       </w:pPr>
     </w:lvl>
   </w:abstractNum>
-  <w:abstractNum w:abstractNumId="6" w15:restartNumberingAfterBreak="0">
+  <w:abstractNum w:abstractNumId="7" w15:restartNumberingAfterBreak="0">
     <w:nsid w:val="21945115"/>
     <w:multiLevelType w:val="multilevel"/>
     <w:tmpl w:val="D69473FC"/>
@@ -20595,7 +23030,7 @@
       </w:rPr>
     </w:lvl>
   </w:abstractNum>
-  <w:abstractNum w:abstractNumId="7" w15:restartNumberingAfterBreak="0">
+  <w:abstractNum w:abstractNumId="8" w15:restartNumberingAfterBreak="0">
     <w:nsid w:val="2BA508DE"/>
     <w:multiLevelType w:val="multilevel"/>
     <w:tmpl w:val="B468947A"/>
@@ -20708,7 +23143,7 @@
       </w:pPr>
     </w:lvl>
   </w:abstractNum>
-  <w:abstractNum w:abstractNumId="8" w15:restartNumberingAfterBreak="0">
+  <w:abstractNum w:abstractNumId="9" w15:restartNumberingAfterBreak="0">
     <w:nsid w:val="2BF80618"/>
     <w:multiLevelType w:val="multilevel"/>
     <w:tmpl w:val="E200DA5C"/>
@@ -20857,7 +23292,120 @@
       </w:rPr>
     </w:lvl>
   </w:abstractNum>
-  <w:abstractNum w:abstractNumId="9" w15:restartNumberingAfterBreak="0">
+  <w:abstractNum w:abstractNumId="10" w15:restartNumberingAfterBreak="0">
+    <w:nsid w:val="2ECC1224"/>
+    <w:multiLevelType w:val="multilevel"/>
+    <w:tmpl w:val="2A08DC16"/>
+    <w:lvl w:ilvl="0">
+      <w:start w:val="1"/>
+      <w:numFmt w:val="decimal"/>
+      <w:lvlText w:val="%1."/>
+      <w:lvlJc w:val="left"/>
+      <w:pPr>
+        <w:tabs>
+          <w:tab w:val="num" w:pos="720"/>
+        </w:tabs>
+        <w:ind w:left="720" w:hanging="360"/>
+      </w:pPr>
+    </w:lvl>
+    <w:lvl w:ilvl="1" w:tentative="1">
+      <w:start w:val="1"/>
+      <w:numFmt w:val="decimal"/>
+      <w:lvlText w:val="%2."/>
+      <w:lvlJc w:val="left"/>
+      <w:pPr>
+        <w:tabs>
+          <w:tab w:val="num" w:pos="1440"/>
+        </w:tabs>
+        <w:ind w:left="1440" w:hanging="360"/>
+      </w:pPr>
+    </w:lvl>
+    <w:lvl w:ilvl="2" w:tentative="1">
+      <w:start w:val="1"/>
+      <w:numFmt w:val="decimal"/>
+      <w:lvlText w:val="%3."/>
+      <w:lvlJc w:val="left"/>
+      <w:pPr>
+        <w:tabs>
+          <w:tab w:val="num" w:pos="2160"/>
+        </w:tabs>
+        <w:ind w:left="2160" w:hanging="360"/>
+      </w:pPr>
+    </w:lvl>
+    <w:lvl w:ilvl="3" w:tentative="1">
+      <w:start w:val="1"/>
+      <w:numFmt w:val="decimal"/>
+      <w:lvlText w:val="%4."/>
+      <w:lvlJc w:val="left"/>
+      <w:pPr>
+        <w:tabs>
+          <w:tab w:val="num" w:pos="2880"/>
+        </w:tabs>
+        <w:ind w:left="2880" w:hanging="360"/>
+      </w:pPr>
+    </w:lvl>
+    <w:lvl w:ilvl="4" w:tentative="1">
+      <w:start w:val="1"/>
+      <w:numFmt w:val="decimal"/>
+      <w:lvlText w:val="%5."/>
+      <w:lvlJc w:val="left"/>
+      <w:pPr>
+        <w:tabs>
+          <w:tab w:val="num" w:pos="3600"/>
+        </w:tabs>
+        <w:ind w:left="3600" w:hanging="360"/>
+      </w:pPr>
+    </w:lvl>
+    <w:lvl w:ilvl="5" w:tentative="1">
+      <w:start w:val="1"/>
+      <w:numFmt w:val="decimal"/>
+      <w:lvlText w:val="%6."/>
+      <w:lvlJc w:val="left"/>
+      <w:pPr>
+        <w:tabs>
+          <w:tab w:val="num" w:pos="4320"/>
+        </w:tabs>
+        <w:ind w:left="4320" w:hanging="360"/>
+      </w:pPr>
+    </w:lvl>
+    <w:lvl w:ilvl="6" w:tentative="1">
+      <w:start w:val="1"/>
+      <w:numFmt w:val="decimal"/>
+      <w:lvlText w:val="%7."/>
+      <w:lvlJc w:val="left"/>
+      <w:pPr>
+        <w:tabs>
+          <w:tab w:val="num" w:pos="5040"/>
+        </w:tabs>
+        <w:ind w:left="5040" w:hanging="360"/>
+      </w:pPr>
+    </w:lvl>
+    <w:lvl w:ilvl="7" w:tentative="1">
+      <w:start w:val="1"/>
+      <w:numFmt w:val="decimal"/>
+      <w:lvlText w:val="%8."/>
+      <w:lvlJc w:val="left"/>
+      <w:pPr>
+        <w:tabs>
+          <w:tab w:val="num" w:pos="5760"/>
+        </w:tabs>
+        <w:ind w:left="5760" w:hanging="360"/>
+      </w:pPr>
+    </w:lvl>
+    <w:lvl w:ilvl="8" w:tentative="1">
+      <w:start w:val="1"/>
+      <w:numFmt w:val="decimal"/>
+      <w:lvlText w:val="%9."/>
+      <w:lvlJc w:val="left"/>
+      <w:pPr>
+        <w:tabs>
+          <w:tab w:val="num" w:pos="6480"/>
+        </w:tabs>
+        <w:ind w:left="6480" w:hanging="360"/>
+      </w:pPr>
+    </w:lvl>
+  </w:abstractNum>
+  <w:abstractNum w:abstractNumId="11" w15:restartNumberingAfterBreak="0">
     <w:nsid w:val="309C1DE9"/>
     <w:multiLevelType w:val="multilevel"/>
     <w:tmpl w:val="7292D632"/>
@@ -20970,7 +23518,7 @@
       </w:pPr>
     </w:lvl>
   </w:abstractNum>
-  <w:abstractNum w:abstractNumId="10" w15:restartNumberingAfterBreak="0">
+  <w:abstractNum w:abstractNumId="12" w15:restartNumberingAfterBreak="0">
     <w:nsid w:val="472C34D7"/>
     <w:multiLevelType w:val="multilevel"/>
     <w:tmpl w:val="A73414FE"/>
@@ -21083,7 +23631,7 @@
       </w:pPr>
     </w:lvl>
   </w:abstractNum>
-  <w:abstractNum w:abstractNumId="11" w15:restartNumberingAfterBreak="0">
+  <w:abstractNum w:abstractNumId="13" w15:restartNumberingAfterBreak="0">
     <w:nsid w:val="492F614E"/>
     <w:multiLevelType w:val="multilevel"/>
     <w:tmpl w:val="9730A50A"/>
@@ -21232,7 +23780,120 @@
       </w:rPr>
     </w:lvl>
   </w:abstractNum>
-  <w:abstractNum w:abstractNumId="12" w15:restartNumberingAfterBreak="0">
+  <w:abstractNum w:abstractNumId="14" w15:restartNumberingAfterBreak="0">
+    <w:nsid w:val="526648DD"/>
+    <w:multiLevelType w:val="multilevel"/>
+    <w:tmpl w:val="03FA0346"/>
+    <w:lvl w:ilvl="0">
+      <w:start w:val="1"/>
+      <w:numFmt w:val="decimal"/>
+      <w:lvlText w:val="%1."/>
+      <w:lvlJc w:val="left"/>
+      <w:pPr>
+        <w:tabs>
+          <w:tab w:val="num" w:pos="720"/>
+        </w:tabs>
+        <w:ind w:left="720" w:hanging="360"/>
+      </w:pPr>
+    </w:lvl>
+    <w:lvl w:ilvl="1" w:tentative="1">
+      <w:start w:val="1"/>
+      <w:numFmt w:val="decimal"/>
+      <w:lvlText w:val="%2."/>
+      <w:lvlJc w:val="left"/>
+      <w:pPr>
+        <w:tabs>
+          <w:tab w:val="num" w:pos="1440"/>
+        </w:tabs>
+        <w:ind w:left="1440" w:hanging="360"/>
+      </w:pPr>
+    </w:lvl>
+    <w:lvl w:ilvl="2" w:tentative="1">
+      <w:start w:val="1"/>
+      <w:numFmt w:val="decimal"/>
+      <w:lvlText w:val="%3."/>
+      <w:lvlJc w:val="left"/>
+      <w:pPr>
+        <w:tabs>
+          <w:tab w:val="num" w:pos="2160"/>
+        </w:tabs>
+        <w:ind w:left="2160" w:hanging="360"/>
+      </w:pPr>
+    </w:lvl>
+    <w:lvl w:ilvl="3" w:tentative="1">
+      <w:start w:val="1"/>
+      <w:numFmt w:val="decimal"/>
+      <w:lvlText w:val="%4."/>
+      <w:lvlJc w:val="left"/>
+      <w:pPr>
+        <w:tabs>
+          <w:tab w:val="num" w:pos="2880"/>
+        </w:tabs>
+        <w:ind w:left="2880" w:hanging="360"/>
+      </w:pPr>
+    </w:lvl>
+    <w:lvl w:ilvl="4" w:tentative="1">
+      <w:start w:val="1"/>
+      <w:numFmt w:val="decimal"/>
+      <w:lvlText w:val="%5."/>
+      <w:lvlJc w:val="left"/>
+      <w:pPr>
+        <w:tabs>
+          <w:tab w:val="num" w:pos="3600"/>
+        </w:tabs>
+        <w:ind w:left="3600" w:hanging="360"/>
+      </w:pPr>
+    </w:lvl>
+    <w:lvl w:ilvl="5" w:tentative="1">
+      <w:start w:val="1"/>
+      <w:numFmt w:val="decimal"/>
+      <w:lvlText w:val="%6."/>
+      <w:lvlJc w:val="left"/>
+      <w:pPr>
+        <w:tabs>
+          <w:tab w:val="num" w:pos="4320"/>
+        </w:tabs>
+        <w:ind w:left="4320" w:hanging="360"/>
+      </w:pPr>
+    </w:lvl>
+    <w:lvl w:ilvl="6" w:tentative="1">
+      <w:start w:val="1"/>
+      <w:numFmt w:val="decimal"/>
+      <w:lvlText w:val="%7."/>
+      <w:lvlJc w:val="left"/>
+      <w:pPr>
+        <w:tabs>
+          <w:tab w:val="num" w:pos="5040"/>
+        </w:tabs>
+        <w:ind w:left="5040" w:hanging="360"/>
+      </w:pPr>
+    </w:lvl>
+    <w:lvl w:ilvl="7" w:tentative="1">
+      <w:start w:val="1"/>
+      <w:numFmt w:val="decimal"/>
+      <w:lvlText w:val="%8."/>
+      <w:lvlJc w:val="left"/>
+      <w:pPr>
+        <w:tabs>
+          <w:tab w:val="num" w:pos="5760"/>
+        </w:tabs>
+        <w:ind w:left="5760" w:hanging="360"/>
+      </w:pPr>
+    </w:lvl>
+    <w:lvl w:ilvl="8" w:tentative="1">
+      <w:start w:val="1"/>
+      <w:numFmt w:val="decimal"/>
+      <w:lvlText w:val="%9."/>
+      <w:lvlJc w:val="left"/>
+      <w:pPr>
+        <w:tabs>
+          <w:tab w:val="num" w:pos="6480"/>
+        </w:tabs>
+        <w:ind w:left="6480" w:hanging="360"/>
+      </w:pPr>
+    </w:lvl>
+  </w:abstractNum>
+  <w:abstractNum w:abstractNumId="15" w15:restartNumberingAfterBreak="0">
     <w:nsid w:val="54563ED2"/>
     <w:multiLevelType w:val="multilevel"/>
     <w:tmpl w:val="9B98BBF6"/>
@@ -21345,7 +24006,7 @@
       </w:pPr>
     </w:lvl>
   </w:abstractNum>
-  <w:abstractNum w:abstractNumId="13" w15:restartNumberingAfterBreak="0">
+  <w:abstractNum w:abstractNumId="16" w15:restartNumberingAfterBreak="0">
     <w:nsid w:val="65E97B86"/>
     <w:multiLevelType w:val="multilevel"/>
     <w:tmpl w:val="14E4F060"/>
@@ -21462,7 +24123,7 @@
       </w:pPr>
     </w:lvl>
   </w:abstractNum>
-  <w:abstractNum w:abstractNumId="14" w15:restartNumberingAfterBreak="0">
+  <w:abstractNum w:abstractNumId="17" w15:restartNumberingAfterBreak="0">
     <w:nsid w:val="6C511C8A"/>
     <w:multiLevelType w:val="multilevel"/>
     <w:tmpl w:val="39167D24"/>
@@ -21611,7 +24272,7 @@
       </w:rPr>
     </w:lvl>
   </w:abstractNum>
-  <w:abstractNum w:abstractNumId="15" w15:restartNumberingAfterBreak="0">
+  <w:abstractNum w:abstractNumId="18" w15:restartNumberingAfterBreak="0">
     <w:nsid w:val="6D2E3E29"/>
     <w:multiLevelType w:val="multilevel"/>
     <w:tmpl w:val="EDB49D84"/>
@@ -21728,7 +24389,7 @@
       </w:pPr>
     </w:lvl>
   </w:abstractNum>
-  <w:abstractNum w:abstractNumId="16" w15:restartNumberingAfterBreak="0">
+  <w:abstractNum w:abstractNumId="19" w15:restartNumberingAfterBreak="0">
     <w:nsid w:val="726A197C"/>
     <w:multiLevelType w:val="multilevel"/>
     <w:tmpl w:val="A9CC89BC"/>
@@ -21841,7 +24502,7 @@
       </w:pPr>
     </w:lvl>
   </w:abstractNum>
-  <w:abstractNum w:abstractNumId="17" w15:restartNumberingAfterBreak="0">
+  <w:abstractNum w:abstractNumId="20" w15:restartNumberingAfterBreak="0">
     <w:nsid w:val="788A0E64"/>
     <w:multiLevelType w:val="multilevel"/>
     <w:tmpl w:val="A148E380"/>
@@ -21962,55 +24623,64 @@
     <w:abstractNumId w:val="0"/>
   </w:num>
   <w:num w:numId="2" w16cid:durableId="231043589">
-    <w:abstractNumId w:val="11"/>
+    <w:abstractNumId w:val="13"/>
   </w:num>
   <w:num w:numId="3" w16cid:durableId="2115245080">
-    <w:abstractNumId w:val="9"/>
+    <w:abstractNumId w:val="11"/>
   </w:num>
   <w:num w:numId="4" w16cid:durableId="2000649105">
     <w:abstractNumId w:val="2"/>
   </w:num>
   <w:num w:numId="5" w16cid:durableId="1040863362">
+    <w:abstractNumId w:val="9"/>
+  </w:num>
+  <w:num w:numId="6" w16cid:durableId="558250458">
+    <w:abstractNumId w:val="15"/>
+  </w:num>
+  <w:num w:numId="7" w16cid:durableId="107241665">
+    <w:abstractNumId w:val="7"/>
+  </w:num>
+  <w:num w:numId="8" w16cid:durableId="392117796">
+    <w:abstractNumId w:val="5"/>
+  </w:num>
+  <w:num w:numId="9" w16cid:durableId="95372631">
+    <w:abstractNumId w:val="4"/>
+  </w:num>
+  <w:num w:numId="10" w16cid:durableId="780421020">
+    <w:abstractNumId w:val="17"/>
+  </w:num>
+  <w:num w:numId="11" w16cid:durableId="736171455">
+    <w:abstractNumId w:val="19"/>
+  </w:num>
+  <w:num w:numId="12" w16cid:durableId="1319840302">
     <w:abstractNumId w:val="8"/>
   </w:num>
-  <w:num w:numId="6" w16cid:durableId="558250458">
+  <w:num w:numId="13" w16cid:durableId="1757896924">
     <w:abstractNumId w:val="12"/>
-  </w:num>
-  <w:num w:numId="7" w16cid:durableId="107241665">
-    <w:abstractNumId w:val="6"/>
-  </w:num>
-  <w:num w:numId="8" w16cid:durableId="392117796">
-    <w:abstractNumId w:val="4"/>
-  </w:num>
-  <w:num w:numId="9" w16cid:durableId="95372631">
-    <w:abstractNumId w:val="3"/>
-  </w:num>
-  <w:num w:numId="10" w16cid:durableId="780421020">
-    <w:abstractNumId w:val="14"/>
-  </w:num>
-  <w:num w:numId="11" w16cid:durableId="736171455">
-    <w:abstractNumId w:val="16"/>
-  </w:num>
-  <w:num w:numId="12" w16cid:durableId="1319840302">
-    <w:abstractNumId w:val="7"/>
-  </w:num>
-  <w:num w:numId="13" w16cid:durableId="1757896924">
-    <w:abstractNumId w:val="10"/>
   </w:num>
   <w:num w:numId="14" w16cid:durableId="801119546">
     <w:abstractNumId w:val="1"/>
   </w:num>
   <w:num w:numId="15" w16cid:durableId="534656052">
-    <w:abstractNumId w:val="15"/>
+    <w:abstractNumId w:val="18"/>
   </w:num>
   <w:num w:numId="16" w16cid:durableId="698313090">
-    <w:abstractNumId w:val="13"/>
+    <w:abstractNumId w:val="16"/>
   </w:num>
   <w:num w:numId="17" w16cid:durableId="661936588">
-    <w:abstractNumId w:val="17"/>
+    <w:abstractNumId w:val="20"/>
   </w:num>
   <w:num w:numId="18" w16cid:durableId="596979978">
-    <w:abstractNumId w:val="5"/>
+    <w:abstractNumId w:val="6"/>
+  </w:num>
+  <w:num w:numId="19" w16cid:durableId="1951429723">
+    <w:abstractNumId w:val="10"/>
+  </w:num>
+  <w:num w:numId="20" w16cid:durableId="707141815">
+    <w:abstractNumId w:val="3"/>
+  </w:num>
+  <w:num w:numId="21" w16cid:durableId="174343851">
+    <w:abstractNumId w:val="14"/>
   </w:num>
 </w:numbering>
 </file>
@@ -22415,7 +25085,7 @@
   <w:style w:type="paragraph" w:default="1" w:styleId="a">
     <w:name w:val="Normal"/>
     <w:qFormat/>
-    <w:rsid w:val="006F3A4B"/>
+    <w:rsid w:val="005770C5"/>
   </w:style>
   <w:style w:type="paragraph" w:styleId="1">
     <w:name w:val="heading 1"/>

</xml_diff>

<commit_message>
Add troubleshooting steps for SQL Server TLS connection issues
</commit_message>
<xml_diff>
--- a/docs/Инструкция.docx
+++ b/docs/Инструкция.docx
@@ -71,16 +71,7 @@
           <w:sz w:val="28"/>
           <w:szCs w:val="28"/>
         </w:rPr>
-        <w:t xml:space="preserve"> </w:t>
-      </w:r>
-      <w:proofErr w:type="gramStart"/>
-      <w:r>
-        <w:rPr>
-          <w:rFonts w:ascii="Times New Roman" w:hAnsi="Times New Roman" w:cs="Times New Roman"/>
-          <w:sz w:val="28"/>
-          <w:szCs w:val="28"/>
-        </w:rPr>
-        <w:t xml:space="preserve">в </w:t>
+        <w:t xml:space="preserve"> в </w:t>
       </w:r>
       <w:r>
         <w:rPr>
@@ -89,17 +80,7 @@
           <w:szCs w:val="28"/>
           <w:lang w:val="en-US"/>
         </w:rPr>
-        <w:t>.env</w:t>
-      </w:r>
-      <w:proofErr w:type="gramEnd"/>
-      <w:r>
-        <w:rPr>
-          <w:rFonts w:ascii="Times New Roman" w:hAnsi="Times New Roman" w:cs="Times New Roman"/>
-          <w:sz w:val="28"/>
-          <w:szCs w:val="28"/>
-          <w:lang w:val="en-US"/>
-        </w:rPr>
-        <w:t xml:space="preserve"> </w:t>
+        <w:t xml:space="preserve">.env </w:t>
       </w:r>
       <w:r>
         <w:rPr>
@@ -119,7 +100,6 @@
           <w:szCs w:val="28"/>
         </w:rPr>
       </w:pPr>
-      <w:proofErr w:type="gramStart"/>
       <w:r>
         <w:rPr>
           <w:rFonts w:ascii="Times New Roman" w:hAnsi="Times New Roman" w:cs="Times New Roman"/>
@@ -136,7 +116,6 @@
         </w:rPr>
         <w:t>trustServerCertificate=true</w:t>
       </w:r>
-      <w:proofErr w:type="gramEnd"/>
       <w:r>
         <w:rPr>
           <w:rFonts w:ascii="Times New Roman" w:hAnsi="Times New Roman" w:cs="Times New Roman"/>
@@ -1167,16 +1146,7 @@
           <w:sz w:val="28"/>
           <w:szCs w:val="28"/>
         </w:rPr>
-        <w:t>donor-</w:t>
-      </w:r>
-      <w:proofErr w:type="gramStart"/>
-      <w:r>
-        <w:rPr>
-          <w:rFonts w:ascii="Times New Roman" w:hAnsi="Times New Roman" w:cs="Times New Roman"/>
-          <w:sz w:val="28"/>
-          <w:szCs w:val="28"/>
-        </w:rPr>
-        <w:t>backend:latest</w:t>
+        <w:t>donor-backend:latest</w:t>
       </w:r>
       <w:proofErr w:type="spellEnd"/>
       <w:r>
@@ -1188,7 +1158,6 @@
         <w:t xml:space="preserve"> ./</w:t>
       </w:r>
       <w:proofErr w:type="spellStart"/>
-      <w:proofErr w:type="gramEnd"/>
       <w:r>
         <w:rPr>
           <w:rFonts w:ascii="Times New Roman" w:hAnsi="Times New Roman" w:cs="Times New Roman"/>
@@ -1251,16 +1220,7 @@
           <w:sz w:val="28"/>
           <w:szCs w:val="28"/>
         </w:rPr>
-        <w:t>donor-</w:t>
-      </w:r>
-      <w:proofErr w:type="gramStart"/>
-      <w:r>
-        <w:rPr>
-          <w:rFonts w:ascii="Times New Roman" w:hAnsi="Times New Roman" w:cs="Times New Roman"/>
-          <w:sz w:val="28"/>
-          <w:szCs w:val="28"/>
-        </w:rPr>
-        <w:t>frontend:latest</w:t>
+        <w:t>donor-frontend:latest</w:t>
       </w:r>
       <w:proofErr w:type="spellEnd"/>
       <w:r>
@@ -1272,7 +1232,6 @@
         <w:t xml:space="preserve"> ./</w:t>
       </w:r>
       <w:proofErr w:type="spellStart"/>
-      <w:proofErr w:type="gramEnd"/>
       <w:r>
         <w:rPr>
           <w:rFonts w:ascii="Times New Roman" w:hAnsi="Times New Roman" w:cs="Times New Roman"/>
@@ -1335,16 +1294,7 @@
           <w:sz w:val="28"/>
           <w:szCs w:val="28"/>
         </w:rPr>
-        <w:t>donor-</w:t>
-      </w:r>
-      <w:proofErr w:type="gramStart"/>
-      <w:r>
-        <w:rPr>
-          <w:rFonts w:ascii="Times New Roman" w:hAnsi="Times New Roman" w:cs="Times New Roman"/>
-          <w:sz w:val="28"/>
-          <w:szCs w:val="28"/>
-        </w:rPr>
-        <w:t>importer:latest</w:t>
+        <w:t>donor-importer:latest</w:t>
       </w:r>
       <w:proofErr w:type="spellEnd"/>
       <w:r>
@@ -1356,7 +1306,6 @@
         <w:t xml:space="preserve"> ./</w:t>
       </w:r>
       <w:proofErr w:type="spellStart"/>
-      <w:proofErr w:type="gramEnd"/>
       <w:r>
         <w:rPr>
           <w:rFonts w:ascii="Times New Roman" w:hAnsi="Times New Roman" w:cs="Times New Roman"/>
@@ -1486,7 +1435,6 @@
         <w:t xml:space="preserve"> </w:t>
       </w:r>
       <w:proofErr w:type="spellStart"/>
-      <w:proofErr w:type="gramStart"/>
       <w:r>
         <w:rPr>
           <w:rFonts w:ascii="Times New Roman" w:hAnsi="Times New Roman" w:cs="Times New Roman"/>
@@ -1496,7 +1444,6 @@
         <w:t>nginx:alpine</w:t>
       </w:r>
       <w:proofErr w:type="spellEnd"/>
-      <w:proofErr w:type="gramEnd"/>
     </w:p>
     <w:p>
       <w:pPr>
@@ -1654,19 +1601,9 @@
           <w:sz w:val="28"/>
           <w:szCs w:val="28"/>
         </w:rPr>
-        <w:t>donor-</w:t>
-      </w:r>
-      <w:proofErr w:type="gramStart"/>
-      <w:r>
-        <w:rPr>
-          <w:rFonts w:ascii="Times New Roman" w:hAnsi="Times New Roman" w:cs="Times New Roman"/>
-          <w:sz w:val="28"/>
-          <w:szCs w:val="28"/>
-        </w:rPr>
-        <w:t>backend:latest</w:t>
-      </w:r>
-      <w:proofErr w:type="spellEnd"/>
-      <w:proofErr w:type="gramEnd"/>
+        <w:t>donor-backend:latest</w:t>
+      </w:r>
+      <w:proofErr w:type="spellEnd"/>
       <w:r>
         <w:rPr>
           <w:rFonts w:ascii="Times New Roman" w:hAnsi="Times New Roman" w:cs="Times New Roman"/>
@@ -1682,19 +1619,9 @@
           <w:sz w:val="28"/>
           <w:szCs w:val="28"/>
         </w:rPr>
-        <w:t>donor-</w:t>
-      </w:r>
-      <w:proofErr w:type="gramStart"/>
-      <w:r>
-        <w:rPr>
-          <w:rFonts w:ascii="Times New Roman" w:hAnsi="Times New Roman" w:cs="Times New Roman"/>
-          <w:sz w:val="28"/>
-          <w:szCs w:val="28"/>
-        </w:rPr>
-        <w:t>frontend:latest</w:t>
-      </w:r>
-      <w:proofErr w:type="spellEnd"/>
-      <w:proofErr w:type="gramEnd"/>
+        <w:t>donor-frontend:latest</w:t>
+      </w:r>
+      <w:proofErr w:type="spellEnd"/>
       <w:r>
         <w:rPr>
           <w:rFonts w:ascii="Times New Roman" w:hAnsi="Times New Roman" w:cs="Times New Roman"/>
@@ -1710,19 +1637,9 @@
           <w:sz w:val="28"/>
           <w:szCs w:val="28"/>
         </w:rPr>
-        <w:t>donor-</w:t>
-      </w:r>
-      <w:proofErr w:type="gramStart"/>
-      <w:r>
-        <w:rPr>
-          <w:rFonts w:ascii="Times New Roman" w:hAnsi="Times New Roman" w:cs="Times New Roman"/>
-          <w:sz w:val="28"/>
-          <w:szCs w:val="28"/>
-        </w:rPr>
-        <w:t>importer:latest</w:t>
-      </w:r>
-      <w:proofErr w:type="spellEnd"/>
-      <w:proofErr w:type="gramEnd"/>
+        <w:t>donor-importer:latest</w:t>
+      </w:r>
+      <w:proofErr w:type="spellEnd"/>
       <w:r>
         <w:rPr>
           <w:rFonts w:ascii="Times New Roman" w:hAnsi="Times New Roman" w:cs="Times New Roman"/>
@@ -1732,7 +1649,6 @@
         <w:t xml:space="preserve"> postgres:15-alpine </w:t>
       </w:r>
       <w:proofErr w:type="spellStart"/>
-      <w:proofErr w:type="gramStart"/>
       <w:r>
         <w:rPr>
           <w:rFonts w:ascii="Times New Roman" w:hAnsi="Times New Roman" w:cs="Times New Roman"/>
@@ -1742,7 +1658,6 @@
         <w:t>nginx:alpine</w:t>
       </w:r>
       <w:proofErr w:type="spellEnd"/>
-      <w:proofErr w:type="gramEnd"/>
       <w:r>
         <w:rPr>
           <w:rFonts w:ascii="Times New Roman" w:hAnsi="Times New Roman" w:cs="Times New Roman"/>
@@ -1996,7 +1911,6 @@
           <w:szCs w:val="28"/>
         </w:rPr>
       </w:pPr>
-      <w:proofErr w:type="gramStart"/>
       <w:r>
         <w:rPr>
           <w:rFonts w:ascii="Times New Roman" w:hAnsi="Times New Roman" w:cs="Times New Roman"/>
@@ -2012,16 +1926,7 @@
           <w:sz w:val="28"/>
           <w:szCs w:val="28"/>
         </w:rPr>
-        <w:t>env</w:t>
-      </w:r>
-      <w:proofErr w:type="gramEnd"/>
-      <w:r>
-        <w:rPr>
-          <w:rFonts w:ascii="Times New Roman" w:hAnsi="Times New Roman" w:cs="Times New Roman"/>
-          <w:sz w:val="28"/>
-          <w:szCs w:val="28"/>
-        </w:rPr>
-        <w:t>.example</w:t>
+        <w:t>env.example</w:t>
       </w:r>
       <w:proofErr w:type="spellEnd"/>
       <w:r>
@@ -6051,19 +5956,9 @@
           <w:sz w:val="28"/>
           <w:szCs w:val="28"/>
         </w:rPr>
-        <w:t>donor-</w:t>
-      </w:r>
-      <w:proofErr w:type="gramStart"/>
-      <w:r>
-        <w:rPr>
-          <w:rFonts w:ascii="Times New Roman" w:hAnsi="Times New Roman" w:cs="Times New Roman"/>
-          <w:sz w:val="28"/>
-          <w:szCs w:val="28"/>
-        </w:rPr>
-        <w:t>importer:latest</w:t>
-      </w:r>
-      <w:proofErr w:type="spellEnd"/>
-      <w:proofErr w:type="gramEnd"/>
+        <w:t>donor-importer:latest</w:t>
+      </w:r>
+      <w:proofErr w:type="spellEnd"/>
     </w:p>
     <w:p>
       <w:pPr>
@@ -6925,7 +6820,6 @@
         </w:rPr>
       </w:pPr>
       <w:proofErr w:type="spellStart"/>
-      <w:proofErr w:type="gramStart"/>
       <w:r>
         <w:rPr>
           <w:rFonts w:ascii="Times New Roman" w:hAnsi="Times New Roman" w:cs="Times New Roman"/>
@@ -6950,25 +6844,45 @@
           <w:sz w:val="28"/>
           <w:szCs w:val="28"/>
         </w:rPr>
+        <w:t>env.example</w:t>
+      </w:r>
+      <w:proofErr w:type="spellEnd"/>
+      <w:r>
+        <w:rPr>
+          <w:rFonts w:ascii="Times New Roman" w:hAnsi="Times New Roman" w:cs="Times New Roman"/>
+          <w:sz w:val="28"/>
+          <w:szCs w:val="28"/>
+        </w:rPr>
+        <w:t xml:space="preserve"> .</w:t>
+      </w:r>
+      <w:proofErr w:type="spellStart"/>
+      <w:r>
+        <w:rPr>
+          <w:rFonts w:ascii="Times New Roman" w:hAnsi="Times New Roman" w:cs="Times New Roman"/>
+          <w:sz w:val="28"/>
+          <w:szCs w:val="28"/>
+        </w:rPr>
         <w:t>env</w:t>
       </w:r>
-      <w:proofErr w:type="gramEnd"/>
-      <w:r>
-        <w:rPr>
-          <w:rFonts w:ascii="Times New Roman" w:hAnsi="Times New Roman" w:cs="Times New Roman"/>
-          <w:sz w:val="28"/>
-          <w:szCs w:val="28"/>
-        </w:rPr>
-        <w:t>.</w:t>
-      </w:r>
-      <w:proofErr w:type="gramStart"/>
-      <w:r>
-        <w:rPr>
-          <w:rFonts w:ascii="Times New Roman" w:hAnsi="Times New Roman" w:cs="Times New Roman"/>
-          <w:sz w:val="28"/>
-          <w:szCs w:val="28"/>
-        </w:rPr>
-        <w:t>example</w:t>
+      <w:proofErr w:type="spellEnd"/>
+    </w:p>
+    <w:p>
+      <w:pPr>
+        <w:jc w:val="both"/>
+        <w:rPr>
+          <w:rFonts w:ascii="Times New Roman" w:hAnsi="Times New Roman" w:cs="Times New Roman"/>
+          <w:sz w:val="28"/>
+          <w:szCs w:val="28"/>
+        </w:rPr>
+      </w:pPr>
+      <w:proofErr w:type="spellStart"/>
+      <w:r>
+        <w:rPr>
+          <w:rFonts w:ascii="Times New Roman" w:hAnsi="Times New Roman" w:cs="Times New Roman"/>
+          <w:sz w:val="28"/>
+          <w:szCs w:val="28"/>
+        </w:rPr>
+        <w:t>nano</w:t>
       </w:r>
       <w:proofErr w:type="spellEnd"/>
       <w:r>
@@ -6989,47 +6903,6 @@
         <w:t>env</w:t>
       </w:r>
       <w:proofErr w:type="spellEnd"/>
-      <w:proofErr w:type="gramEnd"/>
-    </w:p>
-    <w:p>
-      <w:pPr>
-        <w:jc w:val="both"/>
-        <w:rPr>
-          <w:rFonts w:ascii="Times New Roman" w:hAnsi="Times New Roman" w:cs="Times New Roman"/>
-          <w:sz w:val="28"/>
-          <w:szCs w:val="28"/>
-        </w:rPr>
-      </w:pPr>
-      <w:proofErr w:type="spellStart"/>
-      <w:proofErr w:type="gramStart"/>
-      <w:r>
-        <w:rPr>
-          <w:rFonts w:ascii="Times New Roman" w:hAnsi="Times New Roman" w:cs="Times New Roman"/>
-          <w:sz w:val="28"/>
-          <w:szCs w:val="28"/>
-        </w:rPr>
-        <w:t>nano</w:t>
-      </w:r>
-      <w:proofErr w:type="spellEnd"/>
-      <w:r>
-        <w:rPr>
-          <w:rFonts w:ascii="Times New Roman" w:hAnsi="Times New Roman" w:cs="Times New Roman"/>
-          <w:sz w:val="28"/>
-          <w:szCs w:val="28"/>
-        </w:rPr>
-        <w:t xml:space="preserve"> .</w:t>
-      </w:r>
-      <w:proofErr w:type="spellStart"/>
-      <w:r>
-        <w:rPr>
-          <w:rFonts w:ascii="Times New Roman" w:hAnsi="Times New Roman" w:cs="Times New Roman"/>
-          <w:sz w:val="28"/>
-          <w:szCs w:val="28"/>
-        </w:rPr>
-        <w:t>env</w:t>
-      </w:r>
-      <w:proofErr w:type="spellEnd"/>
-      <w:proofErr w:type="gramEnd"/>
     </w:p>
     <w:p>
       <w:pPr>
@@ -12179,19 +12052,9 @@
           <w:sz w:val="28"/>
           <w:szCs w:val="28"/>
         </w:rPr>
-        <w:t>donor-</w:t>
-      </w:r>
-      <w:proofErr w:type="gramStart"/>
-      <w:r>
-        <w:rPr>
-          <w:rFonts w:ascii="Times New Roman" w:hAnsi="Times New Roman" w:cs="Times New Roman"/>
-          <w:sz w:val="28"/>
-          <w:szCs w:val="28"/>
-        </w:rPr>
-        <w:t>backend:latest</w:t>
-      </w:r>
-      <w:proofErr w:type="spellEnd"/>
-      <w:proofErr w:type="gramEnd"/>
+        <w:t>donor-backend:latest</w:t>
+      </w:r>
+      <w:proofErr w:type="spellEnd"/>
       <w:r>
         <w:rPr>
           <w:rFonts w:ascii="Times New Roman" w:hAnsi="Times New Roman" w:cs="Times New Roman"/>
@@ -12954,7 +12817,6 @@
         <w:t xml:space="preserve">2&gt; SELECT TOP 5 [Идентификатор], [Название] FROM </w:t>
       </w:r>
       <w:proofErr w:type="spellStart"/>
-      <w:proofErr w:type="gramStart"/>
       <w:r>
         <w:rPr>
           <w:rFonts w:ascii="Times New Roman" w:hAnsi="Times New Roman" w:cs="Times New Roman"/>
@@ -12970,16 +12832,7 @@
           <w:sz w:val="28"/>
           <w:szCs w:val="28"/>
         </w:rPr>
-        <w:t>.[</w:t>
-      </w:r>
-      <w:proofErr w:type="gramEnd"/>
-      <w:r>
-        <w:rPr>
-          <w:rFonts w:ascii="Times New Roman" w:hAnsi="Times New Roman" w:cs="Times New Roman"/>
-          <w:sz w:val="28"/>
-          <w:szCs w:val="28"/>
-        </w:rPr>
-        <w:t>Оконечное оборудование];</w:t>
+        <w:t>.[Оконечное оборудование];</w:t>
       </w:r>
     </w:p>
     <w:p>
@@ -13323,7 +13176,6 @@
         <w:t xml:space="preserve"> FROM </w:t>
       </w:r>
       <w:proofErr w:type="spellStart"/>
-      <w:proofErr w:type="gramStart"/>
       <w:r>
         <w:rPr>
           <w:rFonts w:ascii="Times New Roman" w:hAnsi="Times New Roman" w:cs="Times New Roman"/>
@@ -13333,7 +13185,6 @@
         <w:t>sys.databases</w:t>
       </w:r>
       <w:proofErr w:type="spellEnd"/>
-      <w:proofErr w:type="gramEnd"/>
       <w:r>
         <w:rPr>
           <w:rFonts w:ascii="Times New Roman" w:hAnsi="Times New Roman" w:cs="Times New Roman"/>
@@ -13358,25 +13209,7 @@
           <w:sz w:val="28"/>
           <w:szCs w:val="28"/>
         </w:rPr>
-        <w:t xml:space="preserve"> = DB_</w:t>
-      </w:r>
-      <w:proofErr w:type="gramStart"/>
-      <w:r>
-        <w:rPr>
-          <w:rFonts w:ascii="Times New Roman" w:hAnsi="Times New Roman" w:cs="Times New Roman"/>
-          <w:sz w:val="28"/>
-          <w:szCs w:val="28"/>
-        </w:rPr>
-        <w:t>NAME(</w:t>
-      </w:r>
-      <w:proofErr w:type="gramEnd"/>
-      <w:r>
-        <w:rPr>
-          <w:rFonts w:ascii="Times New Roman" w:hAnsi="Times New Roman" w:cs="Times New Roman"/>
-          <w:sz w:val="28"/>
-          <w:szCs w:val="28"/>
-        </w:rPr>
-        <w:t>);</w:t>
+        <w:t xml:space="preserve"> = DB_NAME();</w:t>
       </w:r>
     </w:p>
     <w:p>
@@ -13688,7 +13521,6 @@
         <w:t xml:space="preserve"> '</w:t>
       </w:r>
       <w:proofErr w:type="spellStart"/>
-      <w:proofErr w:type="gramStart"/>
       <w:r>
         <w:rPr>
           <w:rFonts w:ascii="Times New Roman" w:hAnsi="Times New Roman" w:cs="Times New Roman"/>
@@ -13698,7 +13530,6 @@
         <w:t>dbo.ИмяТаблицы</w:t>
       </w:r>
       <w:proofErr w:type="spellEnd"/>
-      <w:proofErr w:type="gramEnd"/>
       <w:r>
         <w:rPr>
           <w:rFonts w:ascii="Times New Roman" w:hAnsi="Times New Roman" w:cs="Times New Roman"/>
@@ -13762,7 +13593,6 @@
         <w:t xml:space="preserve"> '</w:t>
       </w:r>
       <w:proofErr w:type="spellStart"/>
-      <w:proofErr w:type="gramStart"/>
       <w:r>
         <w:rPr>
           <w:rFonts w:ascii="Times New Roman" w:hAnsi="Times New Roman" w:cs="Times New Roman"/>
@@ -13772,7 +13602,6 @@
         <w:t>dbo.Asset</w:t>
       </w:r>
       <w:proofErr w:type="spellEnd"/>
-      <w:proofErr w:type="gramEnd"/>
       <w:r>
         <w:rPr>
           <w:rFonts w:ascii="Times New Roman" w:hAnsi="Times New Roman" w:cs="Times New Roman"/>
@@ -14082,19 +13911,9 @@
           <w:sz w:val="28"/>
           <w:szCs w:val="28"/>
         </w:rPr>
-        <w:t>Ключ пользователя: Правда ли, что </w:t>
-      </w:r>
-      <w:proofErr w:type="gramStart"/>
-      <w:r>
-        <w:rPr>
-          <w:rFonts w:ascii="Times New Roman" w:hAnsi="Times New Roman" w:cs="Times New Roman"/>
-          <w:sz w:val="28"/>
-          <w:szCs w:val="28"/>
-        </w:rPr>
-        <w:t>a.[</w:t>
-      </w:r>
-      <w:proofErr w:type="spellStart"/>
-      <w:proofErr w:type="gramEnd"/>
+        <w:t>Ключ пользователя: Правда ли, что a.[</w:t>
+      </w:r>
+      <w:proofErr w:type="spellStart"/>
       <w:r>
         <w:rPr>
           <w:rFonts w:ascii="Times New Roman" w:hAnsi="Times New Roman" w:cs="Times New Roman"/>
@@ -14110,19 +13929,9 @@
           <w:sz w:val="28"/>
           <w:szCs w:val="28"/>
         </w:rPr>
-        <w:t>] ссылается на </w:t>
-      </w:r>
-      <w:proofErr w:type="gramStart"/>
-      <w:r>
-        <w:rPr>
-          <w:rFonts w:ascii="Times New Roman" w:hAnsi="Times New Roman" w:cs="Times New Roman"/>
-          <w:sz w:val="28"/>
-          <w:szCs w:val="28"/>
-        </w:rPr>
-        <w:t>u.[</w:t>
-      </w:r>
-      <w:proofErr w:type="spellStart"/>
-      <w:proofErr w:type="gramEnd"/>
+        <w:t>] ссылается на u.[</w:t>
+      </w:r>
+      <w:proofErr w:type="spellStart"/>
       <w:r>
         <w:rPr>
           <w:rFonts w:ascii="Times New Roman" w:hAnsi="Times New Roman" w:cs="Times New Roman"/>
@@ -14138,25 +13947,7 @@
           <w:sz w:val="28"/>
           <w:szCs w:val="28"/>
         </w:rPr>
-        <w:t>], а не на </w:t>
-      </w:r>
-      <w:proofErr w:type="gramStart"/>
-      <w:r>
-        <w:rPr>
-          <w:rFonts w:ascii="Times New Roman" w:hAnsi="Times New Roman" w:cs="Times New Roman"/>
-          <w:sz w:val="28"/>
-          <w:szCs w:val="28"/>
-        </w:rPr>
-        <w:t>u.[</w:t>
-      </w:r>
-      <w:proofErr w:type="gramEnd"/>
-      <w:r>
-        <w:rPr>
-          <w:rFonts w:ascii="Times New Roman" w:hAnsi="Times New Roman" w:cs="Times New Roman"/>
-          <w:sz w:val="28"/>
-          <w:szCs w:val="28"/>
-        </w:rPr>
-        <w:t>Идентификатор]?</w:t>
+        <w:t>], а не на u.[Идентификатор]?</w:t>
       </w:r>
     </w:p>
     <w:p>
@@ -14212,7 +14003,6 @@
         <w:t xml:space="preserve">], [Фамилия] FROM </w:t>
       </w:r>
       <w:proofErr w:type="spellStart"/>
-      <w:proofErr w:type="gramStart"/>
       <w:r>
         <w:rPr>
           <w:rFonts w:ascii="Times New Roman" w:hAnsi="Times New Roman" w:cs="Times New Roman"/>
@@ -14228,39 +14018,638 @@
           <w:sz w:val="28"/>
           <w:szCs w:val="28"/>
         </w:rPr>
+        <w:t>.[Пользователи] WHERE [</w:t>
+      </w:r>
+      <w:proofErr w:type="spellStart"/>
+      <w:r>
+        <w:rPr>
+          <w:rFonts w:ascii="Times New Roman" w:hAnsi="Times New Roman" w:cs="Times New Roman"/>
+          <w:sz w:val="28"/>
+          <w:szCs w:val="28"/>
+        </w:rPr>
+        <w:t>IMObjID</w:t>
+      </w:r>
+      <w:proofErr w:type="spellEnd"/>
+      <w:r>
+        <w:rPr>
+          <w:rFonts w:ascii="Times New Roman" w:hAnsi="Times New Roman" w:cs="Times New Roman"/>
+          <w:sz w:val="28"/>
+          <w:szCs w:val="28"/>
+        </w:rPr>
+        <w:t>] IS NOT NULL;</w:t>
+      </w:r>
+    </w:p>
+    <w:p>
+      <w:pPr>
+        <w:ind w:left="360"/>
+        <w:jc w:val="both"/>
+        <w:rPr>
+          <w:rFonts w:ascii="Times New Roman" w:hAnsi="Times New Roman" w:cs="Times New Roman"/>
+          <w:sz w:val="28"/>
+          <w:szCs w:val="28"/>
+        </w:rPr>
+      </w:pPr>
+      <w:r>
+        <w:rPr>
+          <w:rFonts w:ascii="Times New Roman" w:hAnsi="Times New Roman" w:cs="Times New Roman"/>
+          <w:sz w:val="28"/>
+          <w:szCs w:val="28"/>
+        </w:rPr>
+        <w:t>GO</w:t>
+      </w:r>
+    </w:p>
+    <w:p>
+      <w:pPr>
+        <w:ind w:left="360"/>
+        <w:jc w:val="both"/>
+        <w:rPr>
+          <w:rFonts w:ascii="Times New Roman" w:hAnsi="Times New Roman" w:cs="Times New Roman"/>
+          <w:sz w:val="28"/>
+          <w:szCs w:val="28"/>
+        </w:rPr>
+      </w:pPr>
+      <w:r>
+        <w:rPr>
+          <w:rFonts w:ascii="Times New Roman" w:hAnsi="Times New Roman" w:cs="Times New Roman"/>
+          <w:sz w:val="28"/>
+          <w:szCs w:val="28"/>
+        </w:rPr>
+        <w:t>SELECT TOP 5 [</w:t>
+      </w:r>
+      <w:proofErr w:type="spellStart"/>
+      <w:r>
+        <w:rPr>
+          <w:rFonts w:ascii="Times New Roman" w:hAnsi="Times New Roman" w:cs="Times New Roman"/>
+          <w:sz w:val="28"/>
+          <w:szCs w:val="28"/>
+        </w:rPr>
+        <w:t>DeviceID</w:t>
+      </w:r>
+      <w:proofErr w:type="spellEnd"/>
+      <w:r>
+        <w:rPr>
+          <w:rFonts w:ascii="Times New Roman" w:hAnsi="Times New Roman" w:cs="Times New Roman"/>
+          <w:sz w:val="28"/>
+          <w:szCs w:val="28"/>
+        </w:rPr>
+        <w:t>], [</w:t>
+      </w:r>
+      <w:proofErr w:type="spellStart"/>
+      <w:r>
+        <w:rPr>
+          <w:rFonts w:ascii="Times New Roman" w:hAnsi="Times New Roman" w:cs="Times New Roman"/>
+          <w:sz w:val="28"/>
+          <w:szCs w:val="28"/>
+        </w:rPr>
+        <w:t>UtilizerID</w:t>
+      </w:r>
+      <w:proofErr w:type="spellEnd"/>
+      <w:r>
+        <w:rPr>
+          <w:rFonts w:ascii="Times New Roman" w:hAnsi="Times New Roman" w:cs="Times New Roman"/>
+          <w:sz w:val="28"/>
+          <w:szCs w:val="28"/>
+        </w:rPr>
+        <w:t xml:space="preserve">] FROM </w:t>
+      </w:r>
+      <w:proofErr w:type="spellStart"/>
+      <w:r>
+        <w:rPr>
+          <w:rFonts w:ascii="Times New Roman" w:hAnsi="Times New Roman" w:cs="Times New Roman"/>
+          <w:sz w:val="28"/>
+          <w:szCs w:val="28"/>
+        </w:rPr>
+        <w:t>dbo</w:t>
+      </w:r>
+      <w:proofErr w:type="spellEnd"/>
+      <w:r>
+        <w:rPr>
+          <w:rFonts w:ascii="Times New Roman" w:hAnsi="Times New Roman" w:cs="Times New Roman"/>
+          <w:sz w:val="28"/>
+          <w:szCs w:val="28"/>
+        </w:rPr>
+        <w:t>.[Asset] WHERE[</w:t>
+      </w:r>
+      <w:proofErr w:type="spellStart"/>
+      <w:r>
+        <w:rPr>
+          <w:rFonts w:ascii="Times New Roman" w:hAnsi="Times New Roman" w:cs="Times New Roman"/>
+          <w:sz w:val="28"/>
+          <w:szCs w:val="28"/>
+        </w:rPr>
+        <w:t>UtilizerClassID</w:t>
+      </w:r>
+      <w:proofErr w:type="spellEnd"/>
+      <w:r>
+        <w:rPr>
+          <w:rFonts w:ascii="Times New Roman" w:hAnsi="Times New Roman" w:cs="Times New Roman"/>
+          <w:sz w:val="28"/>
+          <w:szCs w:val="28"/>
+        </w:rPr>
+        <w:t>] = 9;</w:t>
+      </w:r>
+    </w:p>
+    <w:p>
+      <w:pPr>
+        <w:ind w:left="360"/>
+        <w:jc w:val="both"/>
+        <w:rPr>
+          <w:rFonts w:ascii="Times New Roman" w:hAnsi="Times New Roman" w:cs="Times New Roman"/>
+          <w:sz w:val="28"/>
+          <w:szCs w:val="28"/>
+        </w:rPr>
+      </w:pPr>
+      <w:r>
+        <w:rPr>
+          <w:rFonts w:ascii="Times New Roman" w:hAnsi="Times New Roman" w:cs="Times New Roman"/>
+          <w:sz w:val="28"/>
+          <w:szCs w:val="28"/>
+        </w:rPr>
+        <w:t>GO</w:t>
+      </w:r>
+    </w:p>
+    <w:p>
+      <w:pPr>
+        <w:jc w:val="both"/>
+        <w:rPr>
+          <w:rFonts w:ascii="Times New Roman" w:hAnsi="Times New Roman" w:cs="Times New Roman"/>
+          <w:sz w:val="28"/>
+          <w:szCs w:val="28"/>
+        </w:rPr>
+      </w:pPr>
+      <w:r>
+        <w:rPr>
+          <w:rFonts w:ascii="Times New Roman" w:hAnsi="Times New Roman" w:cs="Times New Roman"/>
+          <w:sz w:val="28"/>
+          <w:szCs w:val="28"/>
+        </w:rPr>
+        <w:t>Сравнить </w:t>
+      </w:r>
+      <w:proofErr w:type="spellStart"/>
+      <w:r>
+        <w:rPr>
+          <w:rFonts w:ascii="Times New Roman" w:hAnsi="Times New Roman" w:cs="Times New Roman"/>
+          <w:sz w:val="28"/>
+          <w:szCs w:val="28"/>
+        </w:rPr>
+        <w:t>UtilizerID</w:t>
+      </w:r>
+      <w:proofErr w:type="spellEnd"/>
+      <w:r>
+        <w:rPr>
+          <w:rFonts w:ascii="Times New Roman" w:hAnsi="Times New Roman" w:cs="Times New Roman"/>
+          <w:sz w:val="28"/>
+          <w:szCs w:val="28"/>
+        </w:rPr>
+        <w:t> из второго запроса с Идентификатор и </w:t>
+      </w:r>
+      <w:proofErr w:type="spellStart"/>
+      <w:r>
+        <w:rPr>
+          <w:rFonts w:ascii="Times New Roman" w:hAnsi="Times New Roman" w:cs="Times New Roman"/>
+          <w:sz w:val="28"/>
+          <w:szCs w:val="28"/>
+        </w:rPr>
+        <w:t>IMObjID</w:t>
+      </w:r>
+      <w:proofErr w:type="spellEnd"/>
+      <w:r>
+        <w:rPr>
+          <w:rFonts w:ascii="Times New Roman" w:hAnsi="Times New Roman" w:cs="Times New Roman"/>
+          <w:sz w:val="28"/>
+          <w:szCs w:val="28"/>
+        </w:rPr>
+        <w:t> из первого.</w:t>
+      </w:r>
+    </w:p>
+    <w:p>
+      <w:pPr>
+        <w:jc w:val="both"/>
+        <w:rPr>
+          <w:rFonts w:ascii="Times New Roman" w:hAnsi="Times New Roman" w:cs="Times New Roman"/>
+          <w:sz w:val="28"/>
+          <w:szCs w:val="28"/>
+        </w:rPr>
+      </w:pPr>
+      <w:r>
+        <w:rPr>
+          <w:rFonts w:ascii="Times New Roman" w:hAnsi="Times New Roman" w:cs="Times New Roman"/>
+          <w:b/>
+          <w:bCs/>
+          <w:sz w:val="28"/>
+          <w:szCs w:val="28"/>
+        </w:rPr>
+        <w:t>2.</w:t>
+      </w:r>
+      <w:r>
+        <w:rPr>
+          <w:rFonts w:ascii="Times New Roman" w:hAnsi="Times New Roman" w:cs="Times New Roman"/>
+          <w:sz w:val="28"/>
+          <w:szCs w:val="28"/>
+        </w:rPr>
+        <w:t xml:space="preserve"> </w:t>
+      </w:r>
+      <w:r>
+        <w:rPr>
+          <w:rFonts w:ascii="Times New Roman" w:hAnsi="Times New Roman" w:cs="Times New Roman"/>
+          <w:sz w:val="28"/>
+          <w:szCs w:val="28"/>
+        </w:rPr>
+        <w:t>Классы (</w:t>
+      </w:r>
+      <w:proofErr w:type="spellStart"/>
+      <w:r>
+        <w:rPr>
+          <w:rFonts w:ascii="Times New Roman" w:hAnsi="Times New Roman" w:cs="Times New Roman"/>
+          <w:sz w:val="28"/>
+          <w:szCs w:val="28"/>
+        </w:rPr>
+        <w:t>ClassID</w:t>
+      </w:r>
+      <w:proofErr w:type="spellEnd"/>
+      <w:r>
+        <w:rPr>
+          <w:rFonts w:ascii="Times New Roman" w:hAnsi="Times New Roman" w:cs="Times New Roman"/>
+          <w:sz w:val="28"/>
+          <w:szCs w:val="28"/>
+        </w:rPr>
+        <w:t xml:space="preserve">): </w:t>
+      </w:r>
+      <w:r>
+        <w:rPr>
+          <w:rFonts w:ascii="Times New Roman" w:hAnsi="Times New Roman" w:cs="Times New Roman"/>
+          <w:sz w:val="28"/>
+          <w:szCs w:val="28"/>
+        </w:rPr>
+        <w:t>д</w:t>
+      </w:r>
+      <w:r>
+        <w:rPr>
+          <w:rFonts w:ascii="Times New Roman" w:hAnsi="Times New Roman" w:cs="Times New Roman"/>
+          <w:sz w:val="28"/>
+          <w:szCs w:val="28"/>
+        </w:rPr>
+        <w:t xml:space="preserve">ействительно ли </w:t>
+      </w:r>
+      <w:proofErr w:type="spellStart"/>
+      <w:r>
+        <w:rPr>
+          <w:rFonts w:ascii="Times New Roman" w:hAnsi="Times New Roman" w:cs="Times New Roman"/>
+          <w:sz w:val="28"/>
+          <w:szCs w:val="28"/>
+        </w:rPr>
+        <w:t>UtilizerClassID</w:t>
+      </w:r>
+      <w:proofErr w:type="spellEnd"/>
+      <w:r>
+        <w:rPr>
+          <w:rFonts w:ascii="Times New Roman" w:hAnsi="Times New Roman" w:cs="Times New Roman"/>
+          <w:sz w:val="28"/>
+          <w:szCs w:val="28"/>
+        </w:rPr>
+        <w:t xml:space="preserve"> = 9 — это Пользователь, а 102 — это Подразделение?</w:t>
+      </w:r>
+    </w:p>
+    <w:p>
+      <w:pPr>
+        <w:jc w:val="both"/>
+        <w:rPr>
+          <w:rFonts w:ascii="Times New Roman" w:hAnsi="Times New Roman" w:cs="Times New Roman"/>
+          <w:sz w:val="28"/>
+          <w:szCs w:val="28"/>
+        </w:rPr>
+      </w:pPr>
+      <w:r>
+        <w:rPr>
+          <w:rFonts w:ascii="Times New Roman" w:hAnsi="Times New Roman" w:cs="Times New Roman"/>
+          <w:sz w:val="28"/>
+          <w:szCs w:val="28"/>
+        </w:rPr>
+        <w:t>SELECT [</w:t>
+      </w:r>
+      <w:proofErr w:type="spellStart"/>
+      <w:r>
+        <w:rPr>
+          <w:rFonts w:ascii="Times New Roman" w:hAnsi="Times New Roman" w:cs="Times New Roman"/>
+          <w:sz w:val="28"/>
+          <w:szCs w:val="28"/>
+        </w:rPr>
+        <w:t>UtilizerClassID</w:t>
+      </w:r>
+      <w:proofErr w:type="spellEnd"/>
+      <w:r>
+        <w:rPr>
+          <w:rFonts w:ascii="Times New Roman" w:hAnsi="Times New Roman" w:cs="Times New Roman"/>
+          <w:sz w:val="28"/>
+          <w:szCs w:val="28"/>
+        </w:rPr>
+        <w:t xml:space="preserve">], COUNT(*) FROM </w:t>
+      </w:r>
+      <w:proofErr w:type="spellStart"/>
+      <w:r>
+        <w:rPr>
+          <w:rFonts w:ascii="Times New Roman" w:hAnsi="Times New Roman" w:cs="Times New Roman"/>
+          <w:sz w:val="28"/>
+          <w:szCs w:val="28"/>
+        </w:rPr>
+        <w:t>dbo</w:t>
+      </w:r>
+      <w:proofErr w:type="spellEnd"/>
+      <w:r>
+        <w:rPr>
+          <w:rFonts w:ascii="Times New Roman" w:hAnsi="Times New Roman" w:cs="Times New Roman"/>
+          <w:sz w:val="28"/>
+          <w:szCs w:val="28"/>
+        </w:rPr>
+        <w:t>.[Asset] GROUP BY[</w:t>
+      </w:r>
+      <w:proofErr w:type="spellStart"/>
+      <w:r>
+        <w:rPr>
+          <w:rFonts w:ascii="Times New Roman" w:hAnsi="Times New Roman" w:cs="Times New Roman"/>
+          <w:sz w:val="28"/>
+          <w:szCs w:val="28"/>
+        </w:rPr>
+        <w:t>UtilizerClassID</w:t>
+      </w:r>
+      <w:proofErr w:type="spellEnd"/>
+      <w:r>
+        <w:rPr>
+          <w:rFonts w:ascii="Times New Roman" w:hAnsi="Times New Roman" w:cs="Times New Roman"/>
+          <w:sz w:val="28"/>
+          <w:szCs w:val="28"/>
+        </w:rPr>
+        <w:t>];</w:t>
+      </w:r>
+    </w:p>
+    <w:p>
+      <w:pPr>
+        <w:jc w:val="both"/>
+        <w:rPr>
+          <w:rFonts w:ascii="Times New Roman" w:hAnsi="Times New Roman" w:cs="Times New Roman"/>
+          <w:sz w:val="28"/>
+          <w:szCs w:val="28"/>
+        </w:rPr>
+      </w:pPr>
+      <w:r>
+        <w:rPr>
+          <w:rFonts w:ascii="Times New Roman" w:hAnsi="Times New Roman" w:cs="Times New Roman"/>
+          <w:sz w:val="28"/>
+          <w:szCs w:val="28"/>
+        </w:rPr>
+        <w:t>GO</w:t>
+      </w:r>
+    </w:p>
+    <w:p>
+      <w:pPr>
+        <w:jc w:val="both"/>
+        <w:rPr>
+          <w:rFonts w:ascii="Times New Roman" w:hAnsi="Times New Roman" w:cs="Times New Roman"/>
+          <w:sz w:val="28"/>
+          <w:szCs w:val="28"/>
+        </w:rPr>
+      </w:pPr>
+      <w:r>
+        <w:rPr>
+          <w:rFonts w:ascii="Times New Roman" w:hAnsi="Times New Roman" w:cs="Times New Roman"/>
+          <w:b/>
+          <w:bCs/>
+          <w:sz w:val="28"/>
+          <w:szCs w:val="28"/>
+        </w:rPr>
+        <w:t>3.</w:t>
+      </w:r>
+      <w:r>
+        <w:rPr>
+          <w:rFonts w:ascii="Times New Roman" w:hAnsi="Times New Roman" w:cs="Times New Roman"/>
+          <w:sz w:val="28"/>
+          <w:szCs w:val="28"/>
+        </w:rPr>
+        <w:t xml:space="preserve"> </w:t>
+      </w:r>
+      <w:r>
+        <w:rPr>
+          <w:rFonts w:ascii="Times New Roman" w:hAnsi="Times New Roman" w:cs="Times New Roman"/>
+          <w:sz w:val="28"/>
+          <w:szCs w:val="28"/>
+        </w:rPr>
+        <w:t>Есть ли у пользователей Отчество ([Отчество]) и может ли оно быть NULL?</w:t>
+      </w:r>
+    </w:p>
+    <w:p>
+      <w:pPr>
+        <w:jc w:val="both"/>
+        <w:rPr>
+          <w:rFonts w:ascii="Times New Roman" w:hAnsi="Times New Roman" w:cs="Times New Roman"/>
+          <w:b/>
+          <w:bCs/>
+          <w:sz w:val="28"/>
+          <w:szCs w:val="28"/>
+        </w:rPr>
+      </w:pPr>
+      <w:r>
+        <w:rPr>
+          <w:rFonts w:ascii="Times New Roman" w:hAnsi="Times New Roman" w:cs="Times New Roman"/>
+          <w:b/>
+          <w:bCs/>
+          <w:sz w:val="28"/>
+          <w:szCs w:val="28"/>
+        </w:rPr>
+        <w:t>Блок 2: Оборудование и Типы (Справочники)</w:t>
+      </w:r>
+    </w:p>
+    <w:p>
+      <w:pPr>
+        <w:jc w:val="both"/>
+        <w:rPr>
+          <w:rFonts w:ascii="Times New Roman" w:hAnsi="Times New Roman" w:cs="Times New Roman"/>
+          <w:sz w:val="28"/>
+          <w:szCs w:val="28"/>
+        </w:rPr>
+      </w:pPr>
+      <w:r>
+        <w:rPr>
+          <w:rFonts w:ascii="Times New Roman" w:hAnsi="Times New Roman" w:cs="Times New Roman"/>
+          <w:b/>
+          <w:bCs/>
+          <w:sz w:val="28"/>
+          <w:szCs w:val="28"/>
+        </w:rPr>
+        <w:t>Таблицы:</w:t>
+      </w:r>
+      <w:r>
+        <w:rPr>
+          <w:rFonts w:ascii="Times New Roman" w:hAnsi="Times New Roman" w:cs="Times New Roman"/>
+          <w:sz w:val="28"/>
+          <w:szCs w:val="28"/>
+        </w:rPr>
+        <w:t> Типы оконечного оборудования, </w:t>
+      </w:r>
+      <w:proofErr w:type="spellStart"/>
+      <w:r>
+        <w:rPr>
+          <w:rFonts w:ascii="Times New Roman" w:hAnsi="Times New Roman" w:cs="Times New Roman"/>
+          <w:sz w:val="28"/>
+          <w:szCs w:val="28"/>
+        </w:rPr>
+        <w:t>ProductCatalogType</w:t>
+      </w:r>
+      <w:proofErr w:type="spellEnd"/>
+      <w:r>
+        <w:rPr>
+          <w:rFonts w:ascii="Times New Roman" w:hAnsi="Times New Roman" w:cs="Times New Roman"/>
+          <w:sz w:val="28"/>
+          <w:szCs w:val="28"/>
+        </w:rPr>
+        <w:t>, Производители.</w:t>
+      </w:r>
+    </w:p>
+    <w:p>
+      <w:pPr>
+        <w:jc w:val="both"/>
+        <w:rPr>
+          <w:rFonts w:ascii="Times New Roman" w:hAnsi="Times New Roman" w:cs="Times New Roman"/>
+          <w:sz w:val="28"/>
+          <w:szCs w:val="28"/>
+        </w:rPr>
+      </w:pPr>
+      <w:r>
+        <w:rPr>
+          <w:rFonts w:ascii="Times New Roman" w:hAnsi="Times New Roman" w:cs="Times New Roman"/>
+          <w:b/>
+          <w:bCs/>
+          <w:sz w:val="28"/>
+          <w:szCs w:val="28"/>
+        </w:rPr>
+        <w:t>1.</w:t>
+      </w:r>
+      <w:r>
+        <w:rPr>
+          <w:rFonts w:ascii="Times New Roman" w:hAnsi="Times New Roman" w:cs="Times New Roman"/>
+          <w:sz w:val="28"/>
+          <w:szCs w:val="28"/>
+        </w:rPr>
+        <w:t xml:space="preserve"> </w:t>
+      </w:r>
+      <w:r>
+        <w:rPr>
+          <w:rFonts w:ascii="Times New Roman" w:hAnsi="Times New Roman" w:cs="Times New Roman"/>
+          <w:sz w:val="28"/>
+          <w:szCs w:val="28"/>
+        </w:rPr>
+        <w:t xml:space="preserve">У всех ли моделей ПК (Типы оконечного оборудования) указан производитель (ИД производителя)? </w:t>
+      </w:r>
+    </w:p>
+    <w:p>
+      <w:pPr>
+        <w:jc w:val="both"/>
+        <w:rPr>
+          <w:rFonts w:ascii="Times New Roman" w:hAnsi="Times New Roman" w:cs="Times New Roman"/>
+          <w:sz w:val="28"/>
+          <w:szCs w:val="28"/>
+        </w:rPr>
+      </w:pPr>
+      <w:r>
+        <w:rPr>
+          <w:rFonts w:ascii="Times New Roman" w:hAnsi="Times New Roman" w:cs="Times New Roman"/>
+          <w:b/>
+          <w:bCs/>
+          <w:sz w:val="28"/>
+          <w:szCs w:val="28"/>
+        </w:rPr>
+        <w:t>2.</w:t>
+      </w:r>
+      <w:r>
+        <w:rPr>
+          <w:rFonts w:ascii="Times New Roman" w:hAnsi="Times New Roman" w:cs="Times New Roman"/>
+          <w:sz w:val="28"/>
+          <w:szCs w:val="28"/>
+        </w:rPr>
+        <w:t xml:space="preserve"> </w:t>
+      </w:r>
+      <w:r>
+        <w:rPr>
+          <w:rFonts w:ascii="Times New Roman" w:hAnsi="Times New Roman" w:cs="Times New Roman"/>
+          <w:sz w:val="28"/>
+          <w:szCs w:val="28"/>
+        </w:rPr>
+        <w:t>Что лежит в </w:t>
+      </w:r>
+      <w:proofErr w:type="spellStart"/>
+      <w:r>
+        <w:rPr>
+          <w:rFonts w:ascii="Times New Roman" w:hAnsi="Times New Roman" w:cs="Times New Roman"/>
+          <w:sz w:val="28"/>
+          <w:szCs w:val="28"/>
+        </w:rPr>
+        <w:t>ProductCatalogType</w:t>
+      </w:r>
+      <w:proofErr w:type="spellEnd"/>
+      <w:r>
+        <w:rPr>
+          <w:rFonts w:ascii="Times New Roman" w:hAnsi="Times New Roman" w:cs="Times New Roman"/>
+          <w:sz w:val="28"/>
+          <w:szCs w:val="28"/>
+        </w:rPr>
+        <w:t>?</w:t>
+      </w:r>
+    </w:p>
+    <w:p>
+      <w:pPr>
+        <w:jc w:val="both"/>
+        <w:rPr>
+          <w:rFonts w:ascii="Times New Roman" w:hAnsi="Times New Roman" w:cs="Times New Roman"/>
+          <w:sz w:val="28"/>
+          <w:szCs w:val="28"/>
+        </w:rPr>
+      </w:pPr>
+      <w:r>
+        <w:rPr>
+          <w:rFonts w:ascii="Times New Roman" w:hAnsi="Times New Roman" w:cs="Times New Roman"/>
+          <w:sz w:val="28"/>
+          <w:szCs w:val="28"/>
+        </w:rPr>
+        <w:t xml:space="preserve">SELECT TOP 10 [ID], [Name] FROM </w:t>
+      </w:r>
+      <w:proofErr w:type="spellStart"/>
+      <w:r>
+        <w:rPr>
+          <w:rFonts w:ascii="Times New Roman" w:hAnsi="Times New Roman" w:cs="Times New Roman"/>
+          <w:sz w:val="28"/>
+          <w:szCs w:val="28"/>
+        </w:rPr>
+        <w:t>dbo</w:t>
+      </w:r>
+      <w:proofErr w:type="spellEnd"/>
+      <w:r>
+        <w:rPr>
+          <w:rFonts w:ascii="Times New Roman" w:hAnsi="Times New Roman" w:cs="Times New Roman"/>
+          <w:sz w:val="28"/>
+          <w:szCs w:val="28"/>
+        </w:rPr>
         <w:t>.[</w:t>
       </w:r>
-      <w:proofErr w:type="gramEnd"/>
-      <w:r>
-        <w:rPr>
-          <w:rFonts w:ascii="Times New Roman" w:hAnsi="Times New Roman" w:cs="Times New Roman"/>
-          <w:sz w:val="28"/>
-          <w:szCs w:val="28"/>
-        </w:rPr>
-        <w:t>Пользователи] WHERE [</w:t>
-      </w:r>
-      <w:proofErr w:type="spellStart"/>
-      <w:r>
-        <w:rPr>
-          <w:rFonts w:ascii="Times New Roman" w:hAnsi="Times New Roman" w:cs="Times New Roman"/>
-          <w:sz w:val="28"/>
-          <w:szCs w:val="28"/>
-        </w:rPr>
-        <w:t>IMObjID</w:t>
-      </w:r>
-      <w:proofErr w:type="spellEnd"/>
-      <w:r>
-        <w:rPr>
-          <w:rFonts w:ascii="Times New Roman" w:hAnsi="Times New Roman" w:cs="Times New Roman"/>
-          <w:sz w:val="28"/>
-          <w:szCs w:val="28"/>
-        </w:rPr>
-        <w:t>] IS NOT NULL;</w:t>
-      </w:r>
-    </w:p>
-    <w:p>
-      <w:pPr>
-        <w:ind w:left="360"/>
+      <w:proofErr w:type="spellStart"/>
+      <w:r>
+        <w:rPr>
+          <w:rFonts w:ascii="Times New Roman" w:hAnsi="Times New Roman" w:cs="Times New Roman"/>
+          <w:sz w:val="28"/>
+          <w:szCs w:val="28"/>
+        </w:rPr>
+        <w:t>ProductCatalogType</w:t>
+      </w:r>
+      <w:proofErr w:type="spellEnd"/>
+      <w:r>
+        <w:rPr>
+          <w:rFonts w:ascii="Times New Roman" w:hAnsi="Times New Roman" w:cs="Times New Roman"/>
+          <w:sz w:val="28"/>
+          <w:szCs w:val="28"/>
+        </w:rPr>
+        <w:t>];</w:t>
+      </w:r>
+    </w:p>
+    <w:p>
+      <w:pPr>
         <w:jc w:val="both"/>
         <w:rPr>
           <w:rFonts w:ascii="Times New Roman" w:hAnsi="Times New Roman" w:cs="Times New Roman"/>
@@ -14279,60 +14668,80 @@
     </w:p>
     <w:p>
       <w:pPr>
-        <w:ind w:left="360"/>
-        <w:jc w:val="both"/>
-        <w:rPr>
-          <w:rFonts w:ascii="Times New Roman" w:hAnsi="Times New Roman" w:cs="Times New Roman"/>
-          <w:sz w:val="28"/>
-          <w:szCs w:val="28"/>
-        </w:rPr>
-      </w:pPr>
-      <w:r>
-        <w:rPr>
-          <w:rFonts w:ascii="Times New Roman" w:hAnsi="Times New Roman" w:cs="Times New Roman"/>
-          <w:sz w:val="28"/>
-          <w:szCs w:val="28"/>
-        </w:rPr>
-        <w:t>SELECT TOP 5 [</w:t>
-      </w:r>
-      <w:proofErr w:type="spellStart"/>
-      <w:r>
-        <w:rPr>
-          <w:rFonts w:ascii="Times New Roman" w:hAnsi="Times New Roman" w:cs="Times New Roman"/>
-          <w:sz w:val="28"/>
-          <w:szCs w:val="28"/>
-        </w:rPr>
-        <w:t>DeviceID</w:t>
-      </w:r>
-      <w:proofErr w:type="spellEnd"/>
-      <w:r>
-        <w:rPr>
-          <w:rFonts w:ascii="Times New Roman" w:hAnsi="Times New Roman" w:cs="Times New Roman"/>
-          <w:sz w:val="28"/>
-          <w:szCs w:val="28"/>
-        </w:rPr>
-        <w:t>], [</w:t>
-      </w:r>
-      <w:proofErr w:type="spellStart"/>
-      <w:r>
-        <w:rPr>
-          <w:rFonts w:ascii="Times New Roman" w:hAnsi="Times New Roman" w:cs="Times New Roman"/>
-          <w:sz w:val="28"/>
-          <w:szCs w:val="28"/>
-        </w:rPr>
-        <w:t>UtilizerID</w:t>
-      </w:r>
-      <w:proofErr w:type="spellEnd"/>
-      <w:r>
-        <w:rPr>
-          <w:rFonts w:ascii="Times New Roman" w:hAnsi="Times New Roman" w:cs="Times New Roman"/>
-          <w:sz w:val="28"/>
-          <w:szCs w:val="28"/>
-        </w:rPr>
-        <w:t xml:space="preserve">] FROM </w:t>
-      </w:r>
-      <w:proofErr w:type="spellStart"/>
-      <w:proofErr w:type="gramStart"/>
+        <w:jc w:val="both"/>
+        <w:rPr>
+          <w:rFonts w:ascii="Times New Roman" w:hAnsi="Times New Roman" w:cs="Times New Roman"/>
+          <w:b/>
+          <w:bCs/>
+          <w:sz w:val="28"/>
+          <w:szCs w:val="28"/>
+        </w:rPr>
+      </w:pPr>
+      <w:r>
+        <w:rPr>
+          <w:rFonts w:ascii="Times New Roman" w:hAnsi="Times New Roman" w:cs="Times New Roman"/>
+          <w:b/>
+          <w:bCs/>
+          <w:sz w:val="28"/>
+          <w:szCs w:val="28"/>
+        </w:rPr>
+        <w:t>Блок 3: Локации (Здания -&gt; Этажи -&gt; Комнаты -&gt; РМ)</w:t>
+      </w:r>
+    </w:p>
+    <w:p>
+      <w:pPr>
+        <w:jc w:val="both"/>
+        <w:rPr>
+          <w:rFonts w:ascii="Times New Roman" w:hAnsi="Times New Roman" w:cs="Times New Roman"/>
+          <w:sz w:val="28"/>
+          <w:szCs w:val="28"/>
+        </w:rPr>
+      </w:pPr>
+      <w:r>
+        <w:rPr>
+          <w:rFonts w:ascii="Times New Roman" w:hAnsi="Times New Roman" w:cs="Times New Roman"/>
+          <w:b/>
+          <w:bCs/>
+          <w:sz w:val="28"/>
+          <w:szCs w:val="28"/>
+        </w:rPr>
+        <w:t>1.</w:t>
+      </w:r>
+      <w:r>
+        <w:rPr>
+          <w:rFonts w:ascii="Times New Roman" w:hAnsi="Times New Roman" w:cs="Times New Roman"/>
+          <w:sz w:val="28"/>
+          <w:szCs w:val="28"/>
+        </w:rPr>
+        <w:t xml:space="preserve"> </w:t>
+      </w:r>
+      <w:r>
+        <w:rPr>
+          <w:rFonts w:ascii="Times New Roman" w:hAnsi="Times New Roman" w:cs="Times New Roman"/>
+          <w:sz w:val="28"/>
+          <w:szCs w:val="28"/>
+        </w:rPr>
+        <w:t>Может ли компьютер лежать просто в "Здании" без указания "Комнаты"?</w:t>
+      </w:r>
+    </w:p>
+    <w:p>
+      <w:pPr>
+        <w:jc w:val="both"/>
+        <w:rPr>
+          <w:rFonts w:ascii="Times New Roman" w:hAnsi="Times New Roman" w:cs="Times New Roman"/>
+          <w:sz w:val="28"/>
+          <w:szCs w:val="28"/>
+        </w:rPr>
+      </w:pPr>
+      <w:r>
+        <w:rPr>
+          <w:rFonts w:ascii="Times New Roman" w:hAnsi="Times New Roman" w:cs="Times New Roman"/>
+          <w:sz w:val="28"/>
+          <w:szCs w:val="28"/>
+        </w:rPr>
+        <w:t xml:space="preserve">SELECT COUNT(*) FROM </w:t>
+      </w:r>
+      <w:proofErr w:type="spellStart"/>
       <w:r>
         <w:rPr>
           <w:rFonts w:ascii="Times New Roman" w:hAnsi="Times New Roman" w:cs="Times New Roman"/>
@@ -14348,703 +14757,7 @@
           <w:sz w:val="28"/>
           <w:szCs w:val="28"/>
         </w:rPr>
-        <w:t>.[</w:t>
-      </w:r>
-      <w:proofErr w:type="gramEnd"/>
-      <w:r>
-        <w:rPr>
-          <w:rFonts w:ascii="Times New Roman" w:hAnsi="Times New Roman" w:cs="Times New Roman"/>
-          <w:sz w:val="28"/>
-          <w:szCs w:val="28"/>
-        </w:rPr>
-        <w:t>Asset] WHERE[</w:t>
-      </w:r>
-      <w:proofErr w:type="spellStart"/>
-      <w:r>
-        <w:rPr>
-          <w:rFonts w:ascii="Times New Roman" w:hAnsi="Times New Roman" w:cs="Times New Roman"/>
-          <w:sz w:val="28"/>
-          <w:szCs w:val="28"/>
-        </w:rPr>
-        <w:t>UtilizerClassID</w:t>
-      </w:r>
-      <w:proofErr w:type="spellEnd"/>
-      <w:r>
-        <w:rPr>
-          <w:rFonts w:ascii="Times New Roman" w:hAnsi="Times New Roman" w:cs="Times New Roman"/>
-          <w:sz w:val="28"/>
-          <w:szCs w:val="28"/>
-        </w:rPr>
-        <w:t>] = 9;</w:t>
-      </w:r>
-    </w:p>
-    <w:p>
-      <w:pPr>
-        <w:ind w:left="360"/>
-        <w:jc w:val="both"/>
-        <w:rPr>
-          <w:rFonts w:ascii="Times New Roman" w:hAnsi="Times New Roman" w:cs="Times New Roman"/>
-          <w:sz w:val="28"/>
-          <w:szCs w:val="28"/>
-        </w:rPr>
-      </w:pPr>
-      <w:r>
-        <w:rPr>
-          <w:rFonts w:ascii="Times New Roman" w:hAnsi="Times New Roman" w:cs="Times New Roman"/>
-          <w:sz w:val="28"/>
-          <w:szCs w:val="28"/>
-        </w:rPr>
-        <w:t>GO</w:t>
-      </w:r>
-    </w:p>
-    <w:p>
-      <w:pPr>
-        <w:jc w:val="both"/>
-        <w:rPr>
-          <w:rFonts w:ascii="Times New Roman" w:hAnsi="Times New Roman" w:cs="Times New Roman"/>
-          <w:sz w:val="28"/>
-          <w:szCs w:val="28"/>
-        </w:rPr>
-      </w:pPr>
-      <w:r>
-        <w:rPr>
-          <w:rFonts w:ascii="Times New Roman" w:hAnsi="Times New Roman" w:cs="Times New Roman"/>
-          <w:sz w:val="28"/>
-          <w:szCs w:val="28"/>
-        </w:rPr>
-        <w:t>Сравнить </w:t>
-      </w:r>
-      <w:proofErr w:type="spellStart"/>
-      <w:r>
-        <w:rPr>
-          <w:rFonts w:ascii="Times New Roman" w:hAnsi="Times New Roman" w:cs="Times New Roman"/>
-          <w:sz w:val="28"/>
-          <w:szCs w:val="28"/>
-        </w:rPr>
-        <w:t>UtilizerID</w:t>
-      </w:r>
-      <w:proofErr w:type="spellEnd"/>
-      <w:r>
-        <w:rPr>
-          <w:rFonts w:ascii="Times New Roman" w:hAnsi="Times New Roman" w:cs="Times New Roman"/>
-          <w:sz w:val="28"/>
-          <w:szCs w:val="28"/>
-        </w:rPr>
-        <w:t> из второго запроса с Идентификатор и </w:t>
-      </w:r>
-      <w:proofErr w:type="spellStart"/>
-      <w:r>
-        <w:rPr>
-          <w:rFonts w:ascii="Times New Roman" w:hAnsi="Times New Roman" w:cs="Times New Roman"/>
-          <w:sz w:val="28"/>
-          <w:szCs w:val="28"/>
-        </w:rPr>
-        <w:t>IMObjID</w:t>
-      </w:r>
-      <w:proofErr w:type="spellEnd"/>
-      <w:r>
-        <w:rPr>
-          <w:rFonts w:ascii="Times New Roman" w:hAnsi="Times New Roman" w:cs="Times New Roman"/>
-          <w:sz w:val="28"/>
-          <w:szCs w:val="28"/>
-        </w:rPr>
-        <w:t> из первого.</w:t>
-      </w:r>
-    </w:p>
-    <w:p>
-      <w:pPr>
-        <w:jc w:val="both"/>
-        <w:rPr>
-          <w:rFonts w:ascii="Times New Roman" w:hAnsi="Times New Roman" w:cs="Times New Roman"/>
-          <w:sz w:val="28"/>
-          <w:szCs w:val="28"/>
-        </w:rPr>
-      </w:pPr>
-      <w:r>
-        <w:rPr>
-          <w:rFonts w:ascii="Times New Roman" w:hAnsi="Times New Roman" w:cs="Times New Roman"/>
-          <w:b/>
-          <w:bCs/>
-          <w:sz w:val="28"/>
-          <w:szCs w:val="28"/>
-        </w:rPr>
-        <w:t>2.</w:t>
-      </w:r>
-      <w:r>
-        <w:rPr>
-          <w:rFonts w:ascii="Times New Roman" w:hAnsi="Times New Roman" w:cs="Times New Roman"/>
-          <w:sz w:val="28"/>
-          <w:szCs w:val="28"/>
-        </w:rPr>
-        <w:t xml:space="preserve"> </w:t>
-      </w:r>
-      <w:r>
-        <w:rPr>
-          <w:rFonts w:ascii="Times New Roman" w:hAnsi="Times New Roman" w:cs="Times New Roman"/>
-          <w:sz w:val="28"/>
-          <w:szCs w:val="28"/>
-        </w:rPr>
-        <w:t>Классы (</w:t>
-      </w:r>
-      <w:proofErr w:type="spellStart"/>
-      <w:r>
-        <w:rPr>
-          <w:rFonts w:ascii="Times New Roman" w:hAnsi="Times New Roman" w:cs="Times New Roman"/>
-          <w:sz w:val="28"/>
-          <w:szCs w:val="28"/>
-        </w:rPr>
-        <w:t>ClassID</w:t>
-      </w:r>
-      <w:proofErr w:type="spellEnd"/>
-      <w:r>
-        <w:rPr>
-          <w:rFonts w:ascii="Times New Roman" w:hAnsi="Times New Roman" w:cs="Times New Roman"/>
-          <w:sz w:val="28"/>
-          <w:szCs w:val="28"/>
-        </w:rPr>
-        <w:t xml:space="preserve">): </w:t>
-      </w:r>
-      <w:r>
-        <w:rPr>
-          <w:rFonts w:ascii="Times New Roman" w:hAnsi="Times New Roman" w:cs="Times New Roman"/>
-          <w:sz w:val="28"/>
-          <w:szCs w:val="28"/>
-        </w:rPr>
-        <w:t>д</w:t>
-      </w:r>
-      <w:r>
-        <w:rPr>
-          <w:rFonts w:ascii="Times New Roman" w:hAnsi="Times New Roman" w:cs="Times New Roman"/>
-          <w:sz w:val="28"/>
-          <w:szCs w:val="28"/>
-        </w:rPr>
-        <w:t xml:space="preserve">ействительно ли </w:t>
-      </w:r>
-      <w:proofErr w:type="spellStart"/>
-      <w:r>
-        <w:rPr>
-          <w:rFonts w:ascii="Times New Roman" w:hAnsi="Times New Roman" w:cs="Times New Roman"/>
-          <w:sz w:val="28"/>
-          <w:szCs w:val="28"/>
-        </w:rPr>
-        <w:t>UtilizerClassID</w:t>
-      </w:r>
-      <w:proofErr w:type="spellEnd"/>
-      <w:r>
-        <w:rPr>
-          <w:rFonts w:ascii="Times New Roman" w:hAnsi="Times New Roman" w:cs="Times New Roman"/>
-          <w:sz w:val="28"/>
-          <w:szCs w:val="28"/>
-        </w:rPr>
-        <w:t xml:space="preserve"> = 9 — это Пользователь, а 102 — это Подразделение?</w:t>
-      </w:r>
-    </w:p>
-    <w:p>
-      <w:pPr>
-        <w:jc w:val="both"/>
-        <w:rPr>
-          <w:rFonts w:ascii="Times New Roman" w:hAnsi="Times New Roman" w:cs="Times New Roman"/>
-          <w:sz w:val="28"/>
-          <w:szCs w:val="28"/>
-        </w:rPr>
-      </w:pPr>
-      <w:r>
-        <w:rPr>
-          <w:rFonts w:ascii="Times New Roman" w:hAnsi="Times New Roman" w:cs="Times New Roman"/>
-          <w:sz w:val="28"/>
-          <w:szCs w:val="28"/>
-        </w:rPr>
-        <w:t>SELECT [</w:t>
-      </w:r>
-      <w:proofErr w:type="spellStart"/>
-      <w:r>
-        <w:rPr>
-          <w:rFonts w:ascii="Times New Roman" w:hAnsi="Times New Roman" w:cs="Times New Roman"/>
-          <w:sz w:val="28"/>
-          <w:szCs w:val="28"/>
-        </w:rPr>
-        <w:t>UtilizerClassID</w:t>
-      </w:r>
-      <w:proofErr w:type="spellEnd"/>
-      <w:r>
-        <w:rPr>
-          <w:rFonts w:ascii="Times New Roman" w:hAnsi="Times New Roman" w:cs="Times New Roman"/>
-          <w:sz w:val="28"/>
-          <w:szCs w:val="28"/>
-        </w:rPr>
-        <w:t xml:space="preserve">], </w:t>
-      </w:r>
-      <w:proofErr w:type="gramStart"/>
-      <w:r>
-        <w:rPr>
-          <w:rFonts w:ascii="Times New Roman" w:hAnsi="Times New Roman" w:cs="Times New Roman"/>
-          <w:sz w:val="28"/>
-          <w:szCs w:val="28"/>
-        </w:rPr>
-        <w:t>COUNT(</w:t>
-      </w:r>
-      <w:proofErr w:type="gramEnd"/>
-      <w:r>
-        <w:rPr>
-          <w:rFonts w:ascii="Times New Roman" w:hAnsi="Times New Roman" w:cs="Times New Roman"/>
-          <w:sz w:val="28"/>
-          <w:szCs w:val="28"/>
-        </w:rPr>
-        <w:t xml:space="preserve">*) FROM </w:t>
-      </w:r>
-      <w:proofErr w:type="spellStart"/>
-      <w:proofErr w:type="gramStart"/>
-      <w:r>
-        <w:rPr>
-          <w:rFonts w:ascii="Times New Roman" w:hAnsi="Times New Roman" w:cs="Times New Roman"/>
-          <w:sz w:val="28"/>
-          <w:szCs w:val="28"/>
-        </w:rPr>
-        <w:t>dbo</w:t>
-      </w:r>
-      <w:proofErr w:type="spellEnd"/>
-      <w:r>
-        <w:rPr>
-          <w:rFonts w:ascii="Times New Roman" w:hAnsi="Times New Roman" w:cs="Times New Roman"/>
-          <w:sz w:val="28"/>
-          <w:szCs w:val="28"/>
-        </w:rPr>
-        <w:t>.[</w:t>
-      </w:r>
-      <w:proofErr w:type="gramEnd"/>
-      <w:r>
-        <w:rPr>
-          <w:rFonts w:ascii="Times New Roman" w:hAnsi="Times New Roman" w:cs="Times New Roman"/>
-          <w:sz w:val="28"/>
-          <w:szCs w:val="28"/>
-        </w:rPr>
-        <w:t>Asset] GROUP BY[</w:t>
-      </w:r>
-      <w:proofErr w:type="spellStart"/>
-      <w:r>
-        <w:rPr>
-          <w:rFonts w:ascii="Times New Roman" w:hAnsi="Times New Roman" w:cs="Times New Roman"/>
-          <w:sz w:val="28"/>
-          <w:szCs w:val="28"/>
-        </w:rPr>
-        <w:t>UtilizerClassID</w:t>
-      </w:r>
-      <w:proofErr w:type="spellEnd"/>
-      <w:r>
-        <w:rPr>
-          <w:rFonts w:ascii="Times New Roman" w:hAnsi="Times New Roman" w:cs="Times New Roman"/>
-          <w:sz w:val="28"/>
-          <w:szCs w:val="28"/>
-        </w:rPr>
-        <w:t>];</w:t>
-      </w:r>
-    </w:p>
-    <w:p>
-      <w:pPr>
-        <w:jc w:val="both"/>
-        <w:rPr>
-          <w:rFonts w:ascii="Times New Roman" w:hAnsi="Times New Roman" w:cs="Times New Roman"/>
-          <w:sz w:val="28"/>
-          <w:szCs w:val="28"/>
-        </w:rPr>
-      </w:pPr>
-      <w:r>
-        <w:rPr>
-          <w:rFonts w:ascii="Times New Roman" w:hAnsi="Times New Roman" w:cs="Times New Roman"/>
-          <w:sz w:val="28"/>
-          <w:szCs w:val="28"/>
-        </w:rPr>
-        <w:t>GO</w:t>
-      </w:r>
-    </w:p>
-    <w:p>
-      <w:pPr>
-        <w:jc w:val="both"/>
-        <w:rPr>
-          <w:rFonts w:ascii="Times New Roman" w:hAnsi="Times New Roman" w:cs="Times New Roman"/>
-          <w:sz w:val="28"/>
-          <w:szCs w:val="28"/>
-        </w:rPr>
-      </w:pPr>
-      <w:r>
-        <w:rPr>
-          <w:rFonts w:ascii="Times New Roman" w:hAnsi="Times New Roman" w:cs="Times New Roman"/>
-          <w:b/>
-          <w:bCs/>
-          <w:sz w:val="28"/>
-          <w:szCs w:val="28"/>
-        </w:rPr>
-        <w:t>3.</w:t>
-      </w:r>
-      <w:r>
-        <w:rPr>
-          <w:rFonts w:ascii="Times New Roman" w:hAnsi="Times New Roman" w:cs="Times New Roman"/>
-          <w:sz w:val="28"/>
-          <w:szCs w:val="28"/>
-        </w:rPr>
-        <w:t xml:space="preserve"> </w:t>
-      </w:r>
-      <w:r>
-        <w:rPr>
-          <w:rFonts w:ascii="Times New Roman" w:hAnsi="Times New Roman" w:cs="Times New Roman"/>
-          <w:sz w:val="28"/>
-          <w:szCs w:val="28"/>
-        </w:rPr>
-        <w:t>Есть ли у пользователей Отчество ([Отчество]) и может ли оно быть NULL?</w:t>
-      </w:r>
-    </w:p>
-    <w:p>
-      <w:pPr>
-        <w:jc w:val="both"/>
-        <w:rPr>
-          <w:rFonts w:ascii="Times New Roman" w:hAnsi="Times New Roman" w:cs="Times New Roman"/>
-          <w:b/>
-          <w:bCs/>
-          <w:sz w:val="28"/>
-          <w:szCs w:val="28"/>
-        </w:rPr>
-      </w:pPr>
-      <w:r>
-        <w:rPr>
-          <w:rFonts w:ascii="Times New Roman" w:hAnsi="Times New Roman" w:cs="Times New Roman"/>
-          <w:b/>
-          <w:bCs/>
-          <w:sz w:val="28"/>
-          <w:szCs w:val="28"/>
-        </w:rPr>
-        <w:t>Блок 2: Оборудование и Типы (Справочники)</w:t>
-      </w:r>
-    </w:p>
-    <w:p>
-      <w:pPr>
-        <w:jc w:val="both"/>
-        <w:rPr>
-          <w:rFonts w:ascii="Times New Roman" w:hAnsi="Times New Roman" w:cs="Times New Roman"/>
-          <w:sz w:val="28"/>
-          <w:szCs w:val="28"/>
-        </w:rPr>
-      </w:pPr>
-      <w:r>
-        <w:rPr>
-          <w:rFonts w:ascii="Times New Roman" w:hAnsi="Times New Roman" w:cs="Times New Roman"/>
-          <w:b/>
-          <w:bCs/>
-          <w:sz w:val="28"/>
-          <w:szCs w:val="28"/>
-        </w:rPr>
-        <w:t>Таблицы:</w:t>
-      </w:r>
-      <w:r>
-        <w:rPr>
-          <w:rFonts w:ascii="Times New Roman" w:hAnsi="Times New Roman" w:cs="Times New Roman"/>
-          <w:sz w:val="28"/>
-          <w:szCs w:val="28"/>
-        </w:rPr>
-        <w:t> Типы оконечного оборудования, </w:t>
-      </w:r>
-      <w:proofErr w:type="spellStart"/>
-      <w:r>
-        <w:rPr>
-          <w:rFonts w:ascii="Times New Roman" w:hAnsi="Times New Roman" w:cs="Times New Roman"/>
-          <w:sz w:val="28"/>
-          <w:szCs w:val="28"/>
-        </w:rPr>
-        <w:t>ProductCatalogType</w:t>
-      </w:r>
-      <w:proofErr w:type="spellEnd"/>
-      <w:r>
-        <w:rPr>
-          <w:rFonts w:ascii="Times New Roman" w:hAnsi="Times New Roman" w:cs="Times New Roman"/>
-          <w:sz w:val="28"/>
-          <w:szCs w:val="28"/>
-        </w:rPr>
-        <w:t>, Производители.</w:t>
-      </w:r>
-    </w:p>
-    <w:p>
-      <w:pPr>
-        <w:jc w:val="both"/>
-        <w:rPr>
-          <w:rFonts w:ascii="Times New Roman" w:hAnsi="Times New Roman" w:cs="Times New Roman"/>
-          <w:sz w:val="28"/>
-          <w:szCs w:val="28"/>
-        </w:rPr>
-      </w:pPr>
-      <w:r>
-        <w:rPr>
-          <w:rFonts w:ascii="Times New Roman" w:hAnsi="Times New Roman" w:cs="Times New Roman"/>
-          <w:b/>
-          <w:bCs/>
-          <w:sz w:val="28"/>
-          <w:szCs w:val="28"/>
-        </w:rPr>
-        <w:t>1.</w:t>
-      </w:r>
-      <w:r>
-        <w:rPr>
-          <w:rFonts w:ascii="Times New Roman" w:hAnsi="Times New Roman" w:cs="Times New Roman"/>
-          <w:sz w:val="28"/>
-          <w:szCs w:val="28"/>
-        </w:rPr>
-        <w:t xml:space="preserve"> </w:t>
-      </w:r>
-      <w:r>
-        <w:rPr>
-          <w:rFonts w:ascii="Times New Roman" w:hAnsi="Times New Roman" w:cs="Times New Roman"/>
-          <w:sz w:val="28"/>
-          <w:szCs w:val="28"/>
-        </w:rPr>
-        <w:t xml:space="preserve">У всех ли моделей ПК (Типы оконечного оборудования) указан производитель (ИД производителя)? </w:t>
-      </w:r>
-    </w:p>
-    <w:p>
-      <w:pPr>
-        <w:jc w:val="both"/>
-        <w:rPr>
-          <w:rFonts w:ascii="Times New Roman" w:hAnsi="Times New Roman" w:cs="Times New Roman"/>
-          <w:sz w:val="28"/>
-          <w:szCs w:val="28"/>
-        </w:rPr>
-      </w:pPr>
-      <w:r>
-        <w:rPr>
-          <w:rFonts w:ascii="Times New Roman" w:hAnsi="Times New Roman" w:cs="Times New Roman"/>
-          <w:b/>
-          <w:bCs/>
-          <w:sz w:val="28"/>
-          <w:szCs w:val="28"/>
-        </w:rPr>
-        <w:t>2.</w:t>
-      </w:r>
-      <w:r>
-        <w:rPr>
-          <w:rFonts w:ascii="Times New Roman" w:hAnsi="Times New Roman" w:cs="Times New Roman"/>
-          <w:sz w:val="28"/>
-          <w:szCs w:val="28"/>
-        </w:rPr>
-        <w:t xml:space="preserve"> </w:t>
-      </w:r>
-      <w:r>
-        <w:rPr>
-          <w:rFonts w:ascii="Times New Roman" w:hAnsi="Times New Roman" w:cs="Times New Roman"/>
-          <w:sz w:val="28"/>
-          <w:szCs w:val="28"/>
-        </w:rPr>
-        <w:t>Что лежит в </w:t>
-      </w:r>
-      <w:proofErr w:type="spellStart"/>
-      <w:r>
-        <w:rPr>
-          <w:rFonts w:ascii="Times New Roman" w:hAnsi="Times New Roman" w:cs="Times New Roman"/>
-          <w:sz w:val="28"/>
-          <w:szCs w:val="28"/>
-        </w:rPr>
-        <w:t>ProductCatalogType</w:t>
-      </w:r>
-      <w:proofErr w:type="spellEnd"/>
-      <w:r>
-        <w:rPr>
-          <w:rFonts w:ascii="Times New Roman" w:hAnsi="Times New Roman" w:cs="Times New Roman"/>
-          <w:sz w:val="28"/>
-          <w:szCs w:val="28"/>
-        </w:rPr>
-        <w:t>?</w:t>
-      </w:r>
-    </w:p>
-    <w:p>
-      <w:pPr>
-        <w:jc w:val="both"/>
-        <w:rPr>
-          <w:rFonts w:ascii="Times New Roman" w:hAnsi="Times New Roman" w:cs="Times New Roman"/>
-          <w:sz w:val="28"/>
-          <w:szCs w:val="28"/>
-        </w:rPr>
-      </w:pPr>
-      <w:r>
-        <w:rPr>
-          <w:rFonts w:ascii="Times New Roman" w:hAnsi="Times New Roman" w:cs="Times New Roman"/>
-          <w:sz w:val="28"/>
-          <w:szCs w:val="28"/>
-        </w:rPr>
-        <w:t xml:space="preserve">SELECT TOP 10 [ID], [Name] FROM </w:t>
-      </w:r>
-      <w:proofErr w:type="spellStart"/>
-      <w:proofErr w:type="gramStart"/>
-      <w:r>
-        <w:rPr>
-          <w:rFonts w:ascii="Times New Roman" w:hAnsi="Times New Roman" w:cs="Times New Roman"/>
-          <w:sz w:val="28"/>
-          <w:szCs w:val="28"/>
-        </w:rPr>
-        <w:t>dbo</w:t>
-      </w:r>
-      <w:proofErr w:type="spellEnd"/>
-      <w:r>
-        <w:rPr>
-          <w:rFonts w:ascii="Times New Roman" w:hAnsi="Times New Roman" w:cs="Times New Roman"/>
-          <w:sz w:val="28"/>
-          <w:szCs w:val="28"/>
-        </w:rPr>
-        <w:t>.[</w:t>
-      </w:r>
-      <w:proofErr w:type="spellStart"/>
-      <w:proofErr w:type="gramEnd"/>
-      <w:r>
-        <w:rPr>
-          <w:rFonts w:ascii="Times New Roman" w:hAnsi="Times New Roman" w:cs="Times New Roman"/>
-          <w:sz w:val="28"/>
-          <w:szCs w:val="28"/>
-        </w:rPr>
-        <w:t>ProductCatalogType</w:t>
-      </w:r>
-      <w:proofErr w:type="spellEnd"/>
-      <w:r>
-        <w:rPr>
-          <w:rFonts w:ascii="Times New Roman" w:hAnsi="Times New Roman" w:cs="Times New Roman"/>
-          <w:sz w:val="28"/>
-          <w:szCs w:val="28"/>
-        </w:rPr>
-        <w:t>];</w:t>
-      </w:r>
-    </w:p>
-    <w:p>
-      <w:pPr>
-        <w:jc w:val="both"/>
-        <w:rPr>
-          <w:rFonts w:ascii="Times New Roman" w:hAnsi="Times New Roman" w:cs="Times New Roman"/>
-          <w:sz w:val="28"/>
-          <w:szCs w:val="28"/>
-        </w:rPr>
-      </w:pPr>
-      <w:r>
-        <w:rPr>
-          <w:rFonts w:ascii="Times New Roman" w:hAnsi="Times New Roman" w:cs="Times New Roman"/>
-          <w:sz w:val="28"/>
-          <w:szCs w:val="28"/>
-        </w:rPr>
-        <w:t>GO</w:t>
-      </w:r>
-    </w:p>
-    <w:p>
-      <w:pPr>
-        <w:jc w:val="both"/>
-        <w:rPr>
-          <w:rFonts w:ascii="Times New Roman" w:hAnsi="Times New Roman" w:cs="Times New Roman"/>
-          <w:b/>
-          <w:bCs/>
-          <w:sz w:val="28"/>
-          <w:szCs w:val="28"/>
-        </w:rPr>
-      </w:pPr>
-      <w:r>
-        <w:rPr>
-          <w:rFonts w:ascii="Times New Roman" w:hAnsi="Times New Roman" w:cs="Times New Roman"/>
-          <w:b/>
-          <w:bCs/>
-          <w:sz w:val="28"/>
-          <w:szCs w:val="28"/>
-        </w:rPr>
-        <w:t>Блок 3: Локации (Здания -&gt; Этажи -&gt; Комнаты -&gt; РМ)</w:t>
-      </w:r>
-    </w:p>
-    <w:p>
-      <w:pPr>
-        <w:jc w:val="both"/>
-        <w:rPr>
-          <w:rFonts w:ascii="Times New Roman" w:hAnsi="Times New Roman" w:cs="Times New Roman"/>
-          <w:sz w:val="28"/>
-          <w:szCs w:val="28"/>
-        </w:rPr>
-      </w:pPr>
-      <w:r>
-        <w:rPr>
-          <w:rFonts w:ascii="Times New Roman" w:hAnsi="Times New Roman" w:cs="Times New Roman"/>
-          <w:b/>
-          <w:bCs/>
-          <w:sz w:val="28"/>
-          <w:szCs w:val="28"/>
-        </w:rPr>
-        <w:t>1.</w:t>
-      </w:r>
-      <w:r>
-        <w:rPr>
-          <w:rFonts w:ascii="Times New Roman" w:hAnsi="Times New Roman" w:cs="Times New Roman"/>
-          <w:sz w:val="28"/>
-          <w:szCs w:val="28"/>
-        </w:rPr>
-        <w:t xml:space="preserve"> </w:t>
-      </w:r>
-      <w:r>
-        <w:rPr>
-          <w:rFonts w:ascii="Times New Roman" w:hAnsi="Times New Roman" w:cs="Times New Roman"/>
-          <w:sz w:val="28"/>
-          <w:szCs w:val="28"/>
-        </w:rPr>
-        <w:t>Может ли компьютер лежать просто в "Здании" без указания "Комнаты"?</w:t>
-      </w:r>
-    </w:p>
-    <w:p>
-      <w:pPr>
-        <w:jc w:val="both"/>
-        <w:rPr>
-          <w:rFonts w:ascii="Times New Roman" w:hAnsi="Times New Roman" w:cs="Times New Roman"/>
-          <w:sz w:val="28"/>
-          <w:szCs w:val="28"/>
-        </w:rPr>
-      </w:pPr>
-      <w:r>
-        <w:rPr>
-          <w:rFonts w:ascii="Times New Roman" w:hAnsi="Times New Roman" w:cs="Times New Roman"/>
-          <w:sz w:val="28"/>
-          <w:szCs w:val="28"/>
-        </w:rPr>
-        <w:t xml:space="preserve">SELECT </w:t>
-      </w:r>
-      <w:proofErr w:type="gramStart"/>
-      <w:r>
-        <w:rPr>
-          <w:rFonts w:ascii="Times New Roman" w:hAnsi="Times New Roman" w:cs="Times New Roman"/>
-          <w:sz w:val="28"/>
-          <w:szCs w:val="28"/>
-        </w:rPr>
-        <w:t>COUNT(</w:t>
-      </w:r>
-      <w:proofErr w:type="gramEnd"/>
-      <w:r>
-        <w:rPr>
-          <w:rFonts w:ascii="Times New Roman" w:hAnsi="Times New Roman" w:cs="Times New Roman"/>
-          <w:sz w:val="28"/>
-          <w:szCs w:val="28"/>
-        </w:rPr>
-        <w:t xml:space="preserve">*) FROM </w:t>
-      </w:r>
-      <w:proofErr w:type="spellStart"/>
-      <w:proofErr w:type="gramStart"/>
-      <w:r>
-        <w:rPr>
-          <w:rFonts w:ascii="Times New Roman" w:hAnsi="Times New Roman" w:cs="Times New Roman"/>
-          <w:sz w:val="28"/>
-          <w:szCs w:val="28"/>
-        </w:rPr>
-        <w:t>dbo</w:t>
-      </w:r>
-      <w:proofErr w:type="spellEnd"/>
-      <w:r>
-        <w:rPr>
-          <w:rFonts w:ascii="Times New Roman" w:hAnsi="Times New Roman" w:cs="Times New Roman"/>
-          <w:sz w:val="28"/>
-          <w:szCs w:val="28"/>
-        </w:rPr>
-        <w:t>.[</w:t>
-      </w:r>
-      <w:proofErr w:type="gramEnd"/>
-      <w:r>
-        <w:rPr>
-          <w:rFonts w:ascii="Times New Roman" w:hAnsi="Times New Roman" w:cs="Times New Roman"/>
-          <w:sz w:val="28"/>
-          <w:szCs w:val="28"/>
-        </w:rPr>
-        <w:t>Оконечное оборудование] WHERE [ИД комнаты] IS NULL AND [ИД рабочего места] IS NULL;</w:t>
+        <w:t>.[Оконечное оборудование] WHERE [ИД комнаты] IS NULL AND [ИД рабочего места] IS NULL;</w:t>
       </w:r>
     </w:p>
     <w:p>
@@ -15216,7 +14929,6 @@
         <w:t>рать </w:t>
       </w:r>
       <w:proofErr w:type="spellStart"/>
-      <w:proofErr w:type="gramStart"/>
       <w:r>
         <w:rPr>
           <w:rFonts w:ascii="Times New Roman" w:hAnsi="Times New Roman" w:cs="Times New Roman"/>
@@ -15232,19 +14944,295 @@
           <w:sz w:val="28"/>
           <w:szCs w:val="28"/>
         </w:rPr>
+        <w:t>.[Name] или </w:t>
+      </w:r>
+      <w:proofErr w:type="spellStart"/>
+      <w:r>
+        <w:rPr>
+          <w:rFonts w:ascii="Times New Roman" w:hAnsi="Times New Roman" w:cs="Times New Roman"/>
+          <w:sz w:val="28"/>
+          <w:szCs w:val="28"/>
+        </w:rPr>
+        <w:t>at</w:t>
+      </w:r>
+      <w:proofErr w:type="spellEnd"/>
+      <w:r>
+        <w:rPr>
+          <w:rFonts w:ascii="Times New Roman" w:hAnsi="Times New Roman" w:cs="Times New Roman"/>
+          <w:sz w:val="28"/>
+          <w:szCs w:val="28"/>
+        </w:rPr>
+        <w:t>.[Name] (из типа). Посмотр</w:t>
+      </w:r>
+      <w:r>
+        <w:rPr>
+          <w:rFonts w:ascii="Times New Roman" w:hAnsi="Times New Roman" w:cs="Times New Roman"/>
+          <w:sz w:val="28"/>
+          <w:szCs w:val="28"/>
+        </w:rPr>
+        <w:t>еть</w:t>
+      </w:r>
+      <w:r>
+        <w:rPr>
+          <w:rFonts w:ascii="Times New Roman" w:hAnsi="Times New Roman" w:cs="Times New Roman"/>
+          <w:sz w:val="28"/>
+          <w:szCs w:val="28"/>
+        </w:rPr>
+        <w:t>, чем они отличаются:</w:t>
+      </w:r>
+    </w:p>
+    <w:p>
+      <w:pPr>
+        <w:jc w:val="both"/>
+        <w:rPr>
+          <w:rFonts w:ascii="Times New Roman" w:hAnsi="Times New Roman" w:cs="Times New Roman"/>
+          <w:sz w:val="28"/>
+          <w:szCs w:val="28"/>
+        </w:rPr>
+      </w:pPr>
+      <w:r>
+        <w:rPr>
+          <w:rFonts w:ascii="Times New Roman" w:hAnsi="Times New Roman" w:cs="Times New Roman"/>
+          <w:sz w:val="28"/>
+          <w:szCs w:val="28"/>
+        </w:rPr>
+        <w:t xml:space="preserve">SELECT TOP 10 </w:t>
+      </w:r>
+      <w:proofErr w:type="spellStart"/>
+      <w:r>
+        <w:rPr>
+          <w:rFonts w:ascii="Times New Roman" w:hAnsi="Times New Roman" w:cs="Times New Roman"/>
+          <w:sz w:val="28"/>
+          <w:szCs w:val="28"/>
+        </w:rPr>
+        <w:t>ad</w:t>
+      </w:r>
+      <w:proofErr w:type="spellEnd"/>
+      <w:r>
+        <w:rPr>
+          <w:rFonts w:ascii="Times New Roman" w:hAnsi="Times New Roman" w:cs="Times New Roman"/>
+          <w:sz w:val="28"/>
+          <w:szCs w:val="28"/>
+        </w:rPr>
+        <w:t xml:space="preserve">.[Name] AS </w:t>
+      </w:r>
+      <w:proofErr w:type="spellStart"/>
+      <w:r>
+        <w:rPr>
+          <w:rFonts w:ascii="Times New Roman" w:hAnsi="Times New Roman" w:cs="Times New Roman"/>
+          <w:sz w:val="28"/>
+          <w:szCs w:val="28"/>
+        </w:rPr>
+        <w:t>AdapterName</w:t>
+      </w:r>
+      <w:proofErr w:type="spellEnd"/>
+      <w:r>
+        <w:rPr>
+          <w:rFonts w:ascii="Times New Roman" w:hAnsi="Times New Roman" w:cs="Times New Roman"/>
+          <w:sz w:val="28"/>
+          <w:szCs w:val="28"/>
+        </w:rPr>
+        <w:t xml:space="preserve">, </w:t>
+      </w:r>
+      <w:proofErr w:type="spellStart"/>
+      <w:r>
+        <w:rPr>
+          <w:rFonts w:ascii="Times New Roman" w:hAnsi="Times New Roman" w:cs="Times New Roman"/>
+          <w:sz w:val="28"/>
+          <w:szCs w:val="28"/>
+        </w:rPr>
+        <w:t>at</w:t>
+      </w:r>
+      <w:proofErr w:type="spellEnd"/>
+      <w:r>
+        <w:rPr>
+          <w:rFonts w:ascii="Times New Roman" w:hAnsi="Times New Roman" w:cs="Times New Roman"/>
+          <w:sz w:val="28"/>
+          <w:szCs w:val="28"/>
+        </w:rPr>
+        <w:t xml:space="preserve">.[Name] AS </w:t>
+      </w:r>
+      <w:proofErr w:type="spellStart"/>
+      <w:r>
+        <w:rPr>
+          <w:rFonts w:ascii="Times New Roman" w:hAnsi="Times New Roman" w:cs="Times New Roman"/>
+          <w:sz w:val="28"/>
+          <w:szCs w:val="28"/>
+        </w:rPr>
+        <w:t>TypeName</w:t>
+      </w:r>
+      <w:proofErr w:type="spellEnd"/>
+      <w:r>
+        <w:rPr>
+          <w:rFonts w:ascii="Times New Roman" w:hAnsi="Times New Roman" w:cs="Times New Roman"/>
+          <w:sz w:val="28"/>
+          <w:szCs w:val="28"/>
+        </w:rPr>
+        <w:t xml:space="preserve">, </w:t>
+      </w:r>
+      <w:proofErr w:type="spellStart"/>
+      <w:r>
+        <w:rPr>
+          <w:rFonts w:ascii="Times New Roman" w:hAnsi="Times New Roman" w:cs="Times New Roman"/>
+          <w:sz w:val="28"/>
+          <w:szCs w:val="28"/>
+        </w:rPr>
+        <w:t>ad</w:t>
+      </w:r>
+      <w:proofErr w:type="spellEnd"/>
+      <w:r>
+        <w:rPr>
+          <w:rFonts w:ascii="Times New Roman" w:hAnsi="Times New Roman" w:cs="Times New Roman"/>
+          <w:sz w:val="28"/>
+          <w:szCs w:val="28"/>
+        </w:rPr>
         <w:t>.[</w:t>
       </w:r>
-      <w:proofErr w:type="gramEnd"/>
-      <w:r>
-        <w:rPr>
-          <w:rFonts w:ascii="Times New Roman" w:hAnsi="Times New Roman" w:cs="Times New Roman"/>
-          <w:sz w:val="28"/>
-          <w:szCs w:val="28"/>
-        </w:rPr>
-        <w:t>Name] или </w:t>
-      </w:r>
-      <w:proofErr w:type="spellStart"/>
-      <w:proofErr w:type="gramStart"/>
+      <w:proofErr w:type="spellStart"/>
+      <w:r>
+        <w:rPr>
+          <w:rFonts w:ascii="Times New Roman" w:hAnsi="Times New Roman" w:cs="Times New Roman"/>
+          <w:sz w:val="28"/>
+          <w:szCs w:val="28"/>
+        </w:rPr>
+        <w:t>SerialNo</w:t>
+      </w:r>
+      <w:proofErr w:type="spellEnd"/>
+      <w:r>
+        <w:rPr>
+          <w:rFonts w:ascii="Times New Roman" w:hAnsi="Times New Roman" w:cs="Times New Roman"/>
+          <w:sz w:val="28"/>
+          <w:szCs w:val="28"/>
+        </w:rPr>
+        <w:t>]</w:t>
+      </w:r>
+    </w:p>
+    <w:p>
+      <w:pPr>
+        <w:jc w:val="both"/>
+        <w:rPr>
+          <w:rFonts w:ascii="Times New Roman" w:hAnsi="Times New Roman" w:cs="Times New Roman"/>
+          <w:sz w:val="28"/>
+          <w:szCs w:val="28"/>
+        </w:rPr>
+      </w:pPr>
+      <w:r>
+        <w:rPr>
+          <w:rFonts w:ascii="Times New Roman" w:hAnsi="Times New Roman" w:cs="Times New Roman"/>
+          <w:sz w:val="28"/>
+          <w:szCs w:val="28"/>
+        </w:rPr>
+        <w:t xml:space="preserve">FROM </w:t>
+      </w:r>
+      <w:proofErr w:type="spellStart"/>
+      <w:r>
+        <w:rPr>
+          <w:rFonts w:ascii="Times New Roman" w:hAnsi="Times New Roman" w:cs="Times New Roman"/>
+          <w:sz w:val="28"/>
+          <w:szCs w:val="28"/>
+        </w:rPr>
+        <w:t>dbo</w:t>
+      </w:r>
+      <w:proofErr w:type="spellEnd"/>
+      <w:r>
+        <w:rPr>
+          <w:rFonts w:ascii="Times New Roman" w:hAnsi="Times New Roman" w:cs="Times New Roman"/>
+          <w:sz w:val="28"/>
+          <w:szCs w:val="28"/>
+        </w:rPr>
+        <w:t>.[</w:t>
+      </w:r>
+      <w:proofErr w:type="spellStart"/>
+      <w:r>
+        <w:rPr>
+          <w:rFonts w:ascii="Times New Roman" w:hAnsi="Times New Roman" w:cs="Times New Roman"/>
+          <w:sz w:val="28"/>
+          <w:szCs w:val="28"/>
+        </w:rPr>
+        <w:t>Adapter</w:t>
+      </w:r>
+      <w:proofErr w:type="spellEnd"/>
+      <w:r>
+        <w:rPr>
+          <w:rFonts w:ascii="Times New Roman" w:hAnsi="Times New Roman" w:cs="Times New Roman"/>
+          <w:sz w:val="28"/>
+          <w:szCs w:val="28"/>
+        </w:rPr>
+        <w:t xml:space="preserve">] </w:t>
+      </w:r>
+      <w:proofErr w:type="spellStart"/>
+      <w:r>
+        <w:rPr>
+          <w:rFonts w:ascii="Times New Roman" w:hAnsi="Times New Roman" w:cs="Times New Roman"/>
+          <w:sz w:val="28"/>
+          <w:szCs w:val="28"/>
+        </w:rPr>
+        <w:t>ad</w:t>
+      </w:r>
+      <w:proofErr w:type="spellEnd"/>
+      <w:r>
+        <w:rPr>
+          <w:rFonts w:ascii="Times New Roman" w:hAnsi="Times New Roman" w:cs="Times New Roman"/>
+          <w:sz w:val="28"/>
+          <w:szCs w:val="28"/>
+        </w:rPr>
+        <w:t xml:space="preserve"> </w:t>
+      </w:r>
+    </w:p>
+    <w:p>
+      <w:pPr>
+        <w:jc w:val="both"/>
+        <w:rPr>
+          <w:rFonts w:ascii="Times New Roman" w:hAnsi="Times New Roman" w:cs="Times New Roman"/>
+          <w:sz w:val="28"/>
+          <w:szCs w:val="28"/>
+        </w:rPr>
+      </w:pPr>
+      <w:r>
+        <w:rPr>
+          <w:rFonts w:ascii="Times New Roman" w:hAnsi="Times New Roman" w:cs="Times New Roman"/>
+          <w:sz w:val="28"/>
+          <w:szCs w:val="28"/>
+        </w:rPr>
+        <w:t xml:space="preserve">JOIN </w:t>
+      </w:r>
+      <w:proofErr w:type="spellStart"/>
+      <w:r>
+        <w:rPr>
+          <w:rFonts w:ascii="Times New Roman" w:hAnsi="Times New Roman" w:cs="Times New Roman"/>
+          <w:sz w:val="28"/>
+          <w:szCs w:val="28"/>
+        </w:rPr>
+        <w:t>dbo</w:t>
+      </w:r>
+      <w:proofErr w:type="spellEnd"/>
+      <w:r>
+        <w:rPr>
+          <w:rFonts w:ascii="Times New Roman" w:hAnsi="Times New Roman" w:cs="Times New Roman"/>
+          <w:sz w:val="28"/>
+          <w:szCs w:val="28"/>
+        </w:rPr>
+        <w:t>.[</w:t>
+      </w:r>
+      <w:proofErr w:type="spellStart"/>
+      <w:r>
+        <w:rPr>
+          <w:rFonts w:ascii="Times New Roman" w:hAnsi="Times New Roman" w:cs="Times New Roman"/>
+          <w:sz w:val="28"/>
+          <w:szCs w:val="28"/>
+        </w:rPr>
+        <w:t>AdapterType</w:t>
+      </w:r>
+      <w:proofErr w:type="spellEnd"/>
+      <w:r>
+        <w:rPr>
+          <w:rFonts w:ascii="Times New Roman" w:hAnsi="Times New Roman" w:cs="Times New Roman"/>
+          <w:sz w:val="28"/>
+          <w:szCs w:val="28"/>
+        </w:rPr>
+        <w:t xml:space="preserve">] </w:t>
+      </w:r>
+      <w:proofErr w:type="spellStart"/>
       <w:r>
         <w:rPr>
           <w:rFonts w:ascii="Times New Roman" w:hAnsi="Times New Roman" w:cs="Times New Roman"/>
@@ -15260,60 +15248,52 @@
           <w:sz w:val="28"/>
           <w:szCs w:val="28"/>
         </w:rPr>
+        <w:t xml:space="preserve"> ON </w:t>
+      </w:r>
+      <w:proofErr w:type="spellStart"/>
+      <w:r>
+        <w:rPr>
+          <w:rFonts w:ascii="Times New Roman" w:hAnsi="Times New Roman" w:cs="Times New Roman"/>
+          <w:sz w:val="28"/>
+          <w:szCs w:val="28"/>
+        </w:rPr>
+        <w:t>ad</w:t>
+      </w:r>
+      <w:proofErr w:type="spellEnd"/>
+      <w:r>
+        <w:rPr>
+          <w:rFonts w:ascii="Times New Roman" w:hAnsi="Times New Roman" w:cs="Times New Roman"/>
+          <w:sz w:val="28"/>
+          <w:szCs w:val="28"/>
+        </w:rPr>
         <w:t>.[</w:t>
       </w:r>
-      <w:proofErr w:type="gramEnd"/>
-      <w:r>
-        <w:rPr>
-          <w:rFonts w:ascii="Times New Roman" w:hAnsi="Times New Roman" w:cs="Times New Roman"/>
-          <w:sz w:val="28"/>
-          <w:szCs w:val="28"/>
-        </w:rPr>
-        <w:t>Name] (из типа). Посмотр</w:t>
-      </w:r>
-      <w:r>
-        <w:rPr>
-          <w:rFonts w:ascii="Times New Roman" w:hAnsi="Times New Roman" w:cs="Times New Roman"/>
-          <w:sz w:val="28"/>
-          <w:szCs w:val="28"/>
-        </w:rPr>
-        <w:t>еть</w:t>
-      </w:r>
-      <w:r>
-        <w:rPr>
-          <w:rFonts w:ascii="Times New Roman" w:hAnsi="Times New Roman" w:cs="Times New Roman"/>
-          <w:sz w:val="28"/>
-          <w:szCs w:val="28"/>
-        </w:rPr>
-        <w:t>, чем они отличаются:</w:t>
-      </w:r>
-    </w:p>
-    <w:p>
-      <w:pPr>
-        <w:jc w:val="both"/>
-        <w:rPr>
-          <w:rFonts w:ascii="Times New Roman" w:hAnsi="Times New Roman" w:cs="Times New Roman"/>
-          <w:sz w:val="28"/>
-          <w:szCs w:val="28"/>
-        </w:rPr>
-      </w:pPr>
-      <w:r>
-        <w:rPr>
-          <w:rFonts w:ascii="Times New Roman" w:hAnsi="Times New Roman" w:cs="Times New Roman"/>
-          <w:sz w:val="28"/>
-          <w:szCs w:val="28"/>
-        </w:rPr>
-        <w:t xml:space="preserve">SELECT TOP 10 </w:t>
-      </w:r>
-      <w:proofErr w:type="spellStart"/>
-      <w:proofErr w:type="gramStart"/>
-      <w:r>
-        <w:rPr>
-          <w:rFonts w:ascii="Times New Roman" w:hAnsi="Times New Roman" w:cs="Times New Roman"/>
-          <w:sz w:val="28"/>
-          <w:szCs w:val="28"/>
-        </w:rPr>
-        <w:t>ad</w:t>
+      <w:proofErr w:type="spellStart"/>
+      <w:r>
+        <w:rPr>
+          <w:rFonts w:ascii="Times New Roman" w:hAnsi="Times New Roman" w:cs="Times New Roman"/>
+          <w:sz w:val="28"/>
+          <w:szCs w:val="28"/>
+        </w:rPr>
+        <w:t>AdapterTypeID</w:t>
+      </w:r>
+      <w:proofErr w:type="spellEnd"/>
+      <w:r>
+        <w:rPr>
+          <w:rFonts w:ascii="Times New Roman" w:hAnsi="Times New Roman" w:cs="Times New Roman"/>
+          <w:sz w:val="28"/>
+          <w:szCs w:val="28"/>
+        </w:rPr>
+        <w:t xml:space="preserve">] = </w:t>
+      </w:r>
+      <w:proofErr w:type="spellStart"/>
+      <w:r>
+        <w:rPr>
+          <w:rFonts w:ascii="Times New Roman" w:hAnsi="Times New Roman" w:cs="Times New Roman"/>
+          <w:sz w:val="28"/>
+          <w:szCs w:val="28"/>
+        </w:rPr>
+        <w:t>at</w:t>
       </w:r>
       <w:proofErr w:type="spellEnd"/>
       <w:r>
@@ -15324,42 +15304,86 @@
         </w:rPr>
         <w:t>.[</w:t>
       </w:r>
-      <w:proofErr w:type="gramEnd"/>
-      <w:r>
-        <w:rPr>
-          <w:rFonts w:ascii="Times New Roman" w:hAnsi="Times New Roman" w:cs="Times New Roman"/>
-          <w:sz w:val="28"/>
-          <w:szCs w:val="28"/>
-        </w:rPr>
-        <w:t xml:space="preserve">Name] AS </w:t>
-      </w:r>
-      <w:proofErr w:type="spellStart"/>
-      <w:r>
-        <w:rPr>
-          <w:rFonts w:ascii="Times New Roman" w:hAnsi="Times New Roman" w:cs="Times New Roman"/>
-          <w:sz w:val="28"/>
-          <w:szCs w:val="28"/>
-        </w:rPr>
-        <w:t>AdapterName</w:t>
-      </w:r>
-      <w:proofErr w:type="spellEnd"/>
-      <w:r>
-        <w:rPr>
-          <w:rFonts w:ascii="Times New Roman" w:hAnsi="Times New Roman" w:cs="Times New Roman"/>
-          <w:sz w:val="28"/>
-          <w:szCs w:val="28"/>
-        </w:rPr>
-        <w:t xml:space="preserve">, </w:t>
-      </w:r>
-      <w:proofErr w:type="spellStart"/>
-      <w:proofErr w:type="gramStart"/>
-      <w:r>
-        <w:rPr>
-          <w:rFonts w:ascii="Times New Roman" w:hAnsi="Times New Roman" w:cs="Times New Roman"/>
-          <w:sz w:val="28"/>
-          <w:szCs w:val="28"/>
-        </w:rPr>
-        <w:t>at</w:t>
+      <w:proofErr w:type="spellStart"/>
+      <w:r>
+        <w:rPr>
+          <w:rFonts w:ascii="Times New Roman" w:hAnsi="Times New Roman" w:cs="Times New Roman"/>
+          <w:sz w:val="28"/>
+          <w:szCs w:val="28"/>
+        </w:rPr>
+        <w:t>AdapterTypeID</w:t>
+      </w:r>
+      <w:proofErr w:type="spellEnd"/>
+      <w:r>
+        <w:rPr>
+          <w:rFonts w:ascii="Times New Roman" w:hAnsi="Times New Roman" w:cs="Times New Roman"/>
+          <w:sz w:val="28"/>
+          <w:szCs w:val="28"/>
+        </w:rPr>
+        <w:t>];</w:t>
+      </w:r>
+    </w:p>
+    <w:p>
+      <w:pPr>
+        <w:jc w:val="both"/>
+        <w:rPr>
+          <w:rFonts w:ascii="Times New Roman" w:hAnsi="Times New Roman" w:cs="Times New Roman"/>
+          <w:sz w:val="28"/>
+          <w:szCs w:val="28"/>
+        </w:rPr>
+      </w:pPr>
+      <w:r>
+        <w:rPr>
+          <w:rFonts w:ascii="Times New Roman" w:hAnsi="Times New Roman" w:cs="Times New Roman"/>
+          <w:sz w:val="28"/>
+          <w:szCs w:val="28"/>
+        </w:rPr>
+        <w:t>GO</w:t>
+      </w:r>
+    </w:p>
+    <w:p>
+      <w:pPr>
+        <w:jc w:val="both"/>
+        <w:rPr>
+          <w:rFonts w:ascii="Times New Roman" w:hAnsi="Times New Roman" w:cs="Times New Roman"/>
+          <w:sz w:val="28"/>
+          <w:szCs w:val="28"/>
+        </w:rPr>
+      </w:pPr>
+      <w:r>
+        <w:rPr>
+          <w:rFonts w:ascii="Times New Roman" w:hAnsi="Times New Roman" w:cs="Times New Roman"/>
+          <w:b/>
+          <w:bCs/>
+          <w:sz w:val="28"/>
+          <w:szCs w:val="28"/>
+        </w:rPr>
+        <w:t>2.</w:t>
+      </w:r>
+      <w:r>
+        <w:rPr>
+          <w:rFonts w:ascii="Times New Roman" w:hAnsi="Times New Roman" w:cs="Times New Roman"/>
+          <w:sz w:val="28"/>
+          <w:szCs w:val="28"/>
+        </w:rPr>
+        <w:t xml:space="preserve"> </w:t>
+      </w:r>
+      <w:r>
+        <w:rPr>
+          <w:rFonts w:ascii="Times New Roman" w:hAnsi="Times New Roman" w:cs="Times New Roman"/>
+          <w:sz w:val="28"/>
+          <w:szCs w:val="28"/>
+        </w:rPr>
+        <w:t>Где реально лежит производитель детали? В </w:t>
+      </w:r>
+      <w:proofErr w:type="spellStart"/>
+      <w:r>
+        <w:rPr>
+          <w:rFonts w:ascii="Times New Roman" w:hAnsi="Times New Roman" w:cs="Times New Roman"/>
+          <w:sz w:val="28"/>
+          <w:szCs w:val="28"/>
+        </w:rPr>
+        <w:t>AdapterType</w:t>
       </w:r>
       <w:proofErr w:type="spellEnd"/>
       <w:r>
@@ -15370,518 +15394,153 @@
         </w:rPr>
         <w:t>.[</w:t>
       </w:r>
-      <w:proofErr w:type="gramEnd"/>
-      <w:r>
-        <w:rPr>
-          <w:rFonts w:ascii="Times New Roman" w:hAnsi="Times New Roman" w:cs="Times New Roman"/>
-          <w:sz w:val="28"/>
-          <w:szCs w:val="28"/>
-        </w:rPr>
-        <w:t xml:space="preserve">Name] AS </w:t>
-      </w:r>
-      <w:proofErr w:type="spellStart"/>
-      <w:r>
-        <w:rPr>
-          <w:rFonts w:ascii="Times New Roman" w:hAnsi="Times New Roman" w:cs="Times New Roman"/>
-          <w:sz w:val="28"/>
-          <w:szCs w:val="28"/>
-        </w:rPr>
-        <w:t>TypeName</w:t>
-      </w:r>
-      <w:proofErr w:type="spellEnd"/>
-      <w:r>
-        <w:rPr>
-          <w:rFonts w:ascii="Times New Roman" w:hAnsi="Times New Roman" w:cs="Times New Roman"/>
-          <w:sz w:val="28"/>
-          <w:szCs w:val="28"/>
-        </w:rPr>
-        <w:t xml:space="preserve">, </w:t>
-      </w:r>
-      <w:proofErr w:type="spellStart"/>
-      <w:proofErr w:type="gramStart"/>
-      <w:r>
-        <w:rPr>
-          <w:rFonts w:ascii="Times New Roman" w:hAnsi="Times New Roman" w:cs="Times New Roman"/>
-          <w:sz w:val="28"/>
-          <w:szCs w:val="28"/>
-        </w:rPr>
-        <w:t>ad</w:t>
-      </w:r>
-      <w:proofErr w:type="spellEnd"/>
-      <w:r>
-        <w:rPr>
-          <w:rFonts w:ascii="Times New Roman" w:hAnsi="Times New Roman" w:cs="Times New Roman"/>
-          <w:sz w:val="28"/>
-          <w:szCs w:val="28"/>
+      <w:proofErr w:type="spellStart"/>
+      <w:r>
+        <w:rPr>
+          <w:rFonts w:ascii="Times New Roman" w:hAnsi="Times New Roman" w:cs="Times New Roman"/>
+          <w:sz w:val="28"/>
+          <w:szCs w:val="28"/>
+        </w:rPr>
+        <w:t>VendorID</w:t>
+      </w:r>
+      <w:proofErr w:type="spellEnd"/>
+      <w:r>
+        <w:rPr>
+          <w:rFonts w:ascii="Times New Roman" w:hAnsi="Times New Roman" w:cs="Times New Roman"/>
+          <w:sz w:val="28"/>
+          <w:szCs w:val="28"/>
+        </w:rPr>
+        <w:t>]? Бывает ли он NULL?</w:t>
+      </w:r>
+    </w:p>
+    <w:p>
+      <w:pPr>
+        <w:jc w:val="both"/>
+        <w:rPr>
+          <w:rFonts w:ascii="Times New Roman" w:hAnsi="Times New Roman" w:cs="Times New Roman"/>
+          <w:b/>
+          <w:bCs/>
+          <w:sz w:val="28"/>
+          <w:szCs w:val="28"/>
+        </w:rPr>
+      </w:pPr>
+      <w:r>
+        <w:rPr>
+          <w:rFonts w:ascii="Times New Roman" w:hAnsi="Times New Roman" w:cs="Times New Roman"/>
+          <w:b/>
+          <w:bCs/>
+          <w:sz w:val="28"/>
+          <w:szCs w:val="28"/>
+        </w:rPr>
+        <w:t>Блок 5: Статусы (</w:t>
+      </w:r>
+      <w:proofErr w:type="spellStart"/>
+      <w:r>
+        <w:rPr>
+          <w:rFonts w:ascii="Times New Roman" w:hAnsi="Times New Roman" w:cs="Times New Roman"/>
+          <w:b/>
+          <w:bCs/>
+          <w:sz w:val="28"/>
+          <w:szCs w:val="28"/>
+        </w:rPr>
+        <w:t>LifeCycleState</w:t>
+      </w:r>
+      <w:proofErr w:type="spellEnd"/>
+      <w:r>
+        <w:rPr>
+          <w:rFonts w:ascii="Times New Roman" w:hAnsi="Times New Roman" w:cs="Times New Roman"/>
+          <w:b/>
+          <w:bCs/>
+          <w:sz w:val="28"/>
+          <w:szCs w:val="28"/>
+        </w:rPr>
+        <w:t>)</w:t>
+      </w:r>
+      <w:r>
+        <w:rPr>
+          <w:rFonts w:ascii="Times New Roman" w:hAnsi="Times New Roman" w:cs="Times New Roman"/>
+          <w:b/>
+          <w:bCs/>
+          <w:sz w:val="28"/>
+          <w:szCs w:val="28"/>
+        </w:rPr>
+        <w:t>.</w:t>
+      </w:r>
+    </w:p>
+    <w:p>
+      <w:pPr>
+        <w:jc w:val="both"/>
+        <w:rPr>
+          <w:rFonts w:ascii="Times New Roman" w:hAnsi="Times New Roman" w:cs="Times New Roman"/>
+          <w:sz w:val="28"/>
+          <w:szCs w:val="28"/>
+        </w:rPr>
+      </w:pPr>
+      <w:r>
+        <w:rPr>
+          <w:rFonts w:ascii="Times New Roman" w:hAnsi="Times New Roman" w:cs="Times New Roman"/>
+          <w:sz w:val="28"/>
+          <w:szCs w:val="28"/>
+        </w:rPr>
+        <w:t>Н</w:t>
+      </w:r>
+      <w:r>
+        <w:rPr>
+          <w:rFonts w:ascii="Times New Roman" w:hAnsi="Times New Roman" w:cs="Times New Roman"/>
+          <w:sz w:val="28"/>
+          <w:szCs w:val="28"/>
+        </w:rPr>
+        <w:t>ужно узнать точные строковые названия статусов</w:t>
+      </w:r>
+      <w:r>
+        <w:rPr>
+          <w:rFonts w:ascii="Times New Roman" w:hAnsi="Times New Roman" w:cs="Times New Roman"/>
+          <w:sz w:val="28"/>
+          <w:szCs w:val="28"/>
+        </w:rPr>
+        <w:t>:</w:t>
+      </w:r>
+    </w:p>
+    <w:p>
+      <w:pPr>
+        <w:jc w:val="both"/>
+        <w:rPr>
+          <w:rFonts w:ascii="Times New Roman" w:hAnsi="Times New Roman" w:cs="Times New Roman"/>
+          <w:sz w:val="28"/>
+          <w:szCs w:val="28"/>
+          <w:lang w:val="en-US"/>
+        </w:rPr>
+      </w:pPr>
+      <w:r>
+        <w:rPr>
+          <w:rFonts w:ascii="Times New Roman" w:hAnsi="Times New Roman" w:cs="Times New Roman"/>
+          <w:sz w:val="28"/>
+          <w:szCs w:val="28"/>
+          <w:lang w:val="en-US"/>
+        </w:rPr>
+        <w:t xml:space="preserve">SELECT [ID], [Name] FROM </w:t>
+      </w:r>
+      <w:proofErr w:type="spellStart"/>
+      <w:r>
+        <w:rPr>
+          <w:rFonts w:ascii="Times New Roman" w:hAnsi="Times New Roman" w:cs="Times New Roman"/>
+          <w:sz w:val="28"/>
+          <w:szCs w:val="28"/>
+          <w:lang w:val="en-US"/>
+        </w:rPr>
+        <w:t>dbo</w:t>
+      </w:r>
+      <w:proofErr w:type="spellEnd"/>
+      <w:r>
+        <w:rPr>
+          <w:rFonts w:ascii="Times New Roman" w:hAnsi="Times New Roman" w:cs="Times New Roman"/>
+          <w:sz w:val="28"/>
+          <w:szCs w:val="28"/>
+          <w:lang w:val="en-US"/>
         </w:rPr>
         <w:t>.[</w:t>
       </w:r>
       <w:proofErr w:type="spellStart"/>
-      <w:proofErr w:type="gramEnd"/>
-      <w:r>
-        <w:rPr>
-          <w:rFonts w:ascii="Times New Roman" w:hAnsi="Times New Roman" w:cs="Times New Roman"/>
-          <w:sz w:val="28"/>
-          <w:szCs w:val="28"/>
-        </w:rPr>
-        <w:t>SerialNo</w:t>
-      </w:r>
-      <w:proofErr w:type="spellEnd"/>
-      <w:r>
-        <w:rPr>
-          <w:rFonts w:ascii="Times New Roman" w:hAnsi="Times New Roman" w:cs="Times New Roman"/>
-          <w:sz w:val="28"/>
-          <w:szCs w:val="28"/>
-        </w:rPr>
-        <w:t>]</w:t>
-      </w:r>
-    </w:p>
-    <w:p>
-      <w:pPr>
-        <w:jc w:val="both"/>
-        <w:rPr>
-          <w:rFonts w:ascii="Times New Roman" w:hAnsi="Times New Roman" w:cs="Times New Roman"/>
-          <w:sz w:val="28"/>
-          <w:szCs w:val="28"/>
-        </w:rPr>
-      </w:pPr>
-      <w:r>
-        <w:rPr>
-          <w:rFonts w:ascii="Times New Roman" w:hAnsi="Times New Roman" w:cs="Times New Roman"/>
-          <w:sz w:val="28"/>
-          <w:szCs w:val="28"/>
-        </w:rPr>
-        <w:t xml:space="preserve">FROM </w:t>
-      </w:r>
-      <w:proofErr w:type="spellStart"/>
-      <w:proofErr w:type="gramStart"/>
-      <w:r>
-        <w:rPr>
-          <w:rFonts w:ascii="Times New Roman" w:hAnsi="Times New Roman" w:cs="Times New Roman"/>
-          <w:sz w:val="28"/>
-          <w:szCs w:val="28"/>
-        </w:rPr>
-        <w:t>dbo</w:t>
-      </w:r>
-      <w:proofErr w:type="spellEnd"/>
-      <w:r>
-        <w:rPr>
-          <w:rFonts w:ascii="Times New Roman" w:hAnsi="Times New Roman" w:cs="Times New Roman"/>
-          <w:sz w:val="28"/>
-          <w:szCs w:val="28"/>
-        </w:rPr>
-        <w:t>.[</w:t>
-      </w:r>
-      <w:proofErr w:type="spellStart"/>
-      <w:proofErr w:type="gramEnd"/>
-      <w:r>
-        <w:rPr>
-          <w:rFonts w:ascii="Times New Roman" w:hAnsi="Times New Roman" w:cs="Times New Roman"/>
-          <w:sz w:val="28"/>
-          <w:szCs w:val="28"/>
-        </w:rPr>
-        <w:t>Adapter</w:t>
-      </w:r>
-      <w:proofErr w:type="spellEnd"/>
-      <w:r>
-        <w:rPr>
-          <w:rFonts w:ascii="Times New Roman" w:hAnsi="Times New Roman" w:cs="Times New Roman"/>
-          <w:sz w:val="28"/>
-          <w:szCs w:val="28"/>
-        </w:rPr>
-        <w:t xml:space="preserve">] </w:t>
-      </w:r>
-      <w:proofErr w:type="spellStart"/>
-      <w:r>
-        <w:rPr>
-          <w:rFonts w:ascii="Times New Roman" w:hAnsi="Times New Roman" w:cs="Times New Roman"/>
-          <w:sz w:val="28"/>
-          <w:szCs w:val="28"/>
-        </w:rPr>
-        <w:t>ad</w:t>
-      </w:r>
-      <w:proofErr w:type="spellEnd"/>
-      <w:r>
-        <w:rPr>
-          <w:rFonts w:ascii="Times New Roman" w:hAnsi="Times New Roman" w:cs="Times New Roman"/>
-          <w:sz w:val="28"/>
-          <w:szCs w:val="28"/>
-        </w:rPr>
-        <w:t xml:space="preserve"> </w:t>
-      </w:r>
-    </w:p>
-    <w:p>
-      <w:pPr>
-        <w:jc w:val="both"/>
-        <w:rPr>
-          <w:rFonts w:ascii="Times New Roman" w:hAnsi="Times New Roman" w:cs="Times New Roman"/>
-          <w:sz w:val="28"/>
-          <w:szCs w:val="28"/>
-        </w:rPr>
-      </w:pPr>
-      <w:r>
-        <w:rPr>
-          <w:rFonts w:ascii="Times New Roman" w:hAnsi="Times New Roman" w:cs="Times New Roman"/>
-          <w:sz w:val="28"/>
-          <w:szCs w:val="28"/>
-        </w:rPr>
-        <w:t xml:space="preserve">JOIN </w:t>
-      </w:r>
-      <w:proofErr w:type="spellStart"/>
-      <w:proofErr w:type="gramStart"/>
-      <w:r>
-        <w:rPr>
-          <w:rFonts w:ascii="Times New Roman" w:hAnsi="Times New Roman" w:cs="Times New Roman"/>
-          <w:sz w:val="28"/>
-          <w:szCs w:val="28"/>
-        </w:rPr>
-        <w:t>dbo</w:t>
-      </w:r>
-      <w:proofErr w:type="spellEnd"/>
-      <w:r>
-        <w:rPr>
-          <w:rFonts w:ascii="Times New Roman" w:hAnsi="Times New Roman" w:cs="Times New Roman"/>
-          <w:sz w:val="28"/>
-          <w:szCs w:val="28"/>
-        </w:rPr>
-        <w:t>.[</w:t>
-      </w:r>
-      <w:proofErr w:type="spellStart"/>
-      <w:proofErr w:type="gramEnd"/>
-      <w:r>
-        <w:rPr>
-          <w:rFonts w:ascii="Times New Roman" w:hAnsi="Times New Roman" w:cs="Times New Roman"/>
-          <w:sz w:val="28"/>
-          <w:szCs w:val="28"/>
-        </w:rPr>
-        <w:t>AdapterType</w:t>
-      </w:r>
-      <w:proofErr w:type="spellEnd"/>
-      <w:r>
-        <w:rPr>
-          <w:rFonts w:ascii="Times New Roman" w:hAnsi="Times New Roman" w:cs="Times New Roman"/>
-          <w:sz w:val="28"/>
-          <w:szCs w:val="28"/>
-        </w:rPr>
-        <w:t xml:space="preserve">] </w:t>
-      </w:r>
-      <w:proofErr w:type="spellStart"/>
-      <w:r>
-        <w:rPr>
-          <w:rFonts w:ascii="Times New Roman" w:hAnsi="Times New Roman" w:cs="Times New Roman"/>
-          <w:sz w:val="28"/>
-          <w:szCs w:val="28"/>
-        </w:rPr>
-        <w:t>at</w:t>
-      </w:r>
-      <w:proofErr w:type="spellEnd"/>
-      <w:r>
-        <w:rPr>
-          <w:rFonts w:ascii="Times New Roman" w:hAnsi="Times New Roman" w:cs="Times New Roman"/>
-          <w:sz w:val="28"/>
-          <w:szCs w:val="28"/>
-        </w:rPr>
-        <w:t xml:space="preserve"> ON </w:t>
-      </w:r>
-      <w:proofErr w:type="spellStart"/>
-      <w:proofErr w:type="gramStart"/>
-      <w:r>
-        <w:rPr>
-          <w:rFonts w:ascii="Times New Roman" w:hAnsi="Times New Roman" w:cs="Times New Roman"/>
-          <w:sz w:val="28"/>
-          <w:szCs w:val="28"/>
-        </w:rPr>
-        <w:t>ad</w:t>
-      </w:r>
-      <w:proofErr w:type="spellEnd"/>
-      <w:r>
-        <w:rPr>
-          <w:rFonts w:ascii="Times New Roman" w:hAnsi="Times New Roman" w:cs="Times New Roman"/>
-          <w:sz w:val="28"/>
-          <w:szCs w:val="28"/>
-        </w:rPr>
-        <w:t>.[</w:t>
-      </w:r>
-      <w:proofErr w:type="spellStart"/>
-      <w:proofErr w:type="gramEnd"/>
-      <w:r>
-        <w:rPr>
-          <w:rFonts w:ascii="Times New Roman" w:hAnsi="Times New Roman" w:cs="Times New Roman"/>
-          <w:sz w:val="28"/>
-          <w:szCs w:val="28"/>
-        </w:rPr>
-        <w:t>AdapterTypeID</w:t>
-      </w:r>
-      <w:proofErr w:type="spellEnd"/>
-      <w:r>
-        <w:rPr>
-          <w:rFonts w:ascii="Times New Roman" w:hAnsi="Times New Roman" w:cs="Times New Roman"/>
-          <w:sz w:val="28"/>
-          <w:szCs w:val="28"/>
-        </w:rPr>
-        <w:t xml:space="preserve">] = </w:t>
-      </w:r>
-      <w:proofErr w:type="spellStart"/>
-      <w:proofErr w:type="gramStart"/>
-      <w:r>
-        <w:rPr>
-          <w:rFonts w:ascii="Times New Roman" w:hAnsi="Times New Roman" w:cs="Times New Roman"/>
-          <w:sz w:val="28"/>
-          <w:szCs w:val="28"/>
-        </w:rPr>
-        <w:t>at</w:t>
-      </w:r>
-      <w:proofErr w:type="spellEnd"/>
-      <w:r>
-        <w:rPr>
-          <w:rFonts w:ascii="Times New Roman" w:hAnsi="Times New Roman" w:cs="Times New Roman"/>
-          <w:sz w:val="28"/>
-          <w:szCs w:val="28"/>
-        </w:rPr>
-        <w:t>.[</w:t>
-      </w:r>
-      <w:proofErr w:type="spellStart"/>
-      <w:proofErr w:type="gramEnd"/>
-      <w:r>
-        <w:rPr>
-          <w:rFonts w:ascii="Times New Roman" w:hAnsi="Times New Roman" w:cs="Times New Roman"/>
-          <w:sz w:val="28"/>
-          <w:szCs w:val="28"/>
-        </w:rPr>
-        <w:t>AdapterTypeID</w:t>
-      </w:r>
-      <w:proofErr w:type="spellEnd"/>
-      <w:r>
-        <w:rPr>
-          <w:rFonts w:ascii="Times New Roman" w:hAnsi="Times New Roman" w:cs="Times New Roman"/>
-          <w:sz w:val="28"/>
-          <w:szCs w:val="28"/>
-        </w:rPr>
-        <w:t>];</w:t>
-      </w:r>
-    </w:p>
-    <w:p>
-      <w:pPr>
-        <w:jc w:val="both"/>
-        <w:rPr>
-          <w:rFonts w:ascii="Times New Roman" w:hAnsi="Times New Roman" w:cs="Times New Roman"/>
-          <w:sz w:val="28"/>
-          <w:szCs w:val="28"/>
-        </w:rPr>
-      </w:pPr>
-      <w:r>
-        <w:rPr>
-          <w:rFonts w:ascii="Times New Roman" w:hAnsi="Times New Roman" w:cs="Times New Roman"/>
-          <w:sz w:val="28"/>
-          <w:szCs w:val="28"/>
-        </w:rPr>
-        <w:t>GO</w:t>
-      </w:r>
-    </w:p>
-    <w:p>
-      <w:pPr>
-        <w:jc w:val="both"/>
-        <w:rPr>
-          <w:rFonts w:ascii="Times New Roman" w:hAnsi="Times New Roman" w:cs="Times New Roman"/>
-          <w:sz w:val="28"/>
-          <w:szCs w:val="28"/>
-        </w:rPr>
-      </w:pPr>
-      <w:r>
-        <w:rPr>
-          <w:rFonts w:ascii="Times New Roman" w:hAnsi="Times New Roman" w:cs="Times New Roman"/>
-          <w:b/>
-          <w:bCs/>
-          <w:sz w:val="28"/>
-          <w:szCs w:val="28"/>
-        </w:rPr>
-        <w:t>2.</w:t>
-      </w:r>
-      <w:r>
-        <w:rPr>
-          <w:rFonts w:ascii="Times New Roman" w:hAnsi="Times New Roman" w:cs="Times New Roman"/>
-          <w:sz w:val="28"/>
-          <w:szCs w:val="28"/>
-        </w:rPr>
-        <w:t xml:space="preserve"> </w:t>
-      </w:r>
-      <w:r>
-        <w:rPr>
-          <w:rFonts w:ascii="Times New Roman" w:hAnsi="Times New Roman" w:cs="Times New Roman"/>
-          <w:sz w:val="28"/>
-          <w:szCs w:val="28"/>
-        </w:rPr>
-        <w:t>Где реально лежит производитель детали? В </w:t>
-      </w:r>
-      <w:proofErr w:type="spellStart"/>
-      <w:proofErr w:type="gramStart"/>
-      <w:r>
-        <w:rPr>
-          <w:rFonts w:ascii="Times New Roman" w:hAnsi="Times New Roman" w:cs="Times New Roman"/>
-          <w:sz w:val="28"/>
-          <w:szCs w:val="28"/>
-        </w:rPr>
-        <w:t>AdapterType</w:t>
-      </w:r>
-      <w:proofErr w:type="spellEnd"/>
-      <w:r>
-        <w:rPr>
-          <w:rFonts w:ascii="Times New Roman" w:hAnsi="Times New Roman" w:cs="Times New Roman"/>
-          <w:sz w:val="28"/>
-          <w:szCs w:val="28"/>
-        </w:rPr>
-        <w:t>.[</w:t>
-      </w:r>
-      <w:proofErr w:type="spellStart"/>
-      <w:proofErr w:type="gramEnd"/>
-      <w:r>
-        <w:rPr>
-          <w:rFonts w:ascii="Times New Roman" w:hAnsi="Times New Roman" w:cs="Times New Roman"/>
-          <w:sz w:val="28"/>
-          <w:szCs w:val="28"/>
-        </w:rPr>
-        <w:t>VendorID</w:t>
-      </w:r>
-      <w:proofErr w:type="spellEnd"/>
-      <w:r>
-        <w:rPr>
-          <w:rFonts w:ascii="Times New Roman" w:hAnsi="Times New Roman" w:cs="Times New Roman"/>
-          <w:sz w:val="28"/>
-          <w:szCs w:val="28"/>
-        </w:rPr>
-        <w:t>]? Бывает ли он NULL?</w:t>
-      </w:r>
-    </w:p>
-    <w:p>
-      <w:pPr>
-        <w:jc w:val="both"/>
-        <w:rPr>
-          <w:rFonts w:ascii="Times New Roman" w:hAnsi="Times New Roman" w:cs="Times New Roman"/>
-          <w:b/>
-          <w:bCs/>
-          <w:sz w:val="28"/>
-          <w:szCs w:val="28"/>
-        </w:rPr>
-      </w:pPr>
-      <w:r>
-        <w:rPr>
-          <w:rFonts w:ascii="Times New Roman" w:hAnsi="Times New Roman" w:cs="Times New Roman"/>
-          <w:b/>
-          <w:bCs/>
-          <w:sz w:val="28"/>
-          <w:szCs w:val="28"/>
-        </w:rPr>
-        <w:t>Блок 5: Статусы (</w:t>
-      </w:r>
-      <w:proofErr w:type="spellStart"/>
-      <w:r>
-        <w:rPr>
-          <w:rFonts w:ascii="Times New Roman" w:hAnsi="Times New Roman" w:cs="Times New Roman"/>
-          <w:b/>
-          <w:bCs/>
-          <w:sz w:val="28"/>
-          <w:szCs w:val="28"/>
-        </w:rPr>
-        <w:t>LifeCycleState</w:t>
-      </w:r>
-      <w:proofErr w:type="spellEnd"/>
-      <w:r>
-        <w:rPr>
-          <w:rFonts w:ascii="Times New Roman" w:hAnsi="Times New Roman" w:cs="Times New Roman"/>
-          <w:b/>
-          <w:bCs/>
-          <w:sz w:val="28"/>
-          <w:szCs w:val="28"/>
-        </w:rPr>
-        <w:t>)</w:t>
-      </w:r>
-      <w:r>
-        <w:rPr>
-          <w:rFonts w:ascii="Times New Roman" w:hAnsi="Times New Roman" w:cs="Times New Roman"/>
-          <w:b/>
-          <w:bCs/>
-          <w:sz w:val="28"/>
-          <w:szCs w:val="28"/>
-        </w:rPr>
-        <w:t>.</w:t>
-      </w:r>
-    </w:p>
-    <w:p>
-      <w:pPr>
-        <w:jc w:val="both"/>
-        <w:rPr>
-          <w:rFonts w:ascii="Times New Roman" w:hAnsi="Times New Roman" w:cs="Times New Roman"/>
-          <w:sz w:val="28"/>
-          <w:szCs w:val="28"/>
-        </w:rPr>
-      </w:pPr>
-      <w:r>
-        <w:rPr>
-          <w:rFonts w:ascii="Times New Roman" w:hAnsi="Times New Roman" w:cs="Times New Roman"/>
-          <w:sz w:val="28"/>
-          <w:szCs w:val="28"/>
-        </w:rPr>
-        <w:t>Н</w:t>
-      </w:r>
-      <w:r>
-        <w:rPr>
-          <w:rFonts w:ascii="Times New Roman" w:hAnsi="Times New Roman" w:cs="Times New Roman"/>
-          <w:sz w:val="28"/>
-          <w:szCs w:val="28"/>
-        </w:rPr>
-        <w:t>ужно узнать точные строковые названия статусов</w:t>
-      </w:r>
-      <w:r>
-        <w:rPr>
-          <w:rFonts w:ascii="Times New Roman" w:hAnsi="Times New Roman" w:cs="Times New Roman"/>
-          <w:sz w:val="28"/>
-          <w:szCs w:val="28"/>
-        </w:rPr>
-        <w:t>:</w:t>
-      </w:r>
-    </w:p>
-    <w:p>
-      <w:pPr>
-        <w:jc w:val="both"/>
-        <w:rPr>
-          <w:rFonts w:ascii="Times New Roman" w:hAnsi="Times New Roman" w:cs="Times New Roman"/>
-          <w:sz w:val="28"/>
-          <w:szCs w:val="28"/>
-          <w:lang w:val="en-US"/>
-        </w:rPr>
-      </w:pPr>
-      <w:r>
-        <w:rPr>
-          <w:rFonts w:ascii="Times New Roman" w:hAnsi="Times New Roman" w:cs="Times New Roman"/>
-          <w:sz w:val="28"/>
-          <w:szCs w:val="28"/>
-          <w:lang w:val="en-US"/>
-        </w:rPr>
-        <w:t xml:space="preserve">SELECT [ID], [Name] FROM </w:t>
-      </w:r>
-      <w:proofErr w:type="spellStart"/>
-      <w:proofErr w:type="gramStart"/>
-      <w:r>
-        <w:rPr>
-          <w:rFonts w:ascii="Times New Roman" w:hAnsi="Times New Roman" w:cs="Times New Roman"/>
-          <w:sz w:val="28"/>
-          <w:szCs w:val="28"/>
-          <w:lang w:val="en-US"/>
-        </w:rPr>
-        <w:t>dbo</w:t>
-      </w:r>
-      <w:proofErr w:type="spellEnd"/>
-      <w:r>
-        <w:rPr>
-          <w:rFonts w:ascii="Times New Roman" w:hAnsi="Times New Roman" w:cs="Times New Roman"/>
-          <w:sz w:val="28"/>
-          <w:szCs w:val="28"/>
-          <w:lang w:val="en-US"/>
-        </w:rPr>
-        <w:t>.[</w:t>
-      </w:r>
-      <w:proofErr w:type="spellStart"/>
-      <w:proofErr w:type="gramEnd"/>
       <w:r>
         <w:rPr>
           <w:rFonts w:ascii="Times New Roman" w:hAnsi="Times New Roman" w:cs="Times New Roman"/>
@@ -16016,7 +15675,6 @@
         </w:rPr>
       </w:pPr>
       <w:proofErr w:type="spellStart"/>
-      <w:proofErr w:type="gramStart"/>
       <w:r>
         <w:rPr>
           <w:rFonts w:ascii="Times New Roman" w:hAnsi="Times New Roman" w:cs="Times New Roman"/>
@@ -16036,18 +15694,7 @@
           <w:sz w:val="28"/>
           <w:szCs w:val="28"/>
         </w:rPr>
-        <w:t>.[</w:t>
-      </w:r>
-      <w:proofErr w:type="gramEnd"/>
-      <w:r>
-        <w:rPr>
-          <w:rFonts w:ascii="Times New Roman" w:hAnsi="Times New Roman" w:cs="Times New Roman"/>
-          <w:b/>
-          <w:bCs/>
-          <w:sz w:val="28"/>
-          <w:szCs w:val="28"/>
-        </w:rPr>
-        <w:t>Оконечное оборудование]</w:t>
+        <w:t>.[Оконечное оборудование]</w:t>
       </w:r>
       <w:r>
         <w:rPr>
@@ -16262,7 +15909,6 @@
         </w:rPr>
       </w:pPr>
       <w:proofErr w:type="spellStart"/>
-      <w:proofErr w:type="gramStart"/>
       <w:r>
         <w:rPr>
           <w:rFonts w:ascii="Times New Roman" w:hAnsi="Times New Roman" w:cs="Times New Roman"/>
@@ -16282,18 +15928,7 @@
           <w:sz w:val="28"/>
           <w:szCs w:val="28"/>
         </w:rPr>
-        <w:t>.[</w:t>
-      </w:r>
-      <w:proofErr w:type="gramEnd"/>
-      <w:r>
-        <w:rPr>
-          <w:rFonts w:ascii="Times New Roman" w:hAnsi="Times New Roman" w:cs="Times New Roman"/>
-          <w:b/>
-          <w:bCs/>
-          <w:sz w:val="28"/>
-          <w:szCs w:val="28"/>
-        </w:rPr>
-        <w:t>Asset]</w:t>
+        <w:t>.[Asset]</w:t>
       </w:r>
       <w:r>
         <w:rPr>
@@ -16593,7 +16228,6 @@
         </w:rPr>
       </w:pPr>
       <w:proofErr w:type="spellStart"/>
-      <w:proofErr w:type="gramStart"/>
       <w:r>
         <w:rPr>
           <w:rFonts w:ascii="Times New Roman" w:hAnsi="Times New Roman" w:cs="Times New Roman"/>
@@ -16616,7 +16250,6 @@
         <w:t>.[</w:t>
       </w:r>
       <w:proofErr w:type="spellStart"/>
-      <w:proofErr w:type="gramEnd"/>
       <w:r>
         <w:rPr>
           <w:rFonts w:ascii="Times New Roman" w:hAnsi="Times New Roman" w:cs="Times New Roman"/>
@@ -16727,7 +16360,6 @@
         </w:rPr>
       </w:pPr>
       <w:proofErr w:type="spellStart"/>
-      <w:proofErr w:type="gramStart"/>
       <w:r>
         <w:rPr>
           <w:rFonts w:ascii="Times New Roman" w:hAnsi="Times New Roman" w:cs="Times New Roman"/>
@@ -16747,18 +16379,7 @@
           <w:sz w:val="28"/>
           <w:szCs w:val="28"/>
         </w:rPr>
-        <w:t>.[</w:t>
-      </w:r>
-      <w:proofErr w:type="gramEnd"/>
-      <w:r>
-        <w:rPr>
-          <w:rFonts w:ascii="Times New Roman" w:hAnsi="Times New Roman" w:cs="Times New Roman"/>
-          <w:b/>
-          <w:bCs/>
-          <w:sz w:val="28"/>
-          <w:szCs w:val="28"/>
-        </w:rPr>
-        <w:t>Типы оконечного оборудования]</w:t>
+        <w:t>.[Типы оконечного оборудования]</w:t>
       </w:r>
       <w:r>
         <w:rPr>
@@ -16889,7 +16510,6 @@
         </w:rPr>
       </w:pPr>
       <w:proofErr w:type="spellStart"/>
-      <w:proofErr w:type="gramStart"/>
       <w:r>
         <w:rPr>
           <w:rFonts w:ascii="Times New Roman" w:hAnsi="Times New Roman" w:cs="Times New Roman"/>
@@ -16912,7 +16532,6 @@
         <w:t>.[</w:t>
       </w:r>
       <w:proofErr w:type="spellStart"/>
-      <w:proofErr w:type="gramEnd"/>
       <w:r>
         <w:rPr>
           <w:rFonts w:ascii="Times New Roman" w:hAnsi="Times New Roman" w:cs="Times New Roman"/>
@@ -17017,7 +16636,6 @@
         </w:rPr>
       </w:pPr>
       <w:proofErr w:type="spellStart"/>
-      <w:proofErr w:type="gramStart"/>
       <w:r>
         <w:rPr>
           <w:rFonts w:ascii="Times New Roman" w:hAnsi="Times New Roman" w:cs="Times New Roman"/>
@@ -17037,18 +16655,7 @@
           <w:sz w:val="28"/>
           <w:szCs w:val="28"/>
         </w:rPr>
-        <w:t>.[</w:t>
-      </w:r>
-      <w:proofErr w:type="gramEnd"/>
-      <w:r>
-        <w:rPr>
-          <w:rFonts w:ascii="Times New Roman" w:hAnsi="Times New Roman" w:cs="Times New Roman"/>
-          <w:b/>
-          <w:bCs/>
-          <w:sz w:val="28"/>
-          <w:szCs w:val="28"/>
-        </w:rPr>
-        <w:t>Производители]</w:t>
+        <w:t>.[Производители]</w:t>
       </w:r>
     </w:p>
     <w:p>
@@ -17131,7 +16738,6 @@
         </w:rPr>
       </w:pPr>
       <w:proofErr w:type="spellStart"/>
-      <w:proofErr w:type="gramStart"/>
       <w:r>
         <w:rPr>
           <w:rFonts w:ascii="Times New Roman" w:hAnsi="Times New Roman" w:cs="Times New Roman"/>
@@ -17151,18 +16757,7 @@
           <w:sz w:val="28"/>
           <w:szCs w:val="28"/>
         </w:rPr>
-        <w:t>.[</w:t>
-      </w:r>
-      <w:proofErr w:type="gramEnd"/>
-      <w:r>
-        <w:rPr>
-          <w:rFonts w:ascii="Times New Roman" w:hAnsi="Times New Roman" w:cs="Times New Roman"/>
-          <w:b/>
-          <w:bCs/>
-          <w:sz w:val="28"/>
-          <w:szCs w:val="28"/>
-        </w:rPr>
-        <w:t>Пользователи]</w:t>
+        <w:t>.[Пользователи]</w:t>
       </w:r>
     </w:p>
     <w:p>
@@ -17319,7 +16914,6 @@
         </w:rPr>
       </w:pPr>
       <w:proofErr w:type="spellStart"/>
-      <w:proofErr w:type="gramStart"/>
       <w:r>
         <w:rPr>
           <w:rFonts w:ascii="Times New Roman" w:hAnsi="Times New Roman" w:cs="Times New Roman"/>
@@ -17339,18 +16933,7 @@
           <w:sz w:val="28"/>
           <w:szCs w:val="28"/>
         </w:rPr>
-        <w:t>.[</w:t>
-      </w:r>
-      <w:proofErr w:type="gramEnd"/>
-      <w:r>
-        <w:rPr>
-          <w:rFonts w:ascii="Times New Roman" w:hAnsi="Times New Roman" w:cs="Times New Roman"/>
-          <w:b/>
-          <w:bCs/>
-          <w:sz w:val="28"/>
-          <w:szCs w:val="28"/>
-        </w:rPr>
-        <w:t>Подразделение]</w:t>
+        <w:t>.[Подразделение]</w:t>
       </w:r>
     </w:p>
     <w:p>
@@ -17411,7 +16994,6 @@
         </w:rPr>
       </w:pPr>
       <w:proofErr w:type="spellStart"/>
-      <w:proofErr w:type="gramStart"/>
       <w:r>
         <w:rPr>
           <w:rFonts w:ascii="Times New Roman" w:hAnsi="Times New Roman" w:cs="Times New Roman"/>
@@ -17431,18 +17013,7 @@
           <w:sz w:val="28"/>
           <w:szCs w:val="28"/>
         </w:rPr>
-        <w:t>.[</w:t>
-      </w:r>
-      <w:proofErr w:type="gramEnd"/>
-      <w:r>
-        <w:rPr>
-          <w:rFonts w:ascii="Times New Roman" w:hAnsi="Times New Roman" w:cs="Times New Roman"/>
-          <w:b/>
-          <w:bCs/>
-          <w:sz w:val="28"/>
-          <w:szCs w:val="28"/>
-        </w:rPr>
-        <w:t>Рабочее место]</w:t>
+        <w:t>.[Рабочее место]</w:t>
       </w:r>
     </w:p>
     <w:p>
@@ -17526,7 +17097,6 @@
         </w:rPr>
       </w:pPr>
       <w:proofErr w:type="spellStart"/>
-      <w:proofErr w:type="gramStart"/>
       <w:r>
         <w:rPr>
           <w:rFonts w:ascii="Times New Roman" w:hAnsi="Times New Roman" w:cs="Times New Roman"/>
@@ -17546,18 +17116,7 @@
           <w:sz w:val="28"/>
           <w:szCs w:val="28"/>
         </w:rPr>
-        <w:t>.[</w:t>
-      </w:r>
-      <w:proofErr w:type="gramEnd"/>
-      <w:r>
-        <w:rPr>
-          <w:rFonts w:ascii="Times New Roman" w:hAnsi="Times New Roman" w:cs="Times New Roman"/>
-          <w:b/>
-          <w:bCs/>
-          <w:sz w:val="28"/>
-          <w:szCs w:val="28"/>
-        </w:rPr>
-        <w:t>Комната]</w:t>
+        <w:t>.[Комната]</w:t>
       </w:r>
     </w:p>
     <w:p>
@@ -17640,7 +17199,6 @@
         </w:rPr>
       </w:pPr>
       <w:proofErr w:type="spellStart"/>
-      <w:proofErr w:type="gramStart"/>
       <w:r>
         <w:rPr>
           <w:rFonts w:ascii="Times New Roman" w:hAnsi="Times New Roman" w:cs="Times New Roman"/>
@@ -17660,18 +17218,7 @@
           <w:sz w:val="28"/>
           <w:szCs w:val="28"/>
         </w:rPr>
-        <w:t>.[</w:t>
-      </w:r>
-      <w:proofErr w:type="gramEnd"/>
-      <w:r>
-        <w:rPr>
-          <w:rFonts w:ascii="Times New Roman" w:hAnsi="Times New Roman" w:cs="Times New Roman"/>
-          <w:b/>
-          <w:bCs/>
-          <w:sz w:val="28"/>
-          <w:szCs w:val="28"/>
-        </w:rPr>
-        <w:t>Этаж]</w:t>
+        <w:t>.[Этаж]</w:t>
       </w:r>
     </w:p>
     <w:p>
@@ -17754,7 +17301,6 @@
         </w:rPr>
       </w:pPr>
       <w:proofErr w:type="spellStart"/>
-      <w:proofErr w:type="gramStart"/>
       <w:r>
         <w:rPr>
           <w:rFonts w:ascii="Times New Roman" w:hAnsi="Times New Roman" w:cs="Times New Roman"/>
@@ -17774,18 +17320,7 @@
           <w:sz w:val="28"/>
           <w:szCs w:val="28"/>
         </w:rPr>
-        <w:t>.[</w:t>
-      </w:r>
-      <w:proofErr w:type="gramEnd"/>
-      <w:r>
-        <w:rPr>
-          <w:rFonts w:ascii="Times New Roman" w:hAnsi="Times New Roman" w:cs="Times New Roman"/>
-          <w:b/>
-          <w:bCs/>
-          <w:sz w:val="28"/>
-          <w:szCs w:val="28"/>
-        </w:rPr>
-        <w:t>Здание]</w:t>
+        <w:t>.[Здание]</w:t>
       </w:r>
     </w:p>
     <w:p>
@@ -17868,7 +17403,6 @@
         </w:rPr>
       </w:pPr>
       <w:proofErr w:type="spellStart"/>
-      <w:proofErr w:type="gramStart"/>
       <w:r>
         <w:rPr>
           <w:rFonts w:ascii="Times New Roman" w:hAnsi="Times New Roman" w:cs="Times New Roman"/>
@@ -17891,7 +17425,6 @@
         <w:t>.[</w:t>
       </w:r>
       <w:proofErr w:type="spellStart"/>
-      <w:proofErr w:type="gramEnd"/>
       <w:r>
         <w:rPr>
           <w:rFonts w:ascii="Times New Roman" w:hAnsi="Times New Roman" w:cs="Times New Roman"/>
@@ -18134,7 +17667,6 @@
         </w:rPr>
       </w:pPr>
       <w:proofErr w:type="spellStart"/>
-      <w:proofErr w:type="gramStart"/>
       <w:r>
         <w:rPr>
           <w:rFonts w:ascii="Times New Roman" w:hAnsi="Times New Roman" w:cs="Times New Roman"/>
@@ -18157,7 +17689,6 @@
         <w:t>.[</w:t>
       </w:r>
       <w:proofErr w:type="spellStart"/>
-      <w:proofErr w:type="gramEnd"/>
       <w:r>
         <w:rPr>
           <w:rFonts w:ascii="Times New Roman" w:hAnsi="Times New Roman" w:cs="Times New Roman"/>
@@ -18662,25 +18193,7 @@
           <w:sz w:val="28"/>
           <w:szCs w:val="28"/>
         </w:rPr>
-        <w:t xml:space="preserve"> -S IP_</w:t>
-      </w:r>
-      <w:proofErr w:type="gramStart"/>
-      <w:r>
-        <w:rPr>
-          <w:rFonts w:ascii="Times New Roman" w:hAnsi="Times New Roman" w:cs="Times New Roman"/>
-          <w:sz w:val="28"/>
-          <w:szCs w:val="28"/>
-        </w:rPr>
-        <w:t>АДРЕС,ПОРТ</w:t>
-      </w:r>
-      <w:proofErr w:type="gramEnd"/>
-      <w:r>
-        <w:rPr>
-          <w:rFonts w:ascii="Times New Roman" w:hAnsi="Times New Roman" w:cs="Times New Roman"/>
-          <w:sz w:val="28"/>
-          <w:szCs w:val="28"/>
-        </w:rPr>
-        <w:t xml:space="preserve"> -U ЛОГИН -P ПАРОЛЬ -d </w:t>
+        <w:t xml:space="preserve"> -S IP_АДРЕС,ПОРТ -U ЛОГИН -P ПАРОЛЬ -d </w:t>
       </w:r>
       <w:proofErr w:type="spellStart"/>
       <w:r>
@@ -18830,16 +18343,7 @@
           <w:sz w:val="28"/>
           <w:szCs w:val="28"/>
         </w:rPr>
-        <w:t>SECONDARY_DB_URL=</w:t>
-      </w:r>
-      <w:proofErr w:type="gramStart"/>
-      <w:r>
-        <w:rPr>
-          <w:rFonts w:ascii="Times New Roman" w:hAnsi="Times New Roman" w:cs="Times New Roman"/>
-          <w:sz w:val="28"/>
-          <w:szCs w:val="28"/>
-        </w:rPr>
-        <w:t>jdbc:sqlserver://</w:t>
+        <w:t>SECONDARY_DB_URL=jdbc:sqlserver://</w:t>
       </w:r>
       <w:r>
         <w:rPr>
@@ -18855,16 +18359,7 @@
           <w:sz w:val="28"/>
           <w:szCs w:val="28"/>
         </w:rPr>
-        <w:t>:ПОРТ;databaseName=InfraManager;trustServerCertificate=true</w:t>
-      </w:r>
-      <w:proofErr w:type="gramEnd"/>
-      <w:r>
-        <w:rPr>
-          <w:rFonts w:ascii="Times New Roman" w:hAnsi="Times New Roman" w:cs="Times New Roman"/>
-          <w:sz w:val="28"/>
-          <w:szCs w:val="28"/>
-        </w:rPr>
-        <w:t>;</w:t>
+        <w:t>:ПОРТ;databaseName=InfraManager;trustServerCertificate=true;</w:t>
       </w:r>
     </w:p>
     <w:p>
@@ -18900,16 +18395,7 @@
           <w:sz w:val="28"/>
           <w:szCs w:val="28"/>
         </w:rPr>
-        <w:t>SECONDARY_DB_URL=</w:t>
-      </w:r>
-      <w:proofErr w:type="gramStart"/>
-      <w:r>
-        <w:rPr>
-          <w:rFonts w:ascii="Times New Roman" w:hAnsi="Times New Roman" w:cs="Times New Roman"/>
-          <w:sz w:val="28"/>
-          <w:szCs w:val="28"/>
-        </w:rPr>
-        <w:t>jdbc:sqlserver://</w:t>
+        <w:t>SECONDARY_DB_URL=jdbc:sqlserver://</w:t>
       </w:r>
       <w:r>
         <w:rPr>
@@ -18941,16 +18427,7 @@
           <w:sz w:val="28"/>
           <w:szCs w:val="28"/>
         </w:rPr>
-        <w:t>;databaseName=InfraManager;trustServerCertificate=true</w:t>
-      </w:r>
-      <w:proofErr w:type="gramEnd"/>
-      <w:r>
-        <w:rPr>
-          <w:rFonts w:ascii="Times New Roman" w:hAnsi="Times New Roman" w:cs="Times New Roman"/>
-          <w:sz w:val="28"/>
-          <w:szCs w:val="28"/>
-        </w:rPr>
-        <w:t>;</w:t>
+        <w:t>;databaseName=InfraManager;trustServerCertificate=true;</w:t>
       </w:r>
     </w:p>
     <w:p>
@@ -19420,25 +18897,7 @@
           <w:sz w:val="28"/>
           <w:szCs w:val="28"/>
         </w:rPr>
-        <w:t xml:space="preserve"> файлы эталонных комплектующих в </w:t>
-      </w:r>
-      <w:proofErr w:type="gramStart"/>
-      <w:r>
-        <w:rPr>
-          <w:rFonts w:ascii="Times New Roman" w:hAnsi="Times New Roman" w:cs="Times New Roman"/>
-          <w:sz w:val="28"/>
-          <w:szCs w:val="28"/>
-        </w:rPr>
-        <w:t>папку .</w:t>
-      </w:r>
-      <w:proofErr w:type="gramEnd"/>
-      <w:r>
-        <w:rPr>
-          <w:rFonts w:ascii="Times New Roman" w:hAnsi="Times New Roman" w:cs="Times New Roman"/>
-          <w:sz w:val="28"/>
-          <w:szCs w:val="28"/>
-        </w:rPr>
-        <w:t>/</w:t>
+        <w:t xml:space="preserve"> файлы эталонных комплектующих в папку ./</w:t>
       </w:r>
       <w:proofErr w:type="spellStart"/>
       <w:r>
@@ -20283,37 +19742,17 @@
           <w:sz w:val="28"/>
           <w:szCs w:val="28"/>
         </w:rPr>
-        <w:t>ороткий ответ</w:t>
-      </w:r>
-      <w:proofErr w:type="gramStart"/>
-      <w:r>
-        <w:rPr>
-          <w:rFonts w:ascii="Times New Roman" w:hAnsi="Times New Roman" w:cs="Times New Roman"/>
-          <w:sz w:val="28"/>
-          <w:szCs w:val="28"/>
-        </w:rPr>
-        <w:t>: </w:t>
-      </w:r>
-      <w:r>
-        <w:rPr>
-          <w:rFonts w:ascii="Times New Roman" w:hAnsi="Times New Roman" w:cs="Times New Roman"/>
-          <w:b/>
-          <w:bCs/>
-          <w:sz w:val="28"/>
-          <w:szCs w:val="28"/>
-        </w:rPr>
-        <w:t>Нет</w:t>
-      </w:r>
-      <w:proofErr w:type="gramEnd"/>
-      <w:r>
-        <w:rPr>
-          <w:rFonts w:ascii="Times New Roman" w:hAnsi="Times New Roman" w:cs="Times New Roman"/>
-          <w:b/>
-          <w:bCs/>
-          <w:sz w:val="28"/>
-          <w:szCs w:val="28"/>
-        </w:rPr>
-        <w:t>, чисто теоретически и практически эти библиотеки вам никак не помогут.</w:t>
+        <w:t>ороткий ответ: </w:t>
+      </w:r>
+      <w:r>
+        <w:rPr>
+          <w:rFonts w:ascii="Times New Roman" w:hAnsi="Times New Roman" w:cs="Times New Roman"/>
+          <w:b/>
+          <w:bCs/>
+          <w:sz w:val="28"/>
+          <w:szCs w:val="28"/>
+        </w:rPr>
+        <w:t>Нет, чисто теоретически и практически эти библиотеки вам никак не помогут.</w:t>
       </w:r>
     </w:p>
     <w:p>
@@ -20476,7 +19915,7 @@
           <w:szCs w:val="28"/>
         </w:rPr>
         <w:pict w14:anchorId="00AE3DDA">
-          <v:rect id="_x0000_i1031" style="width:730.6pt;height:1.5pt" o:hrpct="0" o:hralign="center" o:hrstd="t" o:hr="t" fillcolor="#a0a0a0" stroked="f"/>
+          <v:rect id="_x0000_i1025" style="width:730.6pt;height:1.5pt" o:hrpct="0" o:hralign="center" o:hrstd="t" o:hr="t" fillcolor="#a0a0a0" stroked="f"/>
         </w:pict>
       </w:r>
     </w:p>
@@ -20825,43 +20264,7 @@
           <w:sz w:val="28"/>
           <w:szCs w:val="28"/>
         </w:rPr>
-        <w:t xml:space="preserve"> В </w:t>
-      </w:r>
-      <w:proofErr w:type="gramStart"/>
-      <w:r>
-        <w:rPr>
-          <w:rFonts w:ascii="Times New Roman" w:hAnsi="Times New Roman" w:cs="Times New Roman"/>
-          <w:sz w:val="28"/>
-          <w:szCs w:val="28"/>
-        </w:rPr>
-        <w:t>вашем .env</w:t>
-      </w:r>
-      <w:proofErr w:type="gramEnd"/>
-      <w:r>
-        <w:rPr>
-          <w:rFonts w:ascii="Times New Roman" w:hAnsi="Times New Roman" w:cs="Times New Roman"/>
-          <w:sz w:val="28"/>
-          <w:szCs w:val="28"/>
-        </w:rPr>
-        <w:t> написано: </w:t>
-      </w:r>
-      <w:proofErr w:type="gramStart"/>
-      <w:r>
-        <w:rPr>
-          <w:rFonts w:ascii="Times New Roman" w:hAnsi="Times New Roman" w:cs="Times New Roman"/>
-          <w:sz w:val="28"/>
-          <w:szCs w:val="28"/>
-        </w:rPr>
-        <w:t>jdbc:sqlserver://host-name:1433;databaseName</w:t>
-      </w:r>
-      <w:proofErr w:type="gramEnd"/>
-      <w:r>
-        <w:rPr>
-          <w:rFonts w:ascii="Times New Roman" w:hAnsi="Times New Roman" w:cs="Times New Roman"/>
-          <w:sz w:val="28"/>
-          <w:szCs w:val="28"/>
-        </w:rPr>
-        <w:t>=.... Если вы вставляете туда </w:t>
+        <w:t> В вашем .env написано: jdbc:sqlserver://host-name:1433;databaseName=.... Если вы вставляете туда </w:t>
       </w:r>
       <w:proofErr w:type="spellStart"/>
       <w:r>
@@ -20923,27 +20326,7 @@
           <w:sz w:val="28"/>
           <w:szCs w:val="28"/>
         </w:rPr>
-        <w:t>Способ 1</w:t>
-      </w:r>
-      <w:r>
-        <w:rPr>
-          <w:rFonts w:ascii="Times New Roman" w:hAnsi="Times New Roman" w:cs="Times New Roman"/>
-          <w:b/>
-          <w:bCs/>
-          <w:sz w:val="28"/>
-          <w:szCs w:val="28"/>
-        </w:rPr>
-        <w:t>: узнать</w:t>
-      </w:r>
-      <w:r>
-        <w:rPr>
-          <w:rFonts w:ascii="Times New Roman" w:hAnsi="Times New Roman" w:cs="Times New Roman"/>
-          <w:b/>
-          <w:bCs/>
-          <w:sz w:val="28"/>
-          <w:szCs w:val="28"/>
-        </w:rPr>
-        <w:t xml:space="preserve"> прямой порт самостоятельно</w:t>
+        <w:t>Способ 1: узнать прямой порт самостоятельно</w:t>
       </w:r>
       <w:r>
         <w:rPr>
@@ -21240,16 +20623,7 @@
           <w:sz w:val="28"/>
           <w:szCs w:val="28"/>
         </w:rPr>
-        <w:t xml:space="preserve">Теперь </w:t>
-      </w:r>
-      <w:proofErr w:type="gramStart"/>
-      <w:r>
-        <w:rPr>
-          <w:rFonts w:ascii="Times New Roman" w:hAnsi="Times New Roman" w:cs="Times New Roman"/>
-          <w:sz w:val="28"/>
-          <w:szCs w:val="28"/>
-        </w:rPr>
-        <w:t>в .</w:t>
+        <w:t>Теперь в .</w:t>
       </w:r>
       <w:proofErr w:type="spellStart"/>
       <w:r>
@@ -21261,7 +20635,6 @@
         <w:t>env</w:t>
       </w:r>
       <w:proofErr w:type="spellEnd"/>
-      <w:proofErr w:type="gramEnd"/>
       <w:r>
         <w:rPr>
           <w:rFonts w:ascii="Times New Roman" w:hAnsi="Times New Roman" w:cs="Times New Roman"/>
@@ -21322,25 +20695,7 @@
           <w:sz w:val="28"/>
           <w:szCs w:val="28"/>
         </w:rPr>
-        <w:t>INFRA_MANAGER_DB_URL=</w:t>
-      </w:r>
-      <w:proofErr w:type="gramStart"/>
-      <w:r>
-        <w:rPr>
-          <w:rFonts w:ascii="Times New Roman" w:hAnsi="Times New Roman" w:cs="Times New Roman"/>
-          <w:sz w:val="28"/>
-          <w:szCs w:val="28"/>
-        </w:rPr>
-        <w:t>jdbc:sqlserver://ХОСТ:49231;databaseName=InfraManager;trustServerCertificate=true</w:t>
-      </w:r>
-      <w:proofErr w:type="gramEnd"/>
-      <w:r>
-        <w:rPr>
-          <w:rFonts w:ascii="Times New Roman" w:hAnsi="Times New Roman" w:cs="Times New Roman"/>
-          <w:sz w:val="28"/>
-          <w:szCs w:val="28"/>
-        </w:rPr>
-        <w:t>;</w:t>
+        <w:t>INFRA_MANAGER_DB_URL=jdbc:sqlserver://ХОСТ:49231;databaseName=InfraManager;trustServerCertificate=true;</w:t>
       </w:r>
     </w:p>
     <w:p>
@@ -21382,29 +20737,7 @@
           <w:sz w:val="28"/>
           <w:szCs w:val="28"/>
         </w:rPr>
-        <w:t>Способ 2</w:t>
-      </w:r>
-      <w:proofErr w:type="gramStart"/>
-      <w:r>
-        <w:rPr>
-          <w:rFonts w:ascii="Times New Roman" w:hAnsi="Times New Roman" w:cs="Times New Roman"/>
-          <w:b/>
-          <w:bCs/>
-          <w:sz w:val="28"/>
-          <w:szCs w:val="28"/>
-        </w:rPr>
-        <w:t>: Проверить</w:t>
-      </w:r>
-      <w:proofErr w:type="gramEnd"/>
-      <w:r>
-        <w:rPr>
-          <w:rFonts w:ascii="Times New Roman" w:hAnsi="Times New Roman" w:cs="Times New Roman"/>
-          <w:b/>
-          <w:bCs/>
-          <w:sz w:val="28"/>
-          <w:szCs w:val="28"/>
-        </w:rPr>
-        <w:t xml:space="preserve"> правильность строки с </w:t>
+        <w:t xml:space="preserve">Способ 2: Проверить правильность строки с </w:t>
       </w:r>
       <w:proofErr w:type="spellStart"/>
       <w:r>
@@ -21470,25 +20803,7 @@
           <w:sz w:val="28"/>
           <w:szCs w:val="28"/>
         </w:rPr>
-        <w:t>INFRA_MANAGER_DB_URL=</w:t>
-      </w:r>
-      <w:proofErr w:type="gramStart"/>
-      <w:r>
-        <w:rPr>
-          <w:rFonts w:ascii="Times New Roman" w:hAnsi="Times New Roman" w:cs="Times New Roman"/>
-          <w:sz w:val="28"/>
-          <w:szCs w:val="28"/>
-        </w:rPr>
-        <w:t>jdbc:sqlserver://ХОСТ;instanceName=ЭКЗЕМПЛЯР;databaseName=InfraManager;trustServerCertificate=true</w:t>
-      </w:r>
-      <w:proofErr w:type="gramEnd"/>
-      <w:r>
-        <w:rPr>
-          <w:rFonts w:ascii="Times New Roman" w:hAnsi="Times New Roman" w:cs="Times New Roman"/>
-          <w:sz w:val="28"/>
-          <w:szCs w:val="28"/>
-        </w:rPr>
-        <w:t>;</w:t>
+        <w:t>INFRA_MANAGER_DB_URL=jdbc:sqlserver://ХОСТ;instanceName=ЭКЗЕМПЛЯР;databaseName=InfraManager;trustServerCertificate=true;</w:t>
       </w:r>
     </w:p>
     <w:p>
@@ -21812,19 +21127,9 @@
           <w:sz w:val="28"/>
           <w:szCs w:val="28"/>
         </w:rPr>
-        <w:t>donor-</w:t>
-      </w:r>
-      <w:proofErr w:type="gramStart"/>
-      <w:r>
-        <w:rPr>
-          <w:rFonts w:ascii="Times New Roman" w:hAnsi="Times New Roman" w:cs="Times New Roman"/>
-          <w:sz w:val="28"/>
-          <w:szCs w:val="28"/>
-        </w:rPr>
-        <w:t>backend:latest</w:t>
-      </w:r>
-      <w:proofErr w:type="spellEnd"/>
-      <w:proofErr w:type="gramEnd"/>
+        <w:t>donor-backend:latest</w:t>
+      </w:r>
+      <w:proofErr w:type="spellEnd"/>
     </w:p>
     <w:p>
       <w:pPr>
@@ -21996,6 +21301,207 @@
           <w:szCs w:val="28"/>
         </w:rPr>
         <w:t xml:space="preserve"> маршрутизирует UDP-пакеты.</w:t>
+      </w:r>
+    </w:p>
+    <w:p>
+      <w:pPr>
+        <w:rPr>
+          <w:rFonts w:ascii="Times New Roman" w:hAnsi="Times New Roman" w:cs="Times New Roman"/>
+          <w:sz w:val="28"/>
+          <w:szCs w:val="28"/>
+        </w:rPr>
+      </w:pPr>
+      <w:r>
+        <w:rPr>
+          <w:rFonts w:ascii="Times New Roman" w:hAnsi="Times New Roman" w:cs="Times New Roman"/>
+          <w:sz w:val="28"/>
+          <w:szCs w:val="28"/>
+        </w:rPr>
+        <w:br w:type="page"/>
+      </w:r>
+    </w:p>
+    <w:p>
+      <w:pPr>
+        <w:jc w:val="center"/>
+        <w:rPr>
+          <w:rFonts w:ascii="Times New Roman" w:hAnsi="Times New Roman" w:cs="Times New Roman"/>
+          <w:b/>
+          <w:bCs/>
+          <w:sz w:val="28"/>
+          <w:szCs w:val="28"/>
+        </w:rPr>
+      </w:pPr>
+      <w:r>
+        <w:rPr>
+          <w:rFonts w:ascii="Times New Roman" w:hAnsi="Times New Roman" w:cs="Times New Roman"/>
+          <w:b/>
+          <w:bCs/>
+          <w:sz w:val="28"/>
+          <w:szCs w:val="28"/>
+        </w:rPr>
+        <w:lastRenderedPageBreak/>
+        <w:t>Решение проблемы с подключением</w:t>
+      </w:r>
+      <w:r>
+        <w:rPr>
+          <w:rFonts w:ascii="Times New Roman" w:hAnsi="Times New Roman" w:cs="Times New Roman"/>
+          <w:b/>
+          <w:bCs/>
+          <w:sz w:val="28"/>
+          <w:szCs w:val="28"/>
+        </w:rPr>
+        <w:t xml:space="preserve"> </w:t>
+      </w:r>
+      <w:r>
+        <w:rPr>
+          <w:rFonts w:ascii="Times New Roman" w:hAnsi="Times New Roman" w:cs="Times New Roman"/>
+          <w:b/>
+          <w:bCs/>
+          <w:sz w:val="28"/>
+          <w:szCs w:val="28"/>
+        </w:rPr>
+        <w:t>3</w:t>
+      </w:r>
+    </w:p>
+    <w:p>
+      <w:pPr>
+        <w:jc w:val="both"/>
+        <w:rPr>
+          <w:rFonts w:ascii="Times New Roman" w:hAnsi="Times New Roman" w:cs="Times New Roman"/>
+          <w:sz w:val="28"/>
+          <w:szCs w:val="28"/>
+          <w:lang w:val="en-US"/>
+        </w:rPr>
+      </w:pPr>
+      <w:r>
+        <w:rPr>
+          <w:rFonts w:ascii="Times New Roman" w:hAnsi="Times New Roman" w:cs="Times New Roman"/>
+          <w:sz w:val="28"/>
+          <w:szCs w:val="28"/>
+          <w:lang w:val="en-US"/>
+        </w:rPr>
+        <w:t>Thanks for reaching out to the Microsoft Q &amp; A Forum.</w:t>
+      </w:r>
+    </w:p>
+    <w:p>
+      <w:pPr>
+        <w:jc w:val="both"/>
+        <w:rPr>
+          <w:rFonts w:ascii="Times New Roman" w:hAnsi="Times New Roman" w:cs="Times New Roman"/>
+          <w:sz w:val="28"/>
+          <w:szCs w:val="28"/>
+          <w:lang w:val="en-US"/>
+        </w:rPr>
+      </w:pPr>
+      <w:r>
+        <w:rPr>
+          <w:rFonts w:ascii="Times New Roman" w:hAnsi="Times New Roman" w:cs="Times New Roman"/>
+          <w:sz w:val="28"/>
+          <w:szCs w:val="28"/>
+          <w:lang w:val="en-US"/>
+        </w:rPr>
+        <w:t>The error occurs due to a TLS protocol mismatch between the SQL Server and the client application. This typically happens when the SQL Server instance is running on an older version, such as SQL Server 2008, 2012, or 2014, which only supports TLS 1.0/1.1. Meanwhile, the client application uses a modern Java runtime (Java 11 or later) and a newer Microsoft JDBC driver (version 9.x or higher), which require TLS 1.2 or newer and block deprecated TLS protocols. As a result, the SSL/TLS handshake fails before encryption is established, and the JDBC driver throws the generic “Unexpected rethrowing” exception.</w:t>
+      </w:r>
+    </w:p>
+    <w:p>
+      <w:pPr>
+        <w:jc w:val="both"/>
+        <w:rPr>
+          <w:rFonts w:ascii="Times New Roman" w:hAnsi="Times New Roman" w:cs="Times New Roman"/>
+          <w:sz w:val="28"/>
+          <w:szCs w:val="28"/>
+        </w:rPr>
+      </w:pPr>
+      <w:r>
+        <w:rPr>
+          <w:rFonts w:ascii="Times New Roman" w:hAnsi="Times New Roman" w:cs="Times New Roman"/>
+          <w:sz w:val="28"/>
+          <w:szCs w:val="28"/>
+          <w:lang w:val="en-US"/>
+        </w:rPr>
+        <w:t xml:space="preserve">To resolve this upgrade the SQL Server to enable TLS 1.2 support and ensure that TLS 1.2 is enabled in the Windows Schannel registry. This approach aligns with current security standards and ensures compatibility with modern encryption protocols. Once TLS 1.2 is fully enabled on the SQL Server host and its operating system, the connection will succeed seamlessly with the existing modern JDBC driver and Java runtime.  </w:t>
+      </w:r>
+    </w:p>
+    <w:p>
+      <w:pPr>
+        <w:jc w:val="both"/>
+        <w:rPr>
+          <w:rFonts w:ascii="Times New Roman" w:hAnsi="Times New Roman" w:cs="Times New Roman"/>
+          <w:sz w:val="28"/>
+          <w:szCs w:val="28"/>
+        </w:rPr>
+      </w:pPr>
+    </w:p>
+    <w:p>
+      <w:pPr>
+        <w:jc w:val="both"/>
+        <w:rPr>
+          <w:rFonts w:ascii="Times New Roman" w:hAnsi="Times New Roman" w:cs="Times New Roman"/>
+          <w:sz w:val="28"/>
+          <w:szCs w:val="28"/>
+        </w:rPr>
+      </w:pPr>
+      <w:r>
+        <w:rPr>
+          <w:rFonts w:ascii="Times New Roman" w:hAnsi="Times New Roman" w:cs="Times New Roman"/>
+          <w:sz w:val="28"/>
+          <w:szCs w:val="28"/>
+        </w:rPr>
+        <w:t>Шаг 2. Проверь строку подключения</w:t>
+      </w:r>
+    </w:p>
+    <w:p>
+      <w:pPr>
+        <w:jc w:val="both"/>
+        <w:rPr>
+          <w:rFonts w:ascii="Times New Roman" w:hAnsi="Times New Roman" w:cs="Times New Roman"/>
+          <w:sz w:val="28"/>
+          <w:szCs w:val="28"/>
+        </w:rPr>
+      </w:pPr>
+      <w:r>
+        <w:rPr>
+          <w:rFonts w:ascii="Times New Roman" w:hAnsi="Times New Roman" w:cs="Times New Roman"/>
+          <w:sz w:val="28"/>
+          <w:szCs w:val="28"/>
+        </w:rPr>
+        <w:t>Оставь параметры отключения шифрования, чтобы они применялись для передачи самих данных (после успешного логина). Твой URL в .</w:t>
+      </w:r>
+      <w:proofErr w:type="spellStart"/>
+      <w:r>
+        <w:rPr>
+          <w:rFonts w:ascii="Times New Roman" w:hAnsi="Times New Roman" w:cs="Times New Roman"/>
+          <w:sz w:val="28"/>
+          <w:szCs w:val="28"/>
+        </w:rPr>
+        <w:t>env</w:t>
+      </w:r>
+      <w:proofErr w:type="spellEnd"/>
+      <w:r>
+        <w:rPr>
+          <w:rFonts w:ascii="Times New Roman" w:hAnsi="Times New Roman" w:cs="Times New Roman"/>
+          <w:sz w:val="28"/>
+          <w:szCs w:val="28"/>
+        </w:rPr>
+        <w:t xml:space="preserve"> должен выглядеть так:</w:t>
+      </w:r>
+    </w:p>
+    <w:p>
+      <w:pPr>
+        <w:jc w:val="both"/>
+        <w:rPr>
+          <w:rFonts w:ascii="Times New Roman" w:hAnsi="Times New Roman" w:cs="Times New Roman"/>
+          <w:sz w:val="28"/>
+          <w:szCs w:val="28"/>
+        </w:rPr>
+      </w:pPr>
+      <w:r>
+        <w:rPr>
+          <w:rFonts w:ascii="Times New Roman" w:hAnsi="Times New Roman" w:cs="Times New Roman"/>
+          <w:sz w:val="28"/>
+          <w:szCs w:val="28"/>
+        </w:rPr>
+        <w:t>INFRA_MANAGER_DB_URL=jdbc:sqlserver://IP_АДРЕС:ПОРТ;databaseName=InfraManager;encrypt=false;trustServerCertificate=true;</w:t>
       </w:r>
     </w:p>
     <w:sectPr>
@@ -25085,7 +24591,7 @@
   <w:style w:type="paragraph" w:default="1" w:styleId="a">
     <w:name w:val="Normal"/>
     <w:qFormat/>
-    <w:rsid w:val="005770C5"/>
+    <w:rsid w:val="004573A8"/>
   </w:style>
   <w:style w:type="paragraph" w:styleId="1">
     <w:name w:val="heading 1"/>
@@ -25289,6 +24795,7 @@
   <w:style w:type="character" w:default="1" w:styleId="a0">
     <w:name w:val="Default Paragraph Font"/>
     <w:uiPriority w:val="1"/>
+    <w:semiHidden/>
     <w:unhideWhenUsed/>
   </w:style>
   <w:style w:type="table" w:default="1" w:styleId="a1">

</xml_diff>